<commit_message>
step 26 : start Banach animation
</commit_message>
<xml_diff>
--- a/notes/video-overview-notes.docx
+++ b/notes/video-overview-notes.docx
@@ -5112,37 +5112,425 @@
       <w:pPr>
         <w:bidi/>
         <w:rPr>
+          <w:sz w:val="18"/>
+          <w:szCs w:val="18"/>
+          <w:rtl/>
+          <w:lang w:bidi="fa-IR"/>
+        </w:rPr>
+      </w:pPr>
+    </w:p>
+    <w:p>
+      <w:pPr>
+        <w:rPr>
+          <w:sz w:val="18"/>
+          <w:szCs w:val="18"/>
+          <w:lang w:bidi="fa-IR"/>
+        </w:rPr>
+      </w:pPr>
+      <w:r>
+        <w:rPr>
+          <w:sz w:val="18"/>
+          <w:szCs w:val="18"/>
+          <w:lang w:bidi="fa-IR"/>
+        </w:rPr>
+        <w:t>In fact, (</w:t>
+      </w:r>
+      <w:proofErr w:type="spellStart"/>
+      <w:r>
+        <w:rPr>
+          <w:sz w:val="18"/>
+          <w:szCs w:val="18"/>
+          <w:lang w:bidi="fa-IR"/>
+        </w:rPr>
+        <w:t>Nl</w:t>
+      </w:r>
+      <w:proofErr w:type="spellEnd"/>
+      <w:r>
+        <w:rPr>
+          <w:sz w:val="18"/>
+          <w:szCs w:val="18"/>
+          <w:lang w:bidi="fa-IR"/>
+        </w:rPr>
+        <w:t>) and</w:t>
+      </w:r>
+    </w:p>
+    <w:p>
+      <w:pPr>
+        <w:rPr>
+          <w:sz w:val="18"/>
+          <w:szCs w:val="18"/>
+          <w:lang w:bidi="fa-IR"/>
+        </w:rPr>
+      </w:pPr>
+      <w:r>
+        <w:rPr>
+          <w:sz w:val="18"/>
+          <w:szCs w:val="18"/>
+          <w:lang w:bidi="fa-IR"/>
+        </w:rPr>
+        <w:t>(N2) state that all vectors have positive lengths except the zero vector</w:t>
+      </w:r>
+    </w:p>
+    <w:p>
+      <w:pPr>
+        <w:rPr>
+          <w:sz w:val="18"/>
+          <w:szCs w:val="18"/>
+          <w:lang w:bidi="fa-IR"/>
+        </w:rPr>
+      </w:pPr>
+      <w:r>
+        <w:rPr>
+          <w:sz w:val="18"/>
+          <w:szCs w:val="18"/>
+          <w:lang w:bidi="fa-IR"/>
+        </w:rPr>
+        <w:t>which has length zero. (N3) means that when a vector is multiplied by</w:t>
+      </w:r>
+    </w:p>
+    <w:p>
+      <w:pPr>
+        <w:rPr>
+          <w:sz w:val="18"/>
+          <w:szCs w:val="18"/>
+          <w:lang w:bidi="fa-IR"/>
+        </w:rPr>
+      </w:pPr>
+      <w:r>
+        <w:rPr>
+          <w:sz w:val="18"/>
+          <w:szCs w:val="18"/>
+          <w:lang w:bidi="fa-IR"/>
+        </w:rPr>
+        <w:t>a scalar, its length is multiplied by the absolute value of the scalar</w:t>
+      </w:r>
+      <w:r>
+        <w:rPr>
+          <w:rFonts w:cs="Arial"/>
+          <w:sz w:val="18"/>
+          <w:szCs w:val="18"/>
+          <w:rtl/>
+          <w:lang w:bidi="fa-IR"/>
+        </w:rPr>
+        <w:t>.</w:t>
+      </w:r>
+    </w:p>
+    <w:p>
+      <w:pPr>
+        <w:rPr>
+          <w:sz w:val="18"/>
+          <w:szCs w:val="18"/>
+          <w:lang w:bidi="fa-IR"/>
+        </w:rPr>
+      </w:pPr>
+      <w:r>
+        <w:rPr>
+          <w:sz w:val="18"/>
+          <w:szCs w:val="18"/>
+          <w:lang w:bidi="fa-IR"/>
+        </w:rPr>
+        <w:t>(N4) is illustrated in Fig. 15. It means that the length of one side of a</w:t>
+      </w:r>
+    </w:p>
+    <w:p>
+      <w:pPr>
+        <w:rPr>
+          <w:sz w:val="18"/>
+          <w:szCs w:val="18"/>
+          <w:lang w:bidi="fa-IR"/>
+        </w:rPr>
+      </w:pPr>
+      <w:r>
+        <w:rPr>
+          <w:sz w:val="18"/>
+          <w:szCs w:val="18"/>
+          <w:lang w:bidi="fa-IR"/>
+        </w:rPr>
+        <w:t>triangle cannot exceed the sum of the lengths of the two other sides</w:t>
+      </w:r>
+      <w:r>
+        <w:rPr>
+          <w:rFonts w:cs="Arial"/>
+          <w:sz w:val="18"/>
+          <w:szCs w:val="18"/>
+          <w:rtl/>
+          <w:lang w:bidi="fa-IR"/>
+        </w:rPr>
+        <w:t>.</w:t>
+      </w:r>
+    </w:p>
+    <w:p>
+      <w:pPr>
+        <w:rPr>
+          <w:sz w:val="18"/>
+          <w:szCs w:val="18"/>
+          <w:lang w:bidi="fa-IR"/>
+        </w:rPr>
+      </w:pPr>
+      <w:r>
+        <w:rPr>
+          <w:sz w:val="18"/>
+          <w:szCs w:val="18"/>
+          <w:lang w:bidi="fa-IR"/>
+        </w:rPr>
+        <w:t>It is not difficult to conclude from (</w:t>
+      </w:r>
+      <w:proofErr w:type="spellStart"/>
+      <w:r>
+        <w:rPr>
+          <w:sz w:val="18"/>
+          <w:szCs w:val="18"/>
+          <w:lang w:bidi="fa-IR"/>
+        </w:rPr>
+        <w:t>Nl</w:t>
+      </w:r>
+      <w:proofErr w:type="spellEnd"/>
+      <w:r>
+        <w:rPr>
+          <w:sz w:val="18"/>
+          <w:szCs w:val="18"/>
+          <w:lang w:bidi="fa-IR"/>
+        </w:rPr>
+        <w:t>) to (N4) that (1) does define</w:t>
+      </w:r>
+    </w:p>
+    <w:p>
+      <w:pPr>
+        <w:rPr>
+          <w:rFonts w:cs="Arial"/>
+          <w:sz w:val="18"/>
+          <w:szCs w:val="18"/>
+          <w:rtl/>
+          <w:lang w:bidi="fa-IR"/>
+        </w:rPr>
+      </w:pPr>
+      <w:r>
+        <w:rPr>
+          <w:sz w:val="18"/>
+          <w:szCs w:val="18"/>
+          <w:lang w:bidi="fa-IR"/>
+        </w:rPr>
+        <w:t>a metric. Hence normed spaces and Banach spaces are metric spaces</w:t>
+      </w:r>
+      <w:r>
+        <w:rPr>
+          <w:rFonts w:cs="Arial"/>
+          <w:sz w:val="18"/>
+          <w:szCs w:val="18"/>
+          <w:rtl/>
+          <w:lang w:bidi="fa-IR"/>
+        </w:rPr>
+        <w:t>.</w:t>
+      </w:r>
+    </w:p>
+    <w:p>
+      <w:pPr>
+        <w:rPr>
+          <w:color w:val="EE0000"/>
+          <w:sz w:val="18"/>
+          <w:szCs w:val="18"/>
+          <w:lang w:bidi="fa-IR"/>
+        </w:rPr>
+      </w:pPr>
+      <w:r>
+        <w:rPr>
+          <w:color w:val="EE0000"/>
+          <w:sz w:val="18"/>
+          <w:szCs w:val="18"/>
+          <w:lang w:bidi="fa-IR"/>
+        </w:rPr>
+        <w:t>For later use we notice that (N4) implies</w:t>
+      </w:r>
+    </w:p>
+    <w:p>
+      <w:pPr>
+        <w:rPr>
+          <w:color w:val="EE0000"/>
+          <w:sz w:val="18"/>
+          <w:szCs w:val="18"/>
+          <w:lang w:bidi="fa-IR"/>
+        </w:rPr>
+      </w:pPr>
+      <w:r>
+        <w:rPr>
+          <w:color w:val="EE0000"/>
+          <w:sz w:val="18"/>
+          <w:szCs w:val="18"/>
+          <w:lang w:bidi="fa-IR"/>
+        </w:rPr>
+        <w:t>(2) Illy" -</w:t>
+      </w:r>
+      <w:proofErr w:type="spellStart"/>
+      <w:r>
+        <w:rPr>
+          <w:color w:val="EE0000"/>
+          <w:sz w:val="18"/>
+          <w:szCs w:val="18"/>
+          <w:lang w:bidi="fa-IR"/>
+        </w:rPr>
+        <w:t>llxlll</w:t>
+      </w:r>
+      <w:proofErr w:type="spellEnd"/>
+      <w:r>
+        <w:rPr>
+          <w:color w:val="EE0000"/>
+          <w:sz w:val="18"/>
+          <w:szCs w:val="18"/>
+          <w:lang w:bidi="fa-IR"/>
+        </w:rPr>
+        <w:t xml:space="preserve"> ~ </w:t>
+      </w:r>
+      <w:proofErr w:type="spellStart"/>
+      <w:r>
+        <w:rPr>
+          <w:color w:val="EE0000"/>
+          <w:sz w:val="18"/>
+          <w:szCs w:val="18"/>
+          <w:lang w:bidi="fa-IR"/>
+        </w:rPr>
+        <w:t>Ily</w:t>
+      </w:r>
+      <w:proofErr w:type="spellEnd"/>
+      <w:r>
+        <w:rPr>
+          <w:color w:val="EE0000"/>
+          <w:sz w:val="18"/>
+          <w:szCs w:val="18"/>
+          <w:lang w:bidi="fa-IR"/>
+        </w:rPr>
+        <w:t xml:space="preserve"> - xii,</w:t>
+      </w:r>
+    </w:p>
+    <w:p>
+      <w:pPr>
+        <w:rPr>
+          <w:color w:val="EE0000"/>
+          <w:sz w:val="18"/>
+          <w:szCs w:val="18"/>
+          <w:lang w:bidi="fa-IR"/>
+        </w:rPr>
+      </w:pPr>
+      <w:r>
+        <w:rPr>
+          <w:color w:val="EE0000"/>
+          <w:sz w:val="18"/>
+          <w:szCs w:val="18"/>
+          <w:lang w:bidi="fa-IR"/>
+        </w:rPr>
+        <w:t>as the reader may readily prove (cf. Prob. 3). Formula (2) implies an</w:t>
+      </w:r>
+    </w:p>
+    <w:p>
+      <w:pPr>
+        <w:rPr>
+          <w:color w:val="EE0000"/>
+          <w:sz w:val="18"/>
+          <w:szCs w:val="18"/>
+          <w:lang w:bidi="fa-IR"/>
+        </w:rPr>
+      </w:pPr>
+      <w:r>
+        <w:rPr>
+          <w:color w:val="EE0000"/>
+          <w:sz w:val="18"/>
+          <w:szCs w:val="18"/>
+          <w:lang w:bidi="fa-IR"/>
+        </w:rPr>
+        <w:t>important property of the norm:</w:t>
+      </w:r>
+    </w:p>
+    <w:p>
+      <w:pPr>
+        <w:rPr>
+          <w:color w:val="EE0000"/>
+          <w:sz w:val="18"/>
+          <w:szCs w:val="18"/>
+          <w:lang w:bidi="fa-IR"/>
+        </w:rPr>
+      </w:pPr>
+      <w:r>
+        <w:rPr>
+          <w:color w:val="EE0000"/>
+          <w:sz w:val="18"/>
+          <w:szCs w:val="18"/>
+          <w:lang w:bidi="fa-IR"/>
+        </w:rPr>
+        <w:t xml:space="preserve">The norm is continuous, that is, x ~ </w:t>
+      </w:r>
+      <w:proofErr w:type="spellStart"/>
+      <w:r>
+        <w:rPr>
+          <w:color w:val="EE0000"/>
+          <w:sz w:val="18"/>
+          <w:szCs w:val="18"/>
+          <w:lang w:bidi="fa-IR"/>
+        </w:rPr>
+        <w:t>Ilxll</w:t>
+      </w:r>
+      <w:proofErr w:type="spellEnd"/>
+      <w:r>
+        <w:rPr>
+          <w:color w:val="EE0000"/>
+          <w:sz w:val="18"/>
+          <w:szCs w:val="18"/>
+          <w:lang w:bidi="fa-IR"/>
+        </w:rPr>
+        <w:t xml:space="preserve"> is a continuous mapping</w:t>
+      </w:r>
+    </w:p>
+    <w:p>
+      <w:pPr>
+        <w:rPr>
+          <w:color w:val="EE0000"/>
+          <w:sz w:val="18"/>
+          <w:szCs w:val="18"/>
+          <w:rtl/>
+          <w:lang w:bidi="fa-IR"/>
+        </w:rPr>
+      </w:pPr>
+      <w:r>
+        <w:rPr>
+          <w:color w:val="EE0000"/>
+          <w:sz w:val="18"/>
+          <w:szCs w:val="18"/>
+          <w:lang w:bidi="fa-IR"/>
+        </w:rPr>
+        <w:t>of (X, 11·11) into R. (Cf. 1.3-3.)</w:t>
+      </w:r>
+    </w:p>
+    <w:p>
+      <w:pPr>
+        <w:rPr>
+          <w:sz w:val="18"/>
+          <w:szCs w:val="18"/>
+          <w:lang w:bidi="fa-IR"/>
+        </w:rPr>
+      </w:pPr>
+    </w:p>
+    <w:p>
+      <w:pPr>
+        <w:rPr>
           <w:sz w:val="56"/>
           <w:szCs w:val="56"/>
           <w:rtl/>
           <w:lang w:bidi="fa-IR"/>
         </w:rPr>
       </w:pPr>
-    </w:p>
-    <w:p>
-      <w:pPr>
+      <w:r>
         <w:rPr>
           <w:sz w:val="56"/>
           <w:szCs w:val="56"/>
           <w:rtl/>
           <w:lang w:bidi="fa-IR"/>
         </w:rPr>
-      </w:pPr>
-      <w:r>
+        <w:br w:type="page"/>
+      </w:r>
+    </w:p>
+    <w:p>
+      <w:pPr>
         <w:rPr>
           <w:sz w:val="56"/>
           <w:szCs w:val="56"/>
-          <w:rtl/>
-          <w:lang w:bidi="fa-IR"/>
-        </w:rPr>
-        <w:br w:type="page"/>
-      </w:r>
-    </w:p>
-    <w:p>
-      <w:pPr>
-        <w:rPr>
-          <w:sz w:val="56"/>
-          <w:szCs w:val="56"/>
           <w:lang w:bidi="fa-IR"/>
         </w:rPr>
       </w:pPr>
@@ -5206,7 +5594,7 @@
           <w:lang w:bidi="fa-IR"/>
         </w:rPr>
         <w:pict w14:anchorId="11E60944">
-          <v:rect id="_x0000_i1104" style="width:0;height:1.5pt" o:hralign="center" o:hrstd="t" o:hr="t" fillcolor="#a0a0a0" stroked="f"/>
+          <v:rect id="_x0000_i1025" style="width:0;height:1.5pt" o:hralign="center" o:hrstd="t" o:hr="t" fillcolor="#a0a0a0" stroked="f"/>
         </w:pict>
       </w:r>
     </w:p>
@@ -5711,7 +6099,7 @@
           <w:lang w:bidi="fa-IR"/>
         </w:rPr>
         <w:pict w14:anchorId="40FE22BC">
-          <v:rect id="_x0000_i1105" style="width:0;height:1.5pt" o:hralign="center" o:hrstd="t" o:hr="t" fillcolor="#a0a0a0" stroked="f"/>
+          <v:rect id="_x0000_i1026" style="width:0;height:1.5pt" o:hralign="center" o:hrstd="t" o:hr="t" fillcolor="#a0a0a0" stroked="f"/>
         </w:pict>
       </w:r>
     </w:p>
@@ -6101,7 +6489,7 @@
           <w:lang w:bidi="fa-IR"/>
         </w:rPr>
         <w:pict w14:anchorId="70876681">
-          <v:rect id="_x0000_i1106" style="width:0;height:1.5pt" o:hralign="center" o:hrstd="t" o:hr="t" fillcolor="#a0a0a0" stroked="f"/>
+          <v:rect id="_x0000_i1027" style="width:0;height:1.5pt" o:hralign="center" o:hrstd="t" o:hr="t" fillcolor="#a0a0a0" stroked="f"/>
         </w:pict>
       </w:r>
     </w:p>
@@ -6524,7 +6912,7 @@
           <w:lang w:bidi="fa-IR"/>
         </w:rPr>
         <w:pict w14:anchorId="15744566">
-          <v:rect id="_x0000_i1107" style="width:0;height:1.5pt" o:hralign="center" o:hrstd="t" o:hr="t" fillcolor="#a0a0a0" stroked="f"/>
+          <v:rect id="_x0000_i1028" style="width:0;height:1.5pt" o:hralign="center" o:hrstd="t" o:hr="t" fillcolor="#a0a0a0" stroked="f"/>
         </w:pict>
       </w:r>
     </w:p>
@@ -6993,7 +7381,7 @@
           <w:lang w:bidi="fa-IR"/>
         </w:rPr>
         <w:pict w14:anchorId="28970823">
-          <v:rect id="_x0000_i1108" style="width:0;height:1.5pt" o:hralign="center" o:hrstd="t" o:hr="t" fillcolor="#a0a0a0" stroked="f"/>
+          <v:rect id="_x0000_i1029" style="width:0;height:1.5pt" o:hralign="center" o:hrstd="t" o:hr="t" fillcolor="#a0a0a0" stroked="f"/>
         </w:pict>
       </w:r>
     </w:p>
@@ -7454,7 +7842,7 @@
           <w:lang w:bidi="fa-IR"/>
         </w:rPr>
         <w:pict w14:anchorId="451FF564">
-          <v:rect id="_x0000_i1109" style="width:0;height:1.5pt" o:hralign="center" o:hrstd="t" o:hr="t" fillcolor="#a0a0a0" stroked="f"/>
+          <v:rect id="_x0000_i1030" style="width:0;height:1.5pt" o:hralign="center" o:hrstd="t" o:hr="t" fillcolor="#a0a0a0" stroked="f"/>
         </w:pict>
       </w:r>
     </w:p>
@@ -8059,7 +8447,7 @@
           <w:lang w:bidi="fa-IR"/>
         </w:rPr>
         <w:pict w14:anchorId="7615CC86">
-          <v:rect id="_x0000_i1110" style="width:0;height:1.5pt" o:hralign="center" o:hrstd="t" o:hr="t" fillcolor="#a0a0a0" stroked="f"/>
+          <v:rect id="_x0000_i1031" style="width:0;height:1.5pt" o:hralign="center" o:hrstd="t" o:hr="t" fillcolor="#a0a0a0" stroked="f"/>
         </w:pict>
       </w:r>
     </w:p>
@@ -8498,7 +8886,7 @@
           <w:lang w:bidi="fa-IR"/>
         </w:rPr>
         <w:pict w14:anchorId="3D5430A8">
-          <v:rect id="_x0000_i1111" style="width:0;height:1.5pt" o:hralign="center" o:hrstd="t" o:hr="t" fillcolor="#a0a0a0" stroked="f"/>
+          <v:rect id="_x0000_i1032" style="width:0;height:1.5pt" o:hralign="center" o:hrstd="t" o:hr="t" fillcolor="#a0a0a0" stroked="f"/>
         </w:pict>
       </w:r>
     </w:p>
@@ -8854,7 +9242,7 @@
           <w:lang w:bidi="fa-IR"/>
         </w:rPr>
         <w:pict w14:anchorId="61DB8029">
-          <v:rect id="_x0000_i1112" style="width:0;height:1.5pt" o:hralign="center" o:hrstd="t" o:hr="t" fillcolor="#a0a0a0" stroked="f"/>
+          <v:rect id="_x0000_i1033" style="width:0;height:1.5pt" o:hralign="center" o:hrstd="t" o:hr="t" fillcolor="#a0a0a0" stroked="f"/>
         </w:pict>
       </w:r>
     </w:p>
@@ -9272,7 +9660,7 @@
           <w:lang w:bidi="fa-IR"/>
         </w:rPr>
         <w:pict w14:anchorId="3CD08AA6">
-          <v:rect id="_x0000_i1113" style="width:0;height:1.5pt" o:hralign="center" o:hrstd="t" o:hr="t" fillcolor="#a0a0a0" stroked="f"/>
+          <v:rect id="_x0000_i1034" style="width:0;height:1.5pt" o:hralign="center" o:hrstd="t" o:hr="t" fillcolor="#a0a0a0" stroked="f"/>
         </w:pict>
       </w:r>
     </w:p>
@@ -9914,6 +10302,7 @@
       <w:pPr>
         <w:bidi/>
         <w:rPr>
+          <w:color w:val="EE0000"/>
           <w:sz w:val="20"/>
           <w:szCs w:val="20"/>
           <w:lang w:bidi="fa-IR"/>
@@ -9941,13 +10330,15 @@
       <w:pPr>
         <w:bidi/>
         <w:rPr>
-          <w:sz w:val="20"/>
-          <w:szCs w:val="20"/>
-          <w:lang w:bidi="fa-IR"/>
-        </w:rPr>
-      </w:pPr>
-      <w:r>
-        <w:rPr>
+          <w:color w:val="EE0000"/>
+          <w:sz w:val="20"/>
+          <w:szCs w:val="20"/>
+          <w:lang w:bidi="fa-IR"/>
+        </w:rPr>
+      </w:pPr>
+      <w:r>
+        <w:rPr>
+          <w:color w:val="EE0000"/>
           <w:sz w:val="20"/>
           <w:szCs w:val="20"/>
           <w:lang w:bidi="fa-IR"/>
@@ -9959,13 +10350,15 @@
       <w:pPr>
         <w:bidi/>
         <w:rPr>
-          <w:sz w:val="20"/>
-          <w:szCs w:val="20"/>
-          <w:lang w:bidi="fa-IR"/>
-        </w:rPr>
-      </w:pPr>
-      <w:r>
-        <w:rPr>
+          <w:color w:val="EE0000"/>
+          <w:sz w:val="20"/>
+          <w:szCs w:val="20"/>
+          <w:lang w:bidi="fa-IR"/>
+        </w:rPr>
+      </w:pPr>
+      <w:r>
+        <w:rPr>
+          <w:color w:val="EE0000"/>
           <w:sz w:val="20"/>
           <w:szCs w:val="20"/>
           <w:lang w:bidi="fa-IR"/>
@@ -12696,6 +13089,119 @@
     </w:lvl>
   </w:abstractNum>
   <w:abstractNum w:abstractNumId="18" w15:restartNumberingAfterBreak="0">
+    <w:nsid w:val="796A38C5"/>
+    <w:multiLevelType w:val="hybridMultilevel"/>
+    <w:tmpl w:val="1404469E"/>
+    <w:lvl w:ilvl="0" w:tplc="04090001">
+      <w:start w:val="1"/>
+      <w:numFmt w:val="bullet"/>
+      <w:lvlText w:val=""/>
+      <w:lvlJc w:val="left"/>
+      <w:pPr>
+        <w:ind w:left="720" w:hanging="360"/>
+      </w:pPr>
+      <w:rPr>
+        <w:rFonts w:ascii="Symbol" w:hAnsi="Symbol" w:hint="default"/>
+      </w:rPr>
+    </w:lvl>
+    <w:lvl w:ilvl="1" w:tplc="04090003" w:tentative="1">
+      <w:start w:val="1"/>
+      <w:numFmt w:val="bullet"/>
+      <w:lvlText w:val="o"/>
+      <w:lvlJc w:val="left"/>
+      <w:pPr>
+        <w:ind w:left="1440" w:hanging="360"/>
+      </w:pPr>
+      <w:rPr>
+        <w:rFonts w:ascii="Courier New" w:hAnsi="Courier New" w:cs="Courier New" w:hint="default"/>
+      </w:rPr>
+    </w:lvl>
+    <w:lvl w:ilvl="2" w:tplc="04090005" w:tentative="1">
+      <w:start w:val="1"/>
+      <w:numFmt w:val="bullet"/>
+      <w:lvlText w:val=""/>
+      <w:lvlJc w:val="left"/>
+      <w:pPr>
+        <w:ind w:left="2160" w:hanging="360"/>
+      </w:pPr>
+      <w:rPr>
+        <w:rFonts w:ascii="Wingdings" w:hAnsi="Wingdings" w:hint="default"/>
+      </w:rPr>
+    </w:lvl>
+    <w:lvl w:ilvl="3" w:tplc="04090001" w:tentative="1">
+      <w:start w:val="1"/>
+      <w:numFmt w:val="bullet"/>
+      <w:lvlText w:val=""/>
+      <w:lvlJc w:val="left"/>
+      <w:pPr>
+        <w:ind w:left="2880" w:hanging="360"/>
+      </w:pPr>
+      <w:rPr>
+        <w:rFonts w:ascii="Symbol" w:hAnsi="Symbol" w:hint="default"/>
+      </w:rPr>
+    </w:lvl>
+    <w:lvl w:ilvl="4" w:tplc="04090003" w:tentative="1">
+      <w:start w:val="1"/>
+      <w:numFmt w:val="bullet"/>
+      <w:lvlText w:val="o"/>
+      <w:lvlJc w:val="left"/>
+      <w:pPr>
+        <w:ind w:left="3600" w:hanging="360"/>
+      </w:pPr>
+      <w:rPr>
+        <w:rFonts w:ascii="Courier New" w:hAnsi="Courier New" w:cs="Courier New" w:hint="default"/>
+      </w:rPr>
+    </w:lvl>
+    <w:lvl w:ilvl="5" w:tplc="04090005" w:tentative="1">
+      <w:start w:val="1"/>
+      <w:numFmt w:val="bullet"/>
+      <w:lvlText w:val=""/>
+      <w:lvlJc w:val="left"/>
+      <w:pPr>
+        <w:ind w:left="4320" w:hanging="360"/>
+      </w:pPr>
+      <w:rPr>
+        <w:rFonts w:ascii="Wingdings" w:hAnsi="Wingdings" w:hint="default"/>
+      </w:rPr>
+    </w:lvl>
+    <w:lvl w:ilvl="6" w:tplc="04090001" w:tentative="1">
+      <w:start w:val="1"/>
+      <w:numFmt w:val="bullet"/>
+      <w:lvlText w:val=""/>
+      <w:lvlJc w:val="left"/>
+      <w:pPr>
+        <w:ind w:left="5040" w:hanging="360"/>
+      </w:pPr>
+      <w:rPr>
+        <w:rFonts w:ascii="Symbol" w:hAnsi="Symbol" w:hint="default"/>
+      </w:rPr>
+    </w:lvl>
+    <w:lvl w:ilvl="7" w:tplc="04090003" w:tentative="1">
+      <w:start w:val="1"/>
+      <w:numFmt w:val="bullet"/>
+      <w:lvlText w:val="o"/>
+      <w:lvlJc w:val="left"/>
+      <w:pPr>
+        <w:ind w:left="5760" w:hanging="360"/>
+      </w:pPr>
+      <w:rPr>
+        <w:rFonts w:ascii="Courier New" w:hAnsi="Courier New" w:cs="Courier New" w:hint="default"/>
+      </w:rPr>
+    </w:lvl>
+    <w:lvl w:ilvl="8" w:tplc="04090005" w:tentative="1">
+      <w:start w:val="1"/>
+      <w:numFmt w:val="bullet"/>
+      <w:lvlText w:val=""/>
+      <w:lvlJc w:val="left"/>
+      <w:pPr>
+        <w:ind w:left="6480" w:hanging="360"/>
+      </w:pPr>
+      <w:rPr>
+        <w:rFonts w:ascii="Wingdings" w:hAnsi="Wingdings" w:hint="default"/>
+      </w:rPr>
+    </w:lvl>
+  </w:abstractNum>
+  <w:abstractNum w:abstractNumId="19" w15:restartNumberingAfterBreak="0">
     <w:nsid w:val="7F0A6A47"/>
     <w:multiLevelType w:val="multilevel"/>
     <w:tmpl w:val="EEAA81D8"/>
@@ -12860,7 +13366,7 @@
     <w:abstractNumId w:val="3"/>
   </w:num>
   <w:num w:numId="6" w16cid:durableId="1683043692">
-    <w:abstractNumId w:val="18"/>
+    <w:abstractNumId w:val="19"/>
   </w:num>
   <w:num w:numId="7" w16cid:durableId="1824854707">
     <w:abstractNumId w:val="5"/>
@@ -12900,6 +13406,9 @@
   </w:num>
   <w:num w:numId="19" w16cid:durableId="1158572409">
     <w:abstractNumId w:val="16"/>
+  </w:num>
+  <w:num w:numId="20" w16cid:durableId="370038589">
+    <w:abstractNumId w:val="18"/>
   </w:num>
 </w:numbering>
 </file>
@@ -13507,6 +14016,7 @@
   <w:style w:type="character" w:default="1" w:styleId="DefaultParagraphFont">
     <w:name w:val="Default Paragraph Font"/>
     <w:uiPriority w:val="1"/>
+    <w:semiHidden/>
     <w:unhideWhenUsed/>
   </w:style>
   <w:style w:type="table" w:default="1" w:styleId="TableNormal">

</xml_diff>

<commit_message>
step 70 : add property and fix bugs
</commit_message>
<xml_diff>
--- a/notes/video-overview-notes.docx
+++ b/notes/video-overview-notes.docx
@@ -4920,51 +4920,50 @@
           <w:lang w:bidi="fa-IR"/>
         </w:rPr>
       </w:pPr>
-      <w:proofErr w:type="gramStart"/>
       <w:r>
         <w:rPr>
           <w:sz w:val="56"/>
           <w:szCs w:val="56"/>
           <w:lang w:bidi="fa-IR"/>
         </w:rPr>
-        <w:t>  Definition</w:t>
-      </w:r>
-      <w:proofErr w:type="gramEnd"/>
-      <w:r>
+        <w:t>  Definition of norm</w:t>
+      </w:r>
+    </w:p>
+    <w:p>
+      <w:pPr>
+        <w:bidi/>
         <w:rPr>
           <w:sz w:val="56"/>
           <w:szCs w:val="56"/>
           <w:lang w:bidi="fa-IR"/>
         </w:rPr>
-        <w:t xml:space="preserve"> of norm</w:t>
-      </w:r>
-    </w:p>
-    <w:p>
-      <w:pPr>
-        <w:bidi/>
+      </w:pPr>
+      <w:r>
         <w:rPr>
           <w:sz w:val="56"/>
           <w:szCs w:val="56"/>
           <w:lang w:bidi="fa-IR"/>
         </w:rPr>
-      </w:pPr>
-      <w:proofErr w:type="gramStart"/>
-      <w:r>
+        <w:t>  Geometric meaning</w:t>
+      </w:r>
+    </w:p>
+    <w:p>
+      <w:pPr>
+        <w:bidi/>
         <w:rPr>
           <w:sz w:val="56"/>
           <w:szCs w:val="56"/>
           <w:lang w:bidi="fa-IR"/>
         </w:rPr>
-        <w:t>  Geometric</w:t>
-      </w:r>
-      <w:proofErr w:type="gramEnd"/>
+      </w:pPr>
       <w:r>
         <w:rPr>
           <w:sz w:val="56"/>
           <w:szCs w:val="56"/>
           <w:lang w:bidi="fa-IR"/>
         </w:rPr>
-        <w:t xml:space="preserve"> meaning</w:t>
+        <w:lastRenderedPageBreak/>
+        <w:t>  Unit ball idea</w:t>
       </w:r>
     </w:p>
     <w:p>
@@ -4976,52 +4975,49 @@
           <w:lang w:bidi="fa-IR"/>
         </w:rPr>
       </w:pPr>
-      <w:proofErr w:type="gramStart"/>
       <w:r>
         <w:rPr>
           <w:sz w:val="56"/>
           <w:szCs w:val="56"/>
           <w:lang w:bidi="fa-IR"/>
         </w:rPr>
-        <w:lastRenderedPageBreak/>
-        <w:t>  Unit</w:t>
-      </w:r>
-      <w:proofErr w:type="gramEnd"/>
-      <w:r>
+        <w:t>  ℓ¹, ℓ², ℓ∞ comparison</w:t>
+      </w:r>
+    </w:p>
+    <w:p>
+      <w:pPr>
+        <w:bidi/>
         <w:rPr>
           <w:sz w:val="56"/>
           <w:szCs w:val="56"/>
           <w:lang w:bidi="fa-IR"/>
         </w:rPr>
-        <w:t xml:space="preserve"> ball idea</w:t>
-      </w:r>
-    </w:p>
-    <w:p>
-      <w:pPr>
-        <w:bidi/>
+      </w:pPr>
+      <w:r>
         <w:rPr>
           <w:sz w:val="56"/>
           <w:szCs w:val="56"/>
           <w:lang w:bidi="fa-IR"/>
         </w:rPr>
-      </w:pPr>
-      <w:proofErr w:type="gramStart"/>
-      <w:r>
+        <w:t>  Animation of p-norm</w:t>
+      </w:r>
+    </w:p>
+    <w:p>
+      <w:pPr>
+        <w:bidi/>
         <w:rPr>
           <w:sz w:val="56"/>
           <w:szCs w:val="56"/>
           <w:lang w:bidi="fa-IR"/>
         </w:rPr>
-        <w:t>  ℓ</w:t>
-      </w:r>
-      <w:proofErr w:type="gramEnd"/>
+      </w:pPr>
       <w:r>
         <w:rPr>
           <w:sz w:val="56"/>
           <w:szCs w:val="56"/>
           <w:lang w:bidi="fa-IR"/>
         </w:rPr>
-        <w:t>¹, ℓ², ℓ∞ comparison</w:t>
+        <w:t>  Small example computation</w:t>
       </w:r>
     </w:p>
     <w:p>
@@ -5033,79 +5029,13 @@
           <w:lang w:bidi="fa-IR"/>
         </w:rPr>
       </w:pPr>
-      <w:proofErr w:type="gramStart"/>
       <w:r>
         <w:rPr>
           <w:sz w:val="56"/>
           <w:szCs w:val="56"/>
           <w:lang w:bidi="fa-IR"/>
         </w:rPr>
-        <w:t>  Animation</w:t>
-      </w:r>
-      <w:proofErr w:type="gramEnd"/>
-      <w:r>
-        <w:rPr>
-          <w:sz w:val="56"/>
-          <w:szCs w:val="56"/>
-          <w:lang w:bidi="fa-IR"/>
-        </w:rPr>
-        <w:t xml:space="preserve"> of p-norm</w:t>
-      </w:r>
-    </w:p>
-    <w:p>
-      <w:pPr>
-        <w:bidi/>
-        <w:rPr>
-          <w:sz w:val="56"/>
-          <w:szCs w:val="56"/>
-          <w:lang w:bidi="fa-IR"/>
-        </w:rPr>
-      </w:pPr>
-      <w:proofErr w:type="gramStart"/>
-      <w:r>
-        <w:rPr>
-          <w:sz w:val="56"/>
-          <w:szCs w:val="56"/>
-          <w:lang w:bidi="fa-IR"/>
-        </w:rPr>
-        <w:t>  Small</w:t>
-      </w:r>
-      <w:proofErr w:type="gramEnd"/>
-      <w:r>
-        <w:rPr>
-          <w:sz w:val="56"/>
-          <w:szCs w:val="56"/>
-          <w:lang w:bidi="fa-IR"/>
-        </w:rPr>
-        <w:t xml:space="preserve"> example computation</w:t>
-      </w:r>
-    </w:p>
-    <w:p>
-      <w:pPr>
-        <w:bidi/>
-        <w:rPr>
-          <w:sz w:val="56"/>
-          <w:szCs w:val="56"/>
-          <w:lang w:bidi="fa-IR"/>
-        </w:rPr>
-      </w:pPr>
-      <w:proofErr w:type="gramStart"/>
-      <w:r>
-        <w:rPr>
-          <w:sz w:val="56"/>
-          <w:szCs w:val="56"/>
-          <w:lang w:bidi="fa-IR"/>
-        </w:rPr>
-        <w:t>  Short</w:t>
-      </w:r>
-      <w:proofErr w:type="gramEnd"/>
-      <w:r>
-        <w:rPr>
-          <w:sz w:val="56"/>
-          <w:szCs w:val="56"/>
-          <w:lang w:bidi="fa-IR"/>
-        </w:rPr>
-        <w:t xml:space="preserve"> teaser about Banach spaces</w:t>
+        <w:t>  Short teaser about Banach spaces</w:t>
       </w:r>
     </w:p>
     <w:p>
@@ -6224,16 +6154,7 @@
           <w:szCs w:val="20"/>
           <w:rtl/>
         </w:rPr>
-        <w:t xml:space="preserve">نام او استفان باناخ </w:t>
-      </w:r>
-      <w:proofErr w:type="gramStart"/>
-      <w:r>
-        <w:rPr>
-          <w:sz w:val="20"/>
-          <w:szCs w:val="20"/>
-          <w:rtl/>
-        </w:rPr>
-        <w:t>است</w:t>
+        <w:t>نام او استفان باناخ است</w:t>
       </w:r>
       <w:r>
         <w:rPr>
@@ -6243,7 +6164,6 @@
         </w:rPr>
         <w:t>.»</w:t>
       </w:r>
-      <w:proofErr w:type="gramEnd"/>
     </w:p>
     <w:p>
       <w:pPr>
@@ -8572,16 +8492,7 @@
           <w:szCs w:val="20"/>
           <w:rtl/>
         </w:rPr>
-        <w:t xml:space="preserve">این همان چیزی است که امروز به آن می‌گوییم فضای </w:t>
-      </w:r>
-      <w:proofErr w:type="gramStart"/>
-      <w:r>
-        <w:rPr>
-          <w:sz w:val="20"/>
-          <w:szCs w:val="20"/>
-          <w:rtl/>
-        </w:rPr>
-        <w:t>باناخ</w:t>
+        <w:t>این همان چیزی است که امروز به آن می‌گوییم فضای باناخ</w:t>
       </w:r>
       <w:r>
         <w:rPr>
@@ -8591,7 +8502,6 @@
         </w:rPr>
         <w:t>.»</w:t>
       </w:r>
-      <w:proofErr w:type="gramEnd"/>
     </w:p>
     <w:p>
       <w:pPr>
@@ -34038,6 +33948,7 @@
       <w:pPr>
         <w:bidi/>
         <w:rPr>
+          <w:rFonts w:hint="cs"/>
           <w:sz w:val="20"/>
           <w:szCs w:val="20"/>
           <w:rtl/>
@@ -34096,6 +34007,1699 @@
           <w:szCs w:val="20"/>
         </w:rPr>
       </w:pPr>
+      <w:r>
+        <w:rPr>
+          <w:rFonts w:hint="cs"/>
+          <w:sz w:val="20"/>
+          <w:szCs w:val="20"/>
+          <w:rtl/>
+          <w:lang w:bidi="fa-IR"/>
+        </w:rPr>
+        <w:t>کامندی که باهاش مطلب اضافه پیدا کردن:</w:t>
+      </w:r>
+      <w:r>
+        <w:rPr>
+          <w:sz w:val="20"/>
+          <w:szCs w:val="20"/>
+          <w:rtl/>
+          <w:lang w:bidi="fa-IR"/>
+        </w:rPr>
+        <w:br/>
+      </w:r>
+      <w:r>
+        <w:rPr>
+          <w:rFonts w:cs="Arial"/>
+          <w:sz w:val="20"/>
+          <w:szCs w:val="20"/>
+          <w:rtl/>
+        </w:rPr>
+        <w:t xml:space="preserve">من دارم </w:t>
+      </w:r>
+      <w:r>
+        <w:rPr>
+          <w:rFonts w:cs="Arial" w:hint="cs"/>
+          <w:sz w:val="20"/>
+          <w:szCs w:val="20"/>
+          <w:rtl/>
+        </w:rPr>
+        <w:t>ی</w:t>
+      </w:r>
+      <w:r>
+        <w:rPr>
+          <w:rFonts w:cs="Arial" w:hint="eastAsia"/>
+          <w:sz w:val="20"/>
+          <w:szCs w:val="20"/>
+          <w:rtl/>
+        </w:rPr>
+        <w:t>ک</w:t>
+      </w:r>
+      <w:r>
+        <w:rPr>
+          <w:rFonts w:cs="Arial"/>
+          <w:sz w:val="20"/>
+          <w:szCs w:val="20"/>
+          <w:rtl/>
+        </w:rPr>
+        <w:t xml:space="preserve"> و</w:t>
+      </w:r>
+      <w:r>
+        <w:rPr>
+          <w:rFonts w:cs="Arial" w:hint="cs"/>
+          <w:sz w:val="20"/>
+          <w:szCs w:val="20"/>
+          <w:rtl/>
+        </w:rPr>
+        <w:t>ی</w:t>
+      </w:r>
+      <w:r>
+        <w:rPr>
+          <w:rFonts w:cs="Arial" w:hint="eastAsia"/>
+          <w:sz w:val="20"/>
+          <w:szCs w:val="20"/>
+          <w:rtl/>
+        </w:rPr>
+        <w:t>د</w:t>
+      </w:r>
+      <w:r>
+        <w:rPr>
+          <w:rFonts w:cs="Arial" w:hint="cs"/>
+          <w:sz w:val="20"/>
+          <w:szCs w:val="20"/>
+          <w:rtl/>
+        </w:rPr>
+        <w:t>ی</w:t>
+      </w:r>
+      <w:r>
+        <w:rPr>
+          <w:rFonts w:cs="Arial" w:hint="eastAsia"/>
+          <w:sz w:val="20"/>
+          <w:szCs w:val="20"/>
+          <w:rtl/>
+        </w:rPr>
+        <w:t>و</w:t>
+      </w:r>
+      <w:r>
+        <w:rPr>
+          <w:rFonts w:cs="Arial"/>
+          <w:sz w:val="20"/>
+          <w:szCs w:val="20"/>
+          <w:rtl/>
+        </w:rPr>
+        <w:t xml:space="preserve"> اموزش</w:t>
+      </w:r>
+      <w:r>
+        <w:rPr>
+          <w:rFonts w:cs="Arial" w:hint="cs"/>
+          <w:sz w:val="20"/>
+          <w:szCs w:val="20"/>
+          <w:rtl/>
+        </w:rPr>
+        <w:t>ی</w:t>
+      </w:r>
+      <w:r>
+        <w:rPr>
+          <w:rFonts w:cs="Arial"/>
+          <w:sz w:val="20"/>
+          <w:szCs w:val="20"/>
+          <w:rtl/>
+        </w:rPr>
+        <w:t xml:space="preserve"> در مورد انواع تعامد ها در فضاها</w:t>
+      </w:r>
+      <w:r>
+        <w:rPr>
+          <w:rFonts w:cs="Arial" w:hint="cs"/>
+          <w:sz w:val="20"/>
+          <w:szCs w:val="20"/>
+          <w:rtl/>
+        </w:rPr>
+        <w:t>ی</w:t>
+      </w:r>
+      <w:r>
+        <w:rPr>
+          <w:rFonts w:cs="Arial"/>
+          <w:sz w:val="20"/>
+          <w:szCs w:val="20"/>
+          <w:rtl/>
+        </w:rPr>
+        <w:t xml:space="preserve"> نرمدار برا</w:t>
+      </w:r>
+      <w:r>
+        <w:rPr>
+          <w:rFonts w:cs="Arial" w:hint="cs"/>
+          <w:sz w:val="20"/>
+          <w:szCs w:val="20"/>
+          <w:rtl/>
+        </w:rPr>
+        <w:t>ی</w:t>
+      </w:r>
+      <w:r>
+        <w:rPr>
+          <w:rFonts w:cs="Arial"/>
+          <w:sz w:val="20"/>
+          <w:szCs w:val="20"/>
+          <w:rtl/>
+        </w:rPr>
+        <w:t xml:space="preserve"> دانشجوها</w:t>
+      </w:r>
+      <w:r>
+        <w:rPr>
+          <w:rFonts w:cs="Arial" w:hint="cs"/>
+          <w:sz w:val="20"/>
+          <w:szCs w:val="20"/>
+          <w:rtl/>
+        </w:rPr>
+        <w:t>ی</w:t>
+      </w:r>
+      <w:r>
+        <w:rPr>
+          <w:rFonts w:cs="Arial"/>
+          <w:sz w:val="20"/>
+          <w:szCs w:val="20"/>
+          <w:rtl/>
+        </w:rPr>
+        <w:t xml:space="preserve"> کارشناس</w:t>
+      </w:r>
+      <w:r>
+        <w:rPr>
+          <w:rFonts w:cs="Arial" w:hint="cs"/>
+          <w:sz w:val="20"/>
+          <w:szCs w:val="20"/>
+          <w:rtl/>
+        </w:rPr>
+        <w:t>ی</w:t>
+      </w:r>
+      <w:r>
+        <w:rPr>
+          <w:rFonts w:cs="Arial"/>
+          <w:sz w:val="20"/>
+          <w:szCs w:val="20"/>
+          <w:rtl/>
+        </w:rPr>
+        <w:t xml:space="preserve"> علوم کامپ</w:t>
+      </w:r>
+      <w:r>
+        <w:rPr>
+          <w:rFonts w:cs="Arial" w:hint="cs"/>
+          <w:sz w:val="20"/>
+          <w:szCs w:val="20"/>
+          <w:rtl/>
+        </w:rPr>
+        <w:t>ی</w:t>
+      </w:r>
+      <w:r>
+        <w:rPr>
+          <w:rFonts w:cs="Arial" w:hint="eastAsia"/>
+          <w:sz w:val="20"/>
+          <w:szCs w:val="20"/>
+          <w:rtl/>
+        </w:rPr>
+        <w:t>وتر</w:t>
+      </w:r>
+      <w:r>
+        <w:rPr>
+          <w:rFonts w:cs="Arial"/>
+          <w:sz w:val="20"/>
+          <w:szCs w:val="20"/>
+          <w:rtl/>
+        </w:rPr>
+        <w:t xml:space="preserve"> و ر</w:t>
+      </w:r>
+      <w:r>
+        <w:rPr>
+          <w:rFonts w:cs="Arial" w:hint="cs"/>
+          <w:sz w:val="20"/>
+          <w:szCs w:val="20"/>
+          <w:rtl/>
+        </w:rPr>
+        <w:t>ی</w:t>
+      </w:r>
+      <w:r>
+        <w:rPr>
+          <w:rFonts w:cs="Arial" w:hint="eastAsia"/>
+          <w:sz w:val="20"/>
+          <w:szCs w:val="20"/>
+          <w:rtl/>
+        </w:rPr>
+        <w:t>اض</w:t>
+      </w:r>
+      <w:r>
+        <w:rPr>
+          <w:rFonts w:cs="Arial" w:hint="cs"/>
+          <w:sz w:val="20"/>
+          <w:szCs w:val="20"/>
+          <w:rtl/>
+        </w:rPr>
+        <w:t>ی</w:t>
+      </w:r>
+      <w:r>
+        <w:rPr>
+          <w:rFonts w:cs="Arial"/>
+          <w:sz w:val="20"/>
+          <w:szCs w:val="20"/>
+          <w:rtl/>
+        </w:rPr>
+        <w:t xml:space="preserve"> اماده م</w:t>
+      </w:r>
+      <w:r>
+        <w:rPr>
+          <w:rFonts w:cs="Arial" w:hint="cs"/>
+          <w:sz w:val="20"/>
+          <w:szCs w:val="20"/>
+          <w:rtl/>
+        </w:rPr>
+        <w:t>ی</w:t>
+      </w:r>
+      <w:r>
+        <w:rPr>
+          <w:rFonts w:cs="Arial" w:hint="eastAsia"/>
+          <w:sz w:val="20"/>
+          <w:szCs w:val="20"/>
+          <w:rtl/>
+        </w:rPr>
+        <w:t>کنم</w:t>
+      </w:r>
+      <w:r>
+        <w:rPr>
+          <w:rFonts w:cs="Arial"/>
+          <w:sz w:val="20"/>
+          <w:szCs w:val="20"/>
+          <w:rtl/>
+        </w:rPr>
+        <w:t xml:space="preserve"> و در بخش</w:t>
+      </w:r>
+      <w:r>
+        <w:rPr>
+          <w:rFonts w:cs="Arial" w:hint="cs"/>
+          <w:sz w:val="20"/>
+          <w:szCs w:val="20"/>
+          <w:rtl/>
+        </w:rPr>
+        <w:t>ی</w:t>
+      </w:r>
+      <w:r>
+        <w:rPr>
+          <w:rFonts w:cs="Arial"/>
+          <w:sz w:val="20"/>
+          <w:szCs w:val="20"/>
+          <w:rtl/>
+        </w:rPr>
+        <w:t xml:space="preserve"> از اون کمک ن</w:t>
+      </w:r>
+      <w:r>
+        <w:rPr>
+          <w:rFonts w:cs="Arial" w:hint="cs"/>
+          <w:sz w:val="20"/>
+          <w:szCs w:val="20"/>
+          <w:rtl/>
+        </w:rPr>
+        <w:t>ی</w:t>
+      </w:r>
+      <w:r>
+        <w:rPr>
+          <w:rFonts w:cs="Arial" w:hint="eastAsia"/>
+          <w:sz w:val="20"/>
+          <w:szCs w:val="20"/>
+          <w:rtl/>
+        </w:rPr>
+        <w:t>از</w:t>
+      </w:r>
+      <w:r>
+        <w:rPr>
+          <w:rFonts w:cs="Arial"/>
+          <w:sz w:val="20"/>
+          <w:szCs w:val="20"/>
+          <w:rtl/>
+        </w:rPr>
+        <w:t xml:space="preserve"> دارم </w:t>
+      </w:r>
+    </w:p>
+    <w:p>
+      <w:pPr>
+        <w:bidi/>
+        <w:rPr>
+          <w:sz w:val="20"/>
+          <w:szCs w:val="20"/>
+        </w:rPr>
+      </w:pPr>
+      <w:r>
+        <w:rPr>
+          <w:rFonts w:cs="Arial" w:hint="eastAsia"/>
+          <w:sz w:val="20"/>
+          <w:szCs w:val="20"/>
+          <w:rtl/>
+        </w:rPr>
+        <w:t>در</w:t>
+      </w:r>
+      <w:r>
+        <w:rPr>
+          <w:rFonts w:cs="Arial"/>
+          <w:sz w:val="20"/>
+          <w:szCs w:val="20"/>
+          <w:rtl/>
+        </w:rPr>
+        <w:t xml:space="preserve"> مورد تعامد رابرتز موارد ز</w:t>
+      </w:r>
+      <w:r>
+        <w:rPr>
+          <w:rFonts w:cs="Arial" w:hint="cs"/>
+          <w:sz w:val="20"/>
+          <w:szCs w:val="20"/>
+          <w:rtl/>
+        </w:rPr>
+        <w:t>ی</w:t>
+      </w:r>
+      <w:r>
+        <w:rPr>
+          <w:rFonts w:cs="Arial" w:hint="eastAsia"/>
+          <w:sz w:val="20"/>
+          <w:szCs w:val="20"/>
+          <w:rtl/>
+        </w:rPr>
+        <w:t>ر</w:t>
+      </w:r>
+      <w:r>
+        <w:rPr>
+          <w:rFonts w:cs="Arial"/>
+          <w:sz w:val="20"/>
+          <w:szCs w:val="20"/>
+          <w:rtl/>
+        </w:rPr>
+        <w:t xml:space="preserve"> روو تمام پ</w:t>
+      </w:r>
+      <w:r>
+        <w:rPr>
+          <w:rFonts w:cs="Arial" w:hint="cs"/>
+          <w:sz w:val="20"/>
+          <w:szCs w:val="20"/>
+          <w:rtl/>
+        </w:rPr>
+        <w:t>ی</w:t>
+      </w:r>
+      <w:r>
+        <w:rPr>
+          <w:rFonts w:cs="Arial" w:hint="eastAsia"/>
+          <w:sz w:val="20"/>
+          <w:szCs w:val="20"/>
+          <w:rtl/>
+        </w:rPr>
+        <w:t>ش</w:t>
+      </w:r>
+      <w:r>
+        <w:rPr>
+          <w:rFonts w:cs="Arial"/>
+          <w:sz w:val="20"/>
+          <w:szCs w:val="20"/>
+          <w:rtl/>
+        </w:rPr>
+        <w:t xml:space="preserve"> ن</w:t>
+      </w:r>
+      <w:r>
+        <w:rPr>
+          <w:rFonts w:cs="Arial" w:hint="cs"/>
+          <w:sz w:val="20"/>
+          <w:szCs w:val="20"/>
+          <w:rtl/>
+        </w:rPr>
+        <w:t>ی</w:t>
+      </w:r>
+      <w:r>
+        <w:rPr>
+          <w:rFonts w:cs="Arial" w:hint="eastAsia"/>
+          <w:sz w:val="20"/>
+          <w:szCs w:val="20"/>
+          <w:rtl/>
+        </w:rPr>
+        <w:t>از</w:t>
+      </w:r>
+      <w:r>
+        <w:rPr>
+          <w:rFonts w:cs="Arial"/>
+          <w:sz w:val="20"/>
+          <w:szCs w:val="20"/>
+          <w:rtl/>
+        </w:rPr>
+        <w:t xml:space="preserve"> ها</w:t>
+      </w:r>
+      <w:r>
+        <w:rPr>
+          <w:rFonts w:cs="Arial" w:hint="cs"/>
+          <w:sz w:val="20"/>
+          <w:szCs w:val="20"/>
+          <w:rtl/>
+        </w:rPr>
+        <w:t>یی</w:t>
+      </w:r>
+      <w:r>
+        <w:rPr>
+          <w:rFonts w:cs="Arial"/>
+          <w:sz w:val="20"/>
+          <w:szCs w:val="20"/>
+          <w:rtl/>
+        </w:rPr>
+        <w:t xml:space="preserve"> که لازم بوده رو گفتم : </w:t>
+      </w:r>
+    </w:p>
+    <w:p>
+      <w:pPr>
+        <w:bidi/>
+        <w:rPr>
+          <w:sz w:val="20"/>
+          <w:szCs w:val="20"/>
+        </w:rPr>
+      </w:pPr>
+      <w:r>
+        <w:rPr>
+          <w:rFonts w:cs="Arial" w:hint="eastAsia"/>
+          <w:sz w:val="20"/>
+          <w:szCs w:val="20"/>
+          <w:rtl/>
+        </w:rPr>
+        <w:t>تعر</w:t>
+      </w:r>
+      <w:r>
+        <w:rPr>
+          <w:rFonts w:cs="Arial" w:hint="cs"/>
+          <w:sz w:val="20"/>
+          <w:szCs w:val="20"/>
+          <w:rtl/>
+        </w:rPr>
+        <w:t>ی</w:t>
+      </w:r>
+      <w:r>
+        <w:rPr>
+          <w:rFonts w:cs="Arial" w:hint="eastAsia"/>
+          <w:sz w:val="20"/>
+          <w:szCs w:val="20"/>
+          <w:rtl/>
+        </w:rPr>
+        <w:t>ف</w:t>
+      </w:r>
+      <w:r>
+        <w:rPr>
+          <w:rFonts w:cs="Arial"/>
+          <w:sz w:val="20"/>
+          <w:szCs w:val="20"/>
+          <w:rtl/>
+        </w:rPr>
+        <w:t xml:space="preserve"> تعامد رابرتز </w:t>
+      </w:r>
+    </w:p>
+    <w:p>
+      <w:pPr>
+        <w:bidi/>
+        <w:rPr>
+          <w:sz w:val="20"/>
+          <w:szCs w:val="20"/>
+        </w:rPr>
+      </w:pPr>
+      <w:r>
+        <w:rPr>
+          <w:rFonts w:cs="Arial" w:hint="eastAsia"/>
+          <w:sz w:val="20"/>
+          <w:szCs w:val="20"/>
+          <w:rtl/>
+        </w:rPr>
+        <w:t>توض</w:t>
+      </w:r>
+      <w:r>
+        <w:rPr>
+          <w:rFonts w:cs="Arial" w:hint="cs"/>
+          <w:sz w:val="20"/>
+          <w:szCs w:val="20"/>
+          <w:rtl/>
+        </w:rPr>
+        <w:t>ی</w:t>
+      </w:r>
+      <w:r>
+        <w:rPr>
+          <w:rFonts w:cs="Arial" w:hint="eastAsia"/>
+          <w:sz w:val="20"/>
+          <w:szCs w:val="20"/>
+          <w:rtl/>
+        </w:rPr>
+        <w:t>ح</w:t>
+      </w:r>
+      <w:r>
+        <w:rPr>
+          <w:rFonts w:cs="Arial"/>
+          <w:sz w:val="20"/>
+          <w:szCs w:val="20"/>
+          <w:rtl/>
+        </w:rPr>
+        <w:t xml:space="preserve"> شهود</w:t>
+      </w:r>
+      <w:r>
+        <w:rPr>
+          <w:rFonts w:cs="Arial" w:hint="cs"/>
+          <w:sz w:val="20"/>
+          <w:szCs w:val="20"/>
+          <w:rtl/>
+        </w:rPr>
+        <w:t>ی</w:t>
+      </w:r>
+      <w:r>
+        <w:rPr>
+          <w:rFonts w:cs="Arial"/>
+          <w:sz w:val="20"/>
+          <w:szCs w:val="20"/>
+          <w:rtl/>
+        </w:rPr>
+        <w:t xml:space="preserve"> از رو</w:t>
+      </w:r>
+      <w:r>
+        <w:rPr>
+          <w:rFonts w:cs="Arial" w:hint="cs"/>
+          <w:sz w:val="20"/>
+          <w:szCs w:val="20"/>
+          <w:rtl/>
+        </w:rPr>
+        <w:t>ی</w:t>
+      </w:r>
+      <w:r>
+        <w:rPr>
+          <w:rFonts w:cs="Arial"/>
+          <w:sz w:val="20"/>
+          <w:szCs w:val="20"/>
+          <w:rtl/>
+        </w:rPr>
+        <w:t xml:space="preserve"> شکل</w:t>
+      </w:r>
+    </w:p>
+    <w:p>
+      <w:pPr>
+        <w:bidi/>
+        <w:rPr>
+          <w:sz w:val="20"/>
+          <w:szCs w:val="20"/>
+        </w:rPr>
+      </w:pPr>
+      <w:r>
+        <w:rPr>
+          <w:rFonts w:cs="Arial" w:hint="eastAsia"/>
+          <w:sz w:val="20"/>
+          <w:szCs w:val="20"/>
+          <w:rtl/>
+        </w:rPr>
+        <w:t>بررس</w:t>
+      </w:r>
+      <w:r>
+        <w:rPr>
+          <w:rFonts w:cs="Arial" w:hint="cs"/>
+          <w:sz w:val="20"/>
+          <w:szCs w:val="20"/>
+          <w:rtl/>
+        </w:rPr>
+        <w:t>ی</w:t>
+      </w:r>
+      <w:r>
+        <w:rPr>
+          <w:rFonts w:cs="Arial"/>
+          <w:sz w:val="20"/>
+          <w:szCs w:val="20"/>
+          <w:rtl/>
+        </w:rPr>
+        <w:t xml:space="preserve"> چهار و</w:t>
+      </w:r>
+      <w:r>
+        <w:rPr>
+          <w:rFonts w:cs="Arial" w:hint="cs"/>
+          <w:sz w:val="20"/>
+          <w:szCs w:val="20"/>
+          <w:rtl/>
+        </w:rPr>
+        <w:t>ی</w:t>
+      </w:r>
+      <w:r>
+        <w:rPr>
+          <w:rFonts w:cs="Arial" w:hint="eastAsia"/>
+          <w:sz w:val="20"/>
+          <w:szCs w:val="20"/>
+          <w:rtl/>
+        </w:rPr>
+        <w:t>ژگ</w:t>
+      </w:r>
+      <w:r>
+        <w:rPr>
+          <w:rFonts w:cs="Arial" w:hint="cs"/>
+          <w:sz w:val="20"/>
+          <w:szCs w:val="20"/>
+          <w:rtl/>
+        </w:rPr>
+        <w:t>ی</w:t>
+      </w:r>
+      <w:r>
+        <w:rPr>
+          <w:rFonts w:cs="Arial"/>
+          <w:sz w:val="20"/>
+          <w:szCs w:val="20"/>
+          <w:rtl/>
+        </w:rPr>
+        <w:t xml:space="preserve"> (</w:t>
+      </w:r>
+      <w:r>
+        <w:rPr>
+          <w:sz w:val="20"/>
+          <w:szCs w:val="20"/>
+        </w:rPr>
+        <w:t>symmetry , homogeneity , additivity , scaler existence</w:t>
+      </w:r>
+      <w:r>
+        <w:rPr>
+          <w:rFonts w:cs="Arial"/>
+          <w:sz w:val="20"/>
+          <w:szCs w:val="20"/>
+          <w:rtl/>
+        </w:rPr>
+        <w:t xml:space="preserve">) به همراه اثبات و </w:t>
+      </w:r>
+      <w:r>
+        <w:rPr>
+          <w:rFonts w:cs="Arial" w:hint="cs"/>
+          <w:sz w:val="20"/>
+          <w:szCs w:val="20"/>
+          <w:rtl/>
+        </w:rPr>
+        <w:t>ی</w:t>
+      </w:r>
+      <w:r>
+        <w:rPr>
+          <w:rFonts w:cs="Arial" w:hint="eastAsia"/>
+          <w:sz w:val="20"/>
+          <w:szCs w:val="20"/>
+          <w:rtl/>
+        </w:rPr>
+        <w:t>ا</w:t>
+      </w:r>
+      <w:r>
+        <w:rPr>
+          <w:rFonts w:cs="Arial"/>
+          <w:sz w:val="20"/>
+          <w:szCs w:val="20"/>
+          <w:rtl/>
+        </w:rPr>
+        <w:t xml:space="preserve"> مثال نقض </w:t>
+      </w:r>
+    </w:p>
+    <w:p>
+      <w:pPr>
+        <w:bidi/>
+        <w:rPr>
+          <w:sz w:val="20"/>
+          <w:szCs w:val="20"/>
+        </w:rPr>
+      </w:pPr>
+    </w:p>
+    <w:p>
+      <w:pPr>
+        <w:bidi/>
+        <w:rPr>
+          <w:sz w:val="20"/>
+          <w:szCs w:val="20"/>
+        </w:rPr>
+      </w:pPr>
+      <w:r>
+        <w:rPr>
+          <w:rFonts w:cs="Arial" w:hint="eastAsia"/>
+          <w:sz w:val="20"/>
+          <w:szCs w:val="20"/>
+          <w:rtl/>
+        </w:rPr>
+        <w:t>چ</w:t>
+      </w:r>
+      <w:r>
+        <w:rPr>
+          <w:rFonts w:cs="Arial" w:hint="cs"/>
+          <w:sz w:val="20"/>
+          <w:szCs w:val="20"/>
+          <w:rtl/>
+        </w:rPr>
+        <w:t>ی</w:t>
+      </w:r>
+      <w:r>
+        <w:rPr>
+          <w:rFonts w:cs="Arial" w:hint="eastAsia"/>
+          <w:sz w:val="20"/>
+          <w:szCs w:val="20"/>
+          <w:rtl/>
+        </w:rPr>
+        <w:t>ز</w:t>
+      </w:r>
+      <w:r>
+        <w:rPr>
+          <w:rFonts w:cs="Arial" w:hint="cs"/>
+          <w:sz w:val="20"/>
+          <w:szCs w:val="20"/>
+          <w:rtl/>
+        </w:rPr>
+        <w:t>ی</w:t>
+      </w:r>
+      <w:r>
+        <w:rPr>
+          <w:rFonts w:cs="Arial"/>
+          <w:sz w:val="20"/>
+          <w:szCs w:val="20"/>
+          <w:rtl/>
+        </w:rPr>
+        <w:t xml:space="preserve"> که از تو م</w:t>
+      </w:r>
+      <w:r>
+        <w:rPr>
+          <w:rFonts w:cs="Arial" w:hint="cs"/>
+          <w:sz w:val="20"/>
+          <w:szCs w:val="20"/>
+          <w:rtl/>
+        </w:rPr>
+        <w:t>ی</w:t>
+      </w:r>
+      <w:r>
+        <w:rPr>
+          <w:rFonts w:cs="Arial" w:hint="eastAsia"/>
+          <w:sz w:val="20"/>
+          <w:szCs w:val="20"/>
+          <w:rtl/>
+        </w:rPr>
+        <w:t>خوام</w:t>
+      </w:r>
+      <w:r>
+        <w:rPr>
+          <w:rFonts w:cs="Arial"/>
+          <w:sz w:val="20"/>
+          <w:szCs w:val="20"/>
+          <w:rtl/>
+        </w:rPr>
+        <w:t xml:space="preserve"> ا</w:t>
+      </w:r>
+      <w:r>
+        <w:rPr>
+          <w:rFonts w:cs="Arial" w:hint="cs"/>
+          <w:sz w:val="20"/>
+          <w:szCs w:val="20"/>
+          <w:rtl/>
+        </w:rPr>
+        <w:t>ی</w:t>
+      </w:r>
+      <w:r>
+        <w:rPr>
+          <w:rFonts w:cs="Arial" w:hint="eastAsia"/>
+          <w:sz w:val="20"/>
+          <w:szCs w:val="20"/>
+          <w:rtl/>
+        </w:rPr>
+        <w:t>ن</w:t>
+      </w:r>
+      <w:r>
+        <w:rPr>
+          <w:rFonts w:cs="Arial"/>
+          <w:sz w:val="20"/>
+          <w:szCs w:val="20"/>
+          <w:rtl/>
+        </w:rPr>
+        <w:t xml:space="preserve"> هست که دو مطلب جالب در مورد تعامد رابرتز به من بگ</w:t>
+      </w:r>
+      <w:r>
+        <w:rPr>
+          <w:rFonts w:cs="Arial" w:hint="cs"/>
+          <w:sz w:val="20"/>
+          <w:szCs w:val="20"/>
+          <w:rtl/>
+        </w:rPr>
+        <w:t>ی</w:t>
+      </w:r>
+      <w:r>
+        <w:rPr>
+          <w:rFonts w:cs="Arial"/>
+          <w:sz w:val="20"/>
+          <w:szCs w:val="20"/>
+          <w:rtl/>
+        </w:rPr>
+        <w:t xml:space="preserve"> با تمام توض</w:t>
+      </w:r>
+      <w:r>
+        <w:rPr>
+          <w:rFonts w:cs="Arial" w:hint="cs"/>
+          <w:sz w:val="20"/>
+          <w:szCs w:val="20"/>
+          <w:rtl/>
+        </w:rPr>
+        <w:t>ی</w:t>
+      </w:r>
+      <w:r>
+        <w:rPr>
+          <w:rFonts w:cs="Arial" w:hint="eastAsia"/>
+          <w:sz w:val="20"/>
+          <w:szCs w:val="20"/>
+          <w:rtl/>
+        </w:rPr>
+        <w:t>حات</w:t>
+      </w:r>
+      <w:r>
+        <w:rPr>
+          <w:rFonts w:cs="Arial"/>
+          <w:sz w:val="20"/>
+          <w:szCs w:val="20"/>
+          <w:rtl/>
+        </w:rPr>
+        <w:t xml:space="preserve"> و جز</w:t>
+      </w:r>
+      <w:r>
+        <w:rPr>
+          <w:rFonts w:cs="Arial" w:hint="cs"/>
+          <w:sz w:val="20"/>
+          <w:szCs w:val="20"/>
+          <w:rtl/>
+        </w:rPr>
+        <w:t>یی</w:t>
+      </w:r>
+      <w:r>
+        <w:rPr>
+          <w:rFonts w:cs="Arial" w:hint="eastAsia"/>
+          <w:sz w:val="20"/>
+          <w:szCs w:val="20"/>
+          <w:rtl/>
+        </w:rPr>
+        <w:t>ات</w:t>
+      </w:r>
+      <w:r>
+        <w:rPr>
+          <w:rFonts w:cs="Arial"/>
+          <w:sz w:val="20"/>
+          <w:szCs w:val="20"/>
+          <w:rtl/>
+        </w:rPr>
+        <w:t xml:space="preserve"> مورد ن</w:t>
+      </w:r>
+      <w:r>
+        <w:rPr>
+          <w:rFonts w:cs="Arial" w:hint="cs"/>
+          <w:sz w:val="20"/>
+          <w:szCs w:val="20"/>
+          <w:rtl/>
+        </w:rPr>
+        <w:t>ی</w:t>
+      </w:r>
+      <w:r>
+        <w:rPr>
+          <w:rFonts w:cs="Arial" w:hint="eastAsia"/>
+          <w:sz w:val="20"/>
+          <w:szCs w:val="20"/>
+          <w:rtl/>
+        </w:rPr>
+        <w:t>از</w:t>
+      </w:r>
+      <w:r>
+        <w:rPr>
+          <w:rFonts w:cs="Arial"/>
+          <w:sz w:val="20"/>
+          <w:szCs w:val="20"/>
+          <w:rtl/>
+        </w:rPr>
+        <w:t xml:space="preserve"> که بتونم در و</w:t>
+      </w:r>
+      <w:r>
+        <w:rPr>
+          <w:rFonts w:cs="Arial" w:hint="cs"/>
+          <w:sz w:val="20"/>
+          <w:szCs w:val="20"/>
+          <w:rtl/>
+        </w:rPr>
+        <w:t>ی</w:t>
+      </w:r>
+      <w:r>
+        <w:rPr>
+          <w:rFonts w:cs="Arial" w:hint="eastAsia"/>
+          <w:sz w:val="20"/>
+          <w:szCs w:val="20"/>
+          <w:rtl/>
+        </w:rPr>
+        <w:t>د</w:t>
+      </w:r>
+      <w:r>
+        <w:rPr>
+          <w:rFonts w:cs="Arial" w:hint="cs"/>
+          <w:sz w:val="20"/>
+          <w:szCs w:val="20"/>
+          <w:rtl/>
+        </w:rPr>
+        <w:t>ی</w:t>
+      </w:r>
+      <w:r>
+        <w:rPr>
+          <w:rFonts w:cs="Arial" w:hint="eastAsia"/>
+          <w:sz w:val="20"/>
+          <w:szCs w:val="20"/>
+          <w:rtl/>
+        </w:rPr>
+        <w:t>و</w:t>
+      </w:r>
+      <w:r>
+        <w:rPr>
+          <w:rFonts w:cs="Arial"/>
+          <w:sz w:val="20"/>
+          <w:szCs w:val="20"/>
+          <w:rtl/>
+        </w:rPr>
+        <w:t xml:space="preserve"> اضافه کنم </w:t>
+      </w:r>
+    </w:p>
+    <w:p>
+      <w:pPr>
+        <w:bidi/>
+        <w:rPr>
+          <w:sz w:val="20"/>
+          <w:szCs w:val="20"/>
+        </w:rPr>
+      </w:pPr>
+      <w:r>
+        <w:rPr>
+          <w:rFonts w:cs="Arial" w:hint="eastAsia"/>
+          <w:sz w:val="20"/>
+          <w:szCs w:val="20"/>
+          <w:rtl/>
+        </w:rPr>
+        <w:t>مطالب</w:t>
+      </w:r>
+      <w:r>
+        <w:rPr>
+          <w:rFonts w:cs="Arial"/>
+          <w:sz w:val="20"/>
+          <w:szCs w:val="20"/>
+          <w:rtl/>
+        </w:rPr>
+        <w:t xml:space="preserve"> با</w:t>
+      </w:r>
+      <w:r>
+        <w:rPr>
+          <w:rFonts w:cs="Arial" w:hint="cs"/>
+          <w:sz w:val="20"/>
+          <w:szCs w:val="20"/>
+          <w:rtl/>
+        </w:rPr>
+        <w:t>ی</w:t>
+      </w:r>
+      <w:r>
+        <w:rPr>
+          <w:rFonts w:cs="Arial" w:hint="eastAsia"/>
+          <w:sz w:val="20"/>
+          <w:szCs w:val="20"/>
+          <w:rtl/>
+        </w:rPr>
+        <w:t>د</w:t>
+      </w:r>
+      <w:r>
+        <w:rPr>
+          <w:rFonts w:cs="Arial"/>
+          <w:sz w:val="20"/>
+          <w:szCs w:val="20"/>
+          <w:rtl/>
+        </w:rPr>
+        <w:t xml:space="preserve"> مرتبط با تعامد و در ح</w:t>
+      </w:r>
+      <w:r>
+        <w:rPr>
+          <w:rFonts w:cs="Arial" w:hint="cs"/>
+          <w:sz w:val="20"/>
+          <w:szCs w:val="20"/>
+          <w:rtl/>
+        </w:rPr>
+        <w:t>ی</w:t>
+      </w:r>
+      <w:r>
+        <w:rPr>
+          <w:rFonts w:cs="Arial" w:hint="eastAsia"/>
+          <w:sz w:val="20"/>
+          <w:szCs w:val="20"/>
+          <w:rtl/>
+        </w:rPr>
+        <w:t>طه</w:t>
+      </w:r>
+      <w:r>
+        <w:rPr>
+          <w:rFonts w:cs="Arial"/>
+          <w:sz w:val="20"/>
+          <w:szCs w:val="20"/>
+          <w:rtl/>
+        </w:rPr>
+        <w:t xml:space="preserve"> </w:t>
+      </w:r>
+      <w:r>
+        <w:rPr>
+          <w:rFonts w:cs="Arial" w:hint="cs"/>
+          <w:sz w:val="20"/>
+          <w:szCs w:val="20"/>
+          <w:rtl/>
+        </w:rPr>
+        <w:t>ی</w:t>
+      </w:r>
+      <w:r>
+        <w:rPr>
+          <w:rFonts w:cs="Arial"/>
+          <w:sz w:val="20"/>
+          <w:szCs w:val="20"/>
+          <w:rtl/>
+        </w:rPr>
+        <w:t xml:space="preserve"> ر</w:t>
+      </w:r>
+      <w:r>
+        <w:rPr>
+          <w:rFonts w:cs="Arial" w:hint="cs"/>
+          <w:sz w:val="20"/>
+          <w:szCs w:val="20"/>
+          <w:rtl/>
+        </w:rPr>
+        <w:t>ی</w:t>
+      </w:r>
+      <w:r>
+        <w:rPr>
+          <w:rFonts w:cs="Arial" w:hint="eastAsia"/>
+          <w:sz w:val="20"/>
+          <w:szCs w:val="20"/>
+          <w:rtl/>
+        </w:rPr>
+        <w:t>اض</w:t>
+      </w:r>
+      <w:r>
+        <w:rPr>
+          <w:rFonts w:cs="Arial" w:hint="cs"/>
+          <w:sz w:val="20"/>
+          <w:szCs w:val="20"/>
+          <w:rtl/>
+        </w:rPr>
+        <w:t>ی</w:t>
+      </w:r>
+      <w:r>
+        <w:rPr>
+          <w:rFonts w:cs="Arial"/>
+          <w:sz w:val="20"/>
+          <w:szCs w:val="20"/>
+          <w:rtl/>
+        </w:rPr>
+        <w:t xml:space="preserve"> و علوم کامپ</w:t>
+      </w:r>
+      <w:r>
+        <w:rPr>
+          <w:rFonts w:cs="Arial" w:hint="cs"/>
+          <w:sz w:val="20"/>
+          <w:szCs w:val="20"/>
+          <w:rtl/>
+        </w:rPr>
+        <w:t>ی</w:t>
+      </w:r>
+      <w:r>
+        <w:rPr>
+          <w:rFonts w:cs="Arial" w:hint="eastAsia"/>
+          <w:sz w:val="20"/>
+          <w:szCs w:val="20"/>
+          <w:rtl/>
+        </w:rPr>
+        <w:t>وتر</w:t>
+      </w:r>
+      <w:r>
+        <w:rPr>
+          <w:rFonts w:cs="Arial"/>
+          <w:sz w:val="20"/>
+          <w:szCs w:val="20"/>
+          <w:rtl/>
+        </w:rPr>
+        <w:t xml:space="preserve"> باشد و نبا</w:t>
+      </w:r>
+      <w:r>
+        <w:rPr>
+          <w:rFonts w:cs="Arial" w:hint="cs"/>
+          <w:sz w:val="20"/>
+          <w:szCs w:val="20"/>
+          <w:rtl/>
+        </w:rPr>
+        <w:t>ی</w:t>
+      </w:r>
+      <w:r>
+        <w:rPr>
+          <w:rFonts w:cs="Arial" w:hint="eastAsia"/>
+          <w:sz w:val="20"/>
+          <w:szCs w:val="20"/>
+          <w:rtl/>
+        </w:rPr>
+        <w:t>د</w:t>
+      </w:r>
+      <w:r>
+        <w:rPr>
+          <w:rFonts w:cs="Arial"/>
+          <w:sz w:val="20"/>
+          <w:szCs w:val="20"/>
+          <w:rtl/>
+        </w:rPr>
+        <w:t xml:space="preserve"> به ارتباط ا</w:t>
+      </w:r>
+      <w:r>
+        <w:rPr>
+          <w:rFonts w:cs="Arial" w:hint="cs"/>
+          <w:sz w:val="20"/>
+          <w:szCs w:val="20"/>
+          <w:rtl/>
+        </w:rPr>
+        <w:t>ی</w:t>
+      </w:r>
+      <w:r>
+        <w:rPr>
+          <w:rFonts w:cs="Arial" w:hint="eastAsia"/>
+          <w:sz w:val="20"/>
+          <w:szCs w:val="20"/>
+          <w:rtl/>
+        </w:rPr>
+        <w:t>ن</w:t>
+      </w:r>
+      <w:r>
+        <w:rPr>
+          <w:rFonts w:cs="Arial"/>
+          <w:sz w:val="20"/>
+          <w:szCs w:val="20"/>
+          <w:rtl/>
+        </w:rPr>
+        <w:t xml:space="preserve"> تعامد با سا</w:t>
+      </w:r>
+      <w:r>
+        <w:rPr>
+          <w:rFonts w:cs="Arial" w:hint="cs"/>
+          <w:sz w:val="20"/>
+          <w:szCs w:val="20"/>
+          <w:rtl/>
+        </w:rPr>
+        <w:t>ی</w:t>
+      </w:r>
+      <w:r>
+        <w:rPr>
+          <w:rFonts w:cs="Arial" w:hint="eastAsia"/>
+          <w:sz w:val="20"/>
+          <w:szCs w:val="20"/>
+          <w:rtl/>
+        </w:rPr>
+        <w:t>ر</w:t>
+      </w:r>
+      <w:r>
+        <w:rPr>
+          <w:rFonts w:cs="Arial"/>
+          <w:sz w:val="20"/>
+          <w:szCs w:val="20"/>
+          <w:rtl/>
+        </w:rPr>
+        <w:t xml:space="preserve"> تعامد ها مرتبط باشد ا</w:t>
+      </w:r>
+      <w:r>
+        <w:rPr>
+          <w:rFonts w:cs="Arial" w:hint="cs"/>
+          <w:sz w:val="20"/>
+          <w:szCs w:val="20"/>
+          <w:rtl/>
+        </w:rPr>
+        <w:t>ی</w:t>
+      </w:r>
+      <w:r>
+        <w:rPr>
+          <w:rFonts w:cs="Arial" w:hint="eastAsia"/>
+          <w:sz w:val="20"/>
+          <w:szCs w:val="20"/>
+          <w:rtl/>
+        </w:rPr>
+        <w:t>ن</w:t>
+      </w:r>
+      <w:r>
+        <w:rPr>
+          <w:rFonts w:cs="Arial"/>
+          <w:sz w:val="20"/>
+          <w:szCs w:val="20"/>
+          <w:rtl/>
+        </w:rPr>
+        <w:t xml:space="preserve"> مورد به طور جداگانه بررس</w:t>
+      </w:r>
+      <w:r>
+        <w:rPr>
+          <w:rFonts w:cs="Arial" w:hint="cs"/>
+          <w:sz w:val="20"/>
+          <w:szCs w:val="20"/>
+          <w:rtl/>
+        </w:rPr>
+        <w:t>ی</w:t>
+      </w:r>
+      <w:r>
+        <w:rPr>
+          <w:rFonts w:cs="Arial"/>
+          <w:sz w:val="20"/>
+          <w:szCs w:val="20"/>
+          <w:rtl/>
+        </w:rPr>
+        <w:t xml:space="preserve"> م</w:t>
+      </w:r>
+      <w:r>
+        <w:rPr>
+          <w:rFonts w:cs="Arial" w:hint="cs"/>
+          <w:sz w:val="20"/>
+          <w:szCs w:val="20"/>
+          <w:rtl/>
+        </w:rPr>
+        <w:t>ی</w:t>
+      </w:r>
+      <w:r>
+        <w:rPr>
+          <w:rFonts w:cs="Arial" w:hint="eastAsia"/>
+          <w:sz w:val="20"/>
+          <w:szCs w:val="20"/>
+          <w:rtl/>
+        </w:rPr>
+        <w:t>شود</w:t>
+      </w:r>
+    </w:p>
+    <w:p>
+      <w:pPr>
+        <w:bidi/>
+        <w:rPr>
+          <w:sz w:val="20"/>
+          <w:szCs w:val="20"/>
+        </w:rPr>
+      </w:pPr>
+      <w:r>
+        <w:rPr>
+          <w:rFonts w:cs="Arial" w:hint="eastAsia"/>
+          <w:sz w:val="20"/>
+          <w:szCs w:val="20"/>
+          <w:rtl/>
+        </w:rPr>
+        <w:t>مثلا</w:t>
+      </w:r>
+      <w:r>
+        <w:rPr>
+          <w:rFonts w:cs="Arial"/>
+          <w:sz w:val="20"/>
+          <w:szCs w:val="20"/>
+          <w:rtl/>
+        </w:rPr>
+        <w:t xml:space="preserve"> م</w:t>
+      </w:r>
+      <w:r>
+        <w:rPr>
+          <w:rFonts w:cs="Arial" w:hint="cs"/>
+          <w:sz w:val="20"/>
+          <w:szCs w:val="20"/>
+          <w:rtl/>
+        </w:rPr>
+        <w:t>ی</w:t>
+      </w:r>
+      <w:r>
+        <w:rPr>
+          <w:rFonts w:cs="Arial" w:hint="eastAsia"/>
+          <w:sz w:val="20"/>
+          <w:szCs w:val="20"/>
+          <w:rtl/>
+        </w:rPr>
+        <w:t>تون</w:t>
+      </w:r>
+      <w:r>
+        <w:rPr>
+          <w:rFonts w:cs="Arial" w:hint="cs"/>
+          <w:sz w:val="20"/>
+          <w:szCs w:val="20"/>
+          <w:rtl/>
+        </w:rPr>
+        <w:t>ی</w:t>
+      </w:r>
+      <w:r>
+        <w:rPr>
+          <w:rFonts w:cs="Arial"/>
+          <w:sz w:val="20"/>
+          <w:szCs w:val="20"/>
+          <w:rtl/>
+        </w:rPr>
+        <w:t xml:space="preserve"> و</w:t>
+      </w:r>
+      <w:r>
+        <w:rPr>
+          <w:rFonts w:cs="Arial" w:hint="cs"/>
+          <w:sz w:val="20"/>
+          <w:szCs w:val="20"/>
+          <w:rtl/>
+        </w:rPr>
+        <w:t>ی</w:t>
+      </w:r>
+      <w:r>
+        <w:rPr>
+          <w:rFonts w:cs="Arial" w:hint="eastAsia"/>
+          <w:sz w:val="20"/>
+          <w:szCs w:val="20"/>
+          <w:rtl/>
+        </w:rPr>
+        <w:t>ژگ</w:t>
+      </w:r>
+      <w:r>
+        <w:rPr>
+          <w:rFonts w:cs="Arial" w:hint="cs"/>
+          <w:sz w:val="20"/>
+          <w:szCs w:val="20"/>
+          <w:rtl/>
+        </w:rPr>
+        <w:t>ی</w:t>
+      </w:r>
+      <w:r>
+        <w:rPr>
+          <w:rFonts w:cs="Arial"/>
+          <w:sz w:val="20"/>
+          <w:szCs w:val="20"/>
+          <w:rtl/>
+        </w:rPr>
+        <w:t xml:space="preserve"> جالب</w:t>
+      </w:r>
+      <w:r>
+        <w:rPr>
+          <w:rFonts w:cs="Arial" w:hint="cs"/>
+          <w:sz w:val="20"/>
+          <w:szCs w:val="20"/>
+          <w:rtl/>
+        </w:rPr>
+        <w:t>ی</w:t>
+      </w:r>
+      <w:r>
+        <w:rPr>
+          <w:rFonts w:cs="Arial"/>
+          <w:sz w:val="20"/>
+          <w:szCs w:val="20"/>
+          <w:rtl/>
+        </w:rPr>
+        <w:t xml:space="preserve"> که دارد رو بگ</w:t>
+      </w:r>
+      <w:r>
+        <w:rPr>
+          <w:rFonts w:cs="Arial" w:hint="cs"/>
+          <w:sz w:val="20"/>
+          <w:szCs w:val="20"/>
+          <w:rtl/>
+        </w:rPr>
+        <w:t>ی</w:t>
+      </w:r>
+      <w:r>
+        <w:rPr>
+          <w:rFonts w:cs="Arial"/>
+          <w:sz w:val="20"/>
+          <w:szCs w:val="20"/>
+          <w:rtl/>
+        </w:rPr>
+        <w:t xml:space="preserve"> </w:t>
+      </w:r>
+      <w:r>
+        <w:rPr>
+          <w:rFonts w:cs="Arial" w:hint="cs"/>
+          <w:sz w:val="20"/>
+          <w:szCs w:val="20"/>
+          <w:rtl/>
+        </w:rPr>
+        <w:t>ی</w:t>
+      </w:r>
+      <w:r>
+        <w:rPr>
+          <w:rFonts w:cs="Arial" w:hint="eastAsia"/>
+          <w:sz w:val="20"/>
+          <w:szCs w:val="20"/>
+          <w:rtl/>
+        </w:rPr>
+        <w:t>ا</w:t>
+      </w:r>
+      <w:r>
+        <w:rPr>
+          <w:rFonts w:cs="Arial"/>
+          <w:sz w:val="20"/>
+          <w:szCs w:val="20"/>
+          <w:rtl/>
+        </w:rPr>
+        <w:t xml:space="preserve"> هر چ</w:t>
+      </w:r>
+      <w:r>
+        <w:rPr>
+          <w:rFonts w:cs="Arial" w:hint="cs"/>
+          <w:sz w:val="20"/>
+          <w:szCs w:val="20"/>
+          <w:rtl/>
+        </w:rPr>
+        <w:t>ی</w:t>
+      </w:r>
+      <w:r>
+        <w:rPr>
+          <w:rFonts w:cs="Arial" w:hint="eastAsia"/>
+          <w:sz w:val="20"/>
+          <w:szCs w:val="20"/>
+          <w:rtl/>
+        </w:rPr>
+        <w:t>ز</w:t>
+      </w:r>
+      <w:r>
+        <w:rPr>
+          <w:rFonts w:cs="Arial"/>
+          <w:sz w:val="20"/>
+          <w:szCs w:val="20"/>
+          <w:rtl/>
+        </w:rPr>
+        <w:t xml:space="preserve"> د</w:t>
+      </w:r>
+      <w:r>
+        <w:rPr>
+          <w:rFonts w:cs="Arial" w:hint="cs"/>
+          <w:sz w:val="20"/>
+          <w:szCs w:val="20"/>
+          <w:rtl/>
+        </w:rPr>
+        <w:t>ی</w:t>
+      </w:r>
+      <w:r>
+        <w:rPr>
+          <w:rFonts w:cs="Arial" w:hint="eastAsia"/>
+          <w:sz w:val="20"/>
+          <w:szCs w:val="20"/>
+          <w:rtl/>
+        </w:rPr>
+        <w:t>گر</w:t>
+      </w:r>
+      <w:r>
+        <w:rPr>
+          <w:rFonts w:cs="Arial" w:hint="cs"/>
+          <w:sz w:val="20"/>
+          <w:szCs w:val="20"/>
+          <w:rtl/>
+        </w:rPr>
+        <w:t>ی</w:t>
+      </w:r>
+      <w:r>
+        <w:rPr>
+          <w:rFonts w:cs="Arial"/>
+          <w:sz w:val="20"/>
+          <w:szCs w:val="20"/>
+          <w:rtl/>
+        </w:rPr>
+        <w:t xml:space="preserve"> که در شرا</w:t>
+      </w:r>
+      <w:r>
+        <w:rPr>
+          <w:rFonts w:cs="Arial" w:hint="cs"/>
+          <w:sz w:val="20"/>
+          <w:szCs w:val="20"/>
+          <w:rtl/>
+        </w:rPr>
+        <w:t>ی</w:t>
+      </w:r>
+      <w:r>
+        <w:rPr>
+          <w:rFonts w:cs="Arial" w:hint="eastAsia"/>
+          <w:sz w:val="20"/>
+          <w:szCs w:val="20"/>
+          <w:rtl/>
+        </w:rPr>
+        <w:t>ط</w:t>
+      </w:r>
+      <w:r>
+        <w:rPr>
+          <w:rFonts w:cs="Arial"/>
+          <w:sz w:val="20"/>
+          <w:szCs w:val="20"/>
+          <w:rtl/>
+        </w:rPr>
+        <w:t xml:space="preserve"> گفته شده صدق م</w:t>
+      </w:r>
+      <w:r>
+        <w:rPr>
+          <w:rFonts w:cs="Arial" w:hint="cs"/>
+          <w:sz w:val="20"/>
+          <w:szCs w:val="20"/>
+          <w:rtl/>
+        </w:rPr>
+        <w:t>ی</w:t>
+      </w:r>
+      <w:r>
+        <w:rPr>
+          <w:rFonts w:cs="Arial" w:hint="eastAsia"/>
+          <w:sz w:val="20"/>
+          <w:szCs w:val="20"/>
+          <w:rtl/>
+        </w:rPr>
+        <w:t>کند</w:t>
+      </w:r>
+    </w:p>
+    <w:p>
+      <w:pPr>
+        <w:bidi/>
+        <w:rPr>
+          <w:rFonts w:hint="cs"/>
+          <w:sz w:val="20"/>
+          <w:szCs w:val="20"/>
+          <w:lang w:bidi="fa-IR"/>
+        </w:rPr>
+      </w:pPr>
+      <w:r>
+        <w:rPr>
+          <w:rFonts w:cs="Arial" w:hint="eastAsia"/>
+          <w:sz w:val="20"/>
+          <w:szCs w:val="20"/>
+          <w:rtl/>
+        </w:rPr>
+        <w:t>در</w:t>
+      </w:r>
+      <w:r>
+        <w:rPr>
+          <w:rFonts w:cs="Arial"/>
+          <w:sz w:val="20"/>
+          <w:szCs w:val="20"/>
+          <w:rtl/>
+        </w:rPr>
+        <w:t xml:space="preserve"> نها</w:t>
+      </w:r>
+      <w:r>
+        <w:rPr>
+          <w:rFonts w:cs="Arial" w:hint="cs"/>
+          <w:sz w:val="20"/>
+          <w:szCs w:val="20"/>
+          <w:rtl/>
+        </w:rPr>
+        <w:t>ی</w:t>
+      </w:r>
+      <w:r>
+        <w:rPr>
+          <w:rFonts w:cs="Arial" w:hint="eastAsia"/>
+          <w:sz w:val="20"/>
+          <w:szCs w:val="20"/>
+          <w:rtl/>
+        </w:rPr>
+        <w:t>ت</w:t>
+      </w:r>
+      <w:r>
+        <w:rPr>
+          <w:rFonts w:cs="Arial"/>
+          <w:sz w:val="20"/>
+          <w:szCs w:val="20"/>
+          <w:rtl/>
+        </w:rPr>
+        <w:t xml:space="preserve"> </w:t>
+      </w:r>
+      <w:r>
+        <w:rPr>
+          <w:rFonts w:cs="Arial" w:hint="cs"/>
+          <w:sz w:val="20"/>
+          <w:szCs w:val="20"/>
+          <w:rtl/>
+        </w:rPr>
+        <w:t>ی</w:t>
+      </w:r>
+      <w:r>
+        <w:rPr>
+          <w:rFonts w:cs="Arial" w:hint="eastAsia"/>
+          <w:sz w:val="20"/>
+          <w:szCs w:val="20"/>
+          <w:rtl/>
+        </w:rPr>
+        <w:t>ک</w:t>
+      </w:r>
+      <w:r>
+        <w:rPr>
+          <w:rFonts w:cs="Arial"/>
+          <w:sz w:val="20"/>
+          <w:szCs w:val="20"/>
+          <w:rtl/>
+        </w:rPr>
+        <w:t xml:space="preserve"> کاربرد ه</w:t>
+      </w:r>
+      <w:r>
+        <w:rPr>
+          <w:rFonts w:cs="Arial" w:hint="cs"/>
+          <w:sz w:val="20"/>
+          <w:szCs w:val="20"/>
+          <w:rtl/>
+        </w:rPr>
+        <w:t>ی</w:t>
+      </w:r>
+      <w:r>
+        <w:rPr>
+          <w:rFonts w:cs="Arial" w:hint="eastAsia"/>
+          <w:sz w:val="20"/>
+          <w:szCs w:val="20"/>
+          <w:rtl/>
+        </w:rPr>
+        <w:t>جان</w:t>
+      </w:r>
+      <w:r>
+        <w:rPr>
+          <w:rFonts w:cs="Arial"/>
+          <w:sz w:val="20"/>
+          <w:szCs w:val="20"/>
+          <w:rtl/>
+        </w:rPr>
+        <w:t xml:space="preserve"> انگ</w:t>
+      </w:r>
+      <w:r>
+        <w:rPr>
+          <w:rFonts w:cs="Arial" w:hint="cs"/>
+          <w:sz w:val="20"/>
+          <w:szCs w:val="20"/>
+          <w:rtl/>
+        </w:rPr>
+        <w:t>ی</w:t>
+      </w:r>
+      <w:r>
+        <w:rPr>
+          <w:rFonts w:cs="Arial" w:hint="eastAsia"/>
+          <w:sz w:val="20"/>
+          <w:szCs w:val="20"/>
+          <w:rtl/>
+        </w:rPr>
+        <w:t>ز</w:t>
+      </w:r>
+      <w:r>
+        <w:rPr>
+          <w:rFonts w:cs="Arial"/>
+          <w:sz w:val="20"/>
+          <w:szCs w:val="20"/>
+          <w:rtl/>
+        </w:rPr>
+        <w:t xml:space="preserve"> و جالب از تعامد رابرتز در علوم کامپ</w:t>
+      </w:r>
+      <w:r>
+        <w:rPr>
+          <w:rFonts w:cs="Arial" w:hint="cs"/>
+          <w:sz w:val="20"/>
+          <w:szCs w:val="20"/>
+          <w:rtl/>
+        </w:rPr>
+        <w:t>ی</w:t>
+      </w:r>
+      <w:r>
+        <w:rPr>
+          <w:rFonts w:cs="Arial" w:hint="eastAsia"/>
+          <w:sz w:val="20"/>
+          <w:szCs w:val="20"/>
+          <w:rtl/>
+        </w:rPr>
+        <w:t>وتر</w:t>
+      </w:r>
+      <w:r>
+        <w:rPr>
+          <w:rFonts w:cs="Arial"/>
+          <w:sz w:val="20"/>
+          <w:szCs w:val="20"/>
+          <w:rtl/>
+        </w:rPr>
+        <w:t xml:space="preserve"> بگو</w:t>
+      </w:r>
     </w:p>
     <w:sectPr>
       <w:pgSz w:w="12240" w:h="15840"/>
@@ -41196,6 +42800,17 @@
     <w:rsid w:val="00063EE9"/>
     <w:rPr>
       <w:color w:val="666666"/>
+    </w:rPr>
+  </w:style>
+  <w:style w:type="paragraph" w:styleId="NormalWeb">
+    <w:name w:val="Normal (Web)"/>
+    <w:basedOn w:val="Normal"/>
+    <w:uiPriority w:val="99"/>
+    <w:semiHidden/>
+    <w:unhideWhenUsed/>
+    <w:rsid w:val="00403DF4"/>
+    <w:rPr>
+      <w:rFonts w:ascii="Times New Roman" w:hAnsi="Times New Roman" w:cs="Times New Roman"/>
     </w:rPr>
   </w:style>
 </w:styles>

</xml_diff>

<commit_message>
step 72 : add property
</commit_message>
<xml_diff>
--- a/notes/video-overview-notes.docx
+++ b/notes/video-overview-notes.docx
@@ -39680,10 +39680,2998 @@
       <w:pPr>
         <w:bidi/>
         <w:rPr>
-          <w:rFonts w:hint="cs"/>
-          <w:sz w:val="20"/>
-          <w:szCs w:val="20"/>
-          <w:lang w:bidi="fa-IR"/>
+          <w:b/>
+          <w:bCs/>
+          <w:sz w:val="20"/>
+          <w:szCs w:val="20"/>
+          <w:lang w:bidi="fa-IR"/>
+        </w:rPr>
+      </w:pPr>
+      <w:r>
+        <w:rPr>
+          <w:b/>
+          <w:bCs/>
+          <w:sz w:val="20"/>
+          <w:szCs w:val="20"/>
+          <w:rtl/>
+        </w:rPr>
+        <w:t xml:space="preserve">گزینه </w:t>
+      </w:r>
+      <w:r>
+        <w:rPr>
+          <w:b/>
+          <w:bCs/>
+          <w:sz w:val="20"/>
+          <w:szCs w:val="20"/>
+          <w:rtl/>
+          <w:lang w:bidi="fa-IR"/>
+        </w:rPr>
+        <w:t xml:space="preserve">۲: </w:t>
+      </w:r>
+      <w:r>
+        <w:rPr>
+          <w:b/>
+          <w:bCs/>
+          <w:sz w:val="20"/>
+          <w:szCs w:val="20"/>
+          <w:rtl/>
+        </w:rPr>
+        <w:t>متن کامل و روان برای توضیح دادن در ویدیو</w:t>
+      </w:r>
+      <w:r>
+        <w:rPr>
+          <w:b/>
+          <w:bCs/>
+          <w:sz w:val="20"/>
+          <w:szCs w:val="20"/>
+          <w:lang w:bidi="fa-IR"/>
+        </w:rPr>
+        <w:t xml:space="preserve"> (Voiceover Script)</w:t>
+      </w:r>
+    </w:p>
+    <w:p>
+      <w:pPr>
+        <w:bidi/>
+        <w:rPr>
+          <w:sz w:val="20"/>
+          <w:szCs w:val="20"/>
+          <w:lang w:bidi="fa-IR"/>
+        </w:rPr>
+      </w:pPr>
+      <w:r>
+        <w:rPr>
+          <w:sz w:val="20"/>
+          <w:szCs w:val="20"/>
+          <w:lang w:bidi="fa-IR"/>
+        </w:rPr>
+        <w:t xml:space="preserve">"Interestingly, the requirement for the dimension to be at least 3 is crucial. For$\dim(X) = 2$, this theory does not hold in general. As a classic counterexample, we can refer to </w:t>
+      </w:r>
+      <w:r>
+        <w:rPr>
+          <w:b/>
+          <w:bCs/>
+          <w:sz w:val="20"/>
+          <w:szCs w:val="20"/>
+          <w:lang w:bidi="fa-IR"/>
+        </w:rPr>
+        <w:t xml:space="preserve">Radon </w:t>
+      </w:r>
+      <w:proofErr w:type="gramStart"/>
+      <w:r>
+        <w:rPr>
+          <w:b/>
+          <w:bCs/>
+          <w:sz w:val="20"/>
+          <w:szCs w:val="20"/>
+          <w:lang w:bidi="fa-IR"/>
+        </w:rPr>
+        <w:t>planes</w:t>
+      </w:r>
+      <w:r>
+        <w:rPr>
+          <w:sz w:val="20"/>
+          <w:szCs w:val="20"/>
+          <w:lang w:bidi="fa-IR"/>
+        </w:rPr>
+        <w:t xml:space="preserve"> .</w:t>
+      </w:r>
+      <w:proofErr w:type="gramEnd"/>
+      <w:r>
+        <w:rPr>
+          <w:sz w:val="20"/>
+          <w:szCs w:val="20"/>
+          <w:lang w:bidi="fa-IR"/>
+        </w:rPr>
+        <w:t xml:space="preserve"> In these specific two-dimensional normed spaces, the Birkhoff-James orthogonality remains perfectly symmetric, even though the space itself lacks an inner product structure.</w:t>
+      </w:r>
+    </w:p>
+    <w:p>
+      <w:pPr>
+        <w:bidi/>
+        <w:rPr>
+          <w:sz w:val="20"/>
+          <w:szCs w:val="20"/>
+          <w:lang w:bidi="fa-IR"/>
+        </w:rPr>
+      </w:pPr>
+      <w:r>
+        <w:rPr>
+          <w:sz w:val="20"/>
+          <w:szCs w:val="20"/>
+          <w:rtl/>
+        </w:rPr>
+        <w:lastRenderedPageBreak/>
+        <w:t xml:space="preserve">برای ساخت یک ویدیو آموزشی موفق و جذاب بر اساس این متن تخصصی ریاضی (هندسه فضاهای برداری نرم‌دار)، باید مطالب را به بخش‌های کوچک‌تر (سناریو یا صحنه) تقسیم کنید و برای هر بخش، تعادل مناسبی بین </w:t>
+      </w:r>
+      <w:r>
+        <w:rPr>
+          <w:b/>
+          <w:bCs/>
+          <w:sz w:val="20"/>
+          <w:szCs w:val="20"/>
+          <w:rtl/>
+        </w:rPr>
+        <w:t>متن ساده شده</w:t>
+      </w:r>
+      <w:r>
+        <w:rPr>
+          <w:sz w:val="20"/>
+          <w:szCs w:val="20"/>
+          <w:rtl/>
+        </w:rPr>
+        <w:t xml:space="preserve">، </w:t>
+      </w:r>
+      <w:r>
+        <w:rPr>
+          <w:b/>
+          <w:bCs/>
+          <w:sz w:val="20"/>
+          <w:szCs w:val="20"/>
+          <w:rtl/>
+        </w:rPr>
+        <w:t>اشکال هندسی (بصری‌سازی)</w:t>
+      </w:r>
+      <w:r>
+        <w:rPr>
+          <w:sz w:val="20"/>
+          <w:szCs w:val="20"/>
+          <w:rtl/>
+        </w:rPr>
+        <w:t xml:space="preserve"> و </w:t>
+      </w:r>
+      <w:r>
+        <w:rPr>
+          <w:b/>
+          <w:bCs/>
+          <w:sz w:val="20"/>
+          <w:szCs w:val="20"/>
+          <w:rtl/>
+        </w:rPr>
+        <w:t>توضیحات گوینده</w:t>
+      </w:r>
+      <w:r>
+        <w:rPr>
+          <w:sz w:val="20"/>
+          <w:szCs w:val="20"/>
+          <w:rtl/>
+        </w:rPr>
+        <w:t xml:space="preserve"> ایجاد کنید.</w:t>
+      </w:r>
+    </w:p>
+    <w:p>
+      <w:pPr>
+        <w:bidi/>
+        <w:rPr>
+          <w:sz w:val="20"/>
+          <w:szCs w:val="20"/>
+          <w:rtl/>
+        </w:rPr>
+      </w:pPr>
+      <w:r>
+        <w:rPr>
+          <w:sz w:val="20"/>
+          <w:szCs w:val="20"/>
+          <w:rtl/>
+        </w:rPr>
+        <w:t>در ادامه، ساختار گام‌به‌گام و دقیق ویدیو را برای شما طراحی کرده‌ام:</w:t>
+      </w:r>
+    </w:p>
+    <w:p>
+      <w:pPr>
+        <w:bidi/>
+        <w:rPr>
+          <w:b/>
+          <w:bCs/>
+          <w:sz w:val="20"/>
+          <w:szCs w:val="20"/>
+          <w:rtl/>
+        </w:rPr>
+      </w:pPr>
+      <w:r>
+        <w:rPr>
+          <w:b/>
+          <w:bCs/>
+          <w:sz w:val="20"/>
+          <w:szCs w:val="20"/>
+          <w:rtl/>
+        </w:rPr>
+        <w:t xml:space="preserve">بخش </w:t>
+      </w:r>
+      <w:r>
+        <w:rPr>
+          <w:b/>
+          <w:bCs/>
+          <w:sz w:val="20"/>
+          <w:szCs w:val="20"/>
+          <w:rtl/>
+          <w:lang w:bidi="fa-IR"/>
+        </w:rPr>
+        <w:t xml:space="preserve">۱: </w:t>
+      </w:r>
+      <w:r>
+        <w:rPr>
+          <w:b/>
+          <w:bCs/>
+          <w:sz w:val="20"/>
+          <w:szCs w:val="20"/>
+          <w:rtl/>
+        </w:rPr>
+        <w:t>مقدمه و بیان برتری تعامد جیمز</w:t>
+      </w:r>
+    </w:p>
+    <w:p>
+      <w:pPr>
+        <w:numPr>
+          <w:ilvl w:val="0"/>
+          <w:numId w:val="45"/>
+        </w:numPr>
+        <w:bidi/>
+        <w:rPr>
+          <w:sz w:val="20"/>
+          <w:szCs w:val="20"/>
+          <w:rtl/>
+        </w:rPr>
+      </w:pPr>
+      <w:r>
+        <w:rPr>
+          <w:b/>
+          <w:bCs/>
+          <w:sz w:val="20"/>
+          <w:szCs w:val="20"/>
+          <w:rtl/>
+        </w:rPr>
+        <w:t>هدف:</w:t>
+      </w:r>
+      <w:r>
+        <w:rPr>
+          <w:sz w:val="20"/>
+          <w:szCs w:val="20"/>
+          <w:rtl/>
+        </w:rPr>
+        <w:t xml:space="preserve"> ایجاد انگیزه و بیان اینکه چرا جیمز این تعامد را تعریف کرد.</w:t>
+      </w:r>
+    </w:p>
+    <w:p>
+      <w:pPr>
+        <w:numPr>
+          <w:ilvl w:val="0"/>
+          <w:numId w:val="45"/>
+        </w:numPr>
+        <w:bidi/>
+        <w:rPr>
+          <w:sz w:val="20"/>
+          <w:szCs w:val="20"/>
+          <w:rtl/>
+        </w:rPr>
+      </w:pPr>
+      <w:r>
+        <w:rPr>
+          <w:b/>
+          <w:bCs/>
+          <w:sz w:val="20"/>
+          <w:szCs w:val="20"/>
+          <w:rtl/>
+        </w:rPr>
+        <w:t>متن‌های روی صفحه (اسلاید):</w:t>
+      </w:r>
+    </w:p>
+    <w:p>
+      <w:pPr>
+        <w:numPr>
+          <w:ilvl w:val="1"/>
+          <w:numId w:val="45"/>
+        </w:numPr>
+        <w:bidi/>
+        <w:rPr>
+          <w:sz w:val="20"/>
+          <w:szCs w:val="20"/>
+          <w:rtl/>
+        </w:rPr>
+      </w:pPr>
+      <w:r>
+        <w:rPr>
+          <w:sz w:val="20"/>
+          <w:szCs w:val="20"/>
+          <w:rtl/>
+        </w:rPr>
+        <w:t>عنوان: تعامد بیرکوف-جیمز ($\</w:t>
+      </w:r>
+      <w:r>
+        <w:rPr>
+          <w:sz w:val="20"/>
+          <w:szCs w:val="20"/>
+          <w:lang w:bidi="fa-IR"/>
+        </w:rPr>
+        <w:t>perp_{BJ}</w:t>
+      </w:r>
+      <w:r>
+        <w:rPr>
+          <w:sz w:val="20"/>
+          <w:szCs w:val="20"/>
+          <w:rtl/>
+        </w:rPr>
+        <w:t>$) در فضاهای نرم‌دار</w:t>
+      </w:r>
+    </w:p>
+    <w:p>
+      <w:pPr>
+        <w:numPr>
+          <w:ilvl w:val="1"/>
+          <w:numId w:val="45"/>
+        </w:numPr>
+        <w:bidi/>
+        <w:rPr>
+          <w:sz w:val="20"/>
+          <w:szCs w:val="20"/>
+          <w:rtl/>
+        </w:rPr>
+      </w:pPr>
+      <w:r>
+        <w:rPr>
+          <w:sz w:val="20"/>
+          <w:szCs w:val="20"/>
+          <w:rtl/>
+        </w:rPr>
+        <w:t>رفع ضعف تعامد روبرتز (</w:t>
+      </w:r>
+      <w:r>
+        <w:rPr>
+          <w:sz w:val="20"/>
+          <w:szCs w:val="20"/>
+          <w:lang w:bidi="fa-IR"/>
+        </w:rPr>
+        <w:t>Roberts</w:t>
+      </w:r>
+      <w:r>
+        <w:rPr>
+          <w:sz w:val="20"/>
+          <w:szCs w:val="20"/>
+          <w:rtl/>
+        </w:rPr>
+        <w:t>)</w:t>
+      </w:r>
+    </w:p>
+    <w:p>
+      <w:pPr>
+        <w:numPr>
+          <w:ilvl w:val="1"/>
+          <w:numId w:val="45"/>
+        </w:numPr>
+        <w:bidi/>
+        <w:rPr>
+          <w:sz w:val="20"/>
+          <w:szCs w:val="20"/>
+          <w:rtl/>
+        </w:rPr>
+      </w:pPr>
+      <w:r>
+        <w:rPr>
+          <w:sz w:val="20"/>
+          <w:szCs w:val="20"/>
+          <w:rtl/>
+        </w:rPr>
+        <w:t>قضیه وجودی: برای هر بردار ناصفر $</w:t>
+      </w:r>
+      <w:r>
+        <w:rPr>
+          <w:sz w:val="20"/>
+          <w:szCs w:val="20"/>
+          <w:lang w:bidi="fa-IR"/>
+        </w:rPr>
+        <w:t>x \in X</w:t>
+      </w:r>
+      <w:r>
+        <w:rPr>
+          <w:sz w:val="20"/>
+          <w:szCs w:val="20"/>
+          <w:rtl/>
+        </w:rPr>
+        <w:t>$، بردارهای ناصفر $</w:t>
+      </w:r>
+      <w:r>
+        <w:rPr>
+          <w:sz w:val="20"/>
+          <w:szCs w:val="20"/>
+          <w:lang w:bidi="fa-IR"/>
+        </w:rPr>
+        <w:t>z_1$</w:t>
+      </w:r>
+      <w:r>
+        <w:rPr>
+          <w:sz w:val="20"/>
+          <w:szCs w:val="20"/>
+          <w:rtl/>
+        </w:rPr>
+        <w:t xml:space="preserve"> و $</w:t>
+      </w:r>
+      <w:r>
+        <w:rPr>
+          <w:sz w:val="20"/>
+          <w:szCs w:val="20"/>
+          <w:lang w:bidi="fa-IR"/>
+        </w:rPr>
+        <w:t>z_2$</w:t>
+      </w:r>
+      <w:r>
+        <w:rPr>
+          <w:sz w:val="20"/>
+          <w:szCs w:val="20"/>
+          <w:rtl/>
+        </w:rPr>
+        <w:t xml:space="preserve"> وجود دارند که:</w:t>
+      </w:r>
+    </w:p>
+    <w:p>
+      <w:pPr>
+        <w:numPr>
+          <w:ilvl w:val="2"/>
+          <w:numId w:val="45"/>
+        </w:numPr>
+        <w:bidi/>
+        <w:rPr>
+          <w:sz w:val="20"/>
+          <w:szCs w:val="20"/>
+          <w:rtl/>
+        </w:rPr>
+      </w:pPr>
+      <w:r>
+        <w:rPr>
+          <w:sz w:val="20"/>
+          <w:szCs w:val="20"/>
+          <w:rtl/>
+        </w:rPr>
+        <w:t>$</w:t>
+      </w:r>
+      <w:r>
+        <w:rPr>
+          <w:sz w:val="20"/>
+          <w:szCs w:val="20"/>
+          <w:lang w:bidi="fa-IR"/>
+        </w:rPr>
+        <w:t>z_1 \perp_{BJ} x</w:t>
+      </w:r>
+      <w:r>
+        <w:rPr>
+          <w:sz w:val="20"/>
+          <w:szCs w:val="20"/>
+          <w:rtl/>
+        </w:rPr>
+        <w:t>$ (تعامد از چپ)</w:t>
+      </w:r>
+    </w:p>
+    <w:p>
+      <w:pPr>
+        <w:numPr>
+          <w:ilvl w:val="2"/>
+          <w:numId w:val="45"/>
+        </w:numPr>
+        <w:bidi/>
+        <w:rPr>
+          <w:sz w:val="20"/>
+          <w:szCs w:val="20"/>
+          <w:rtl/>
+        </w:rPr>
+      </w:pPr>
+      <w:r>
+        <w:rPr>
+          <w:sz w:val="20"/>
+          <w:szCs w:val="20"/>
+          <w:rtl/>
+        </w:rPr>
+        <w:t>$</w:t>
+      </w:r>
+      <w:r>
+        <w:rPr>
+          <w:sz w:val="20"/>
+          <w:szCs w:val="20"/>
+          <w:lang w:bidi="fa-IR"/>
+        </w:rPr>
+        <w:t>x \perp_{BJ} z_2$</w:t>
+      </w:r>
+      <w:r>
+        <w:rPr>
+          <w:sz w:val="20"/>
+          <w:szCs w:val="20"/>
+          <w:rtl/>
+        </w:rPr>
+        <w:t xml:space="preserve"> (تعامد از راست)</w:t>
+      </w:r>
+    </w:p>
+    <w:p>
+      <w:pPr>
+        <w:numPr>
+          <w:ilvl w:val="0"/>
+          <w:numId w:val="45"/>
+        </w:numPr>
+        <w:bidi/>
+        <w:rPr>
+          <w:sz w:val="20"/>
+          <w:szCs w:val="20"/>
+          <w:rtl/>
+        </w:rPr>
+      </w:pPr>
+      <w:r>
+        <w:rPr>
+          <w:b/>
+          <w:bCs/>
+          <w:sz w:val="20"/>
+          <w:szCs w:val="20"/>
+          <w:rtl/>
+        </w:rPr>
+        <w:t>شکل‌ها و تصاویر پیشنهادی:</w:t>
+      </w:r>
+    </w:p>
+    <w:p>
+      <w:pPr>
+        <w:numPr>
+          <w:ilvl w:val="1"/>
+          <w:numId w:val="45"/>
+        </w:numPr>
+        <w:bidi/>
+        <w:rPr>
+          <w:sz w:val="20"/>
+          <w:szCs w:val="20"/>
+          <w:rtl/>
+        </w:rPr>
+      </w:pPr>
+      <w:r>
+        <w:rPr>
+          <w:sz w:val="20"/>
+          <w:szCs w:val="20"/>
+          <w:rtl/>
+        </w:rPr>
+        <w:t>نمودار دو بعدی از یک فضای نرم‌دار مخروطی یا یک گوی واحد دایره‌ای. دو بردار $</w:t>
+      </w:r>
+      <w:r>
+        <w:rPr>
+          <w:sz w:val="20"/>
+          <w:szCs w:val="20"/>
+          <w:lang w:bidi="fa-IR"/>
+        </w:rPr>
+        <w:t>z_1$</w:t>
+      </w:r>
+      <w:r>
+        <w:rPr>
+          <w:sz w:val="20"/>
+          <w:szCs w:val="20"/>
+          <w:rtl/>
+        </w:rPr>
+        <w:t xml:space="preserve"> و $</w:t>
+      </w:r>
+      <w:r>
+        <w:rPr>
+          <w:sz w:val="20"/>
+          <w:szCs w:val="20"/>
+          <w:lang w:bidi="fa-IR"/>
+        </w:rPr>
+        <w:t>z_2$</w:t>
+      </w:r>
+      <w:r>
+        <w:rPr>
+          <w:sz w:val="20"/>
+          <w:szCs w:val="20"/>
+          <w:rtl/>
+        </w:rPr>
+        <w:t xml:space="preserve"> را نشان دهید که نسبت به بردار $</w:t>
+      </w:r>
+      <w:r>
+        <w:rPr>
+          <w:sz w:val="20"/>
+          <w:szCs w:val="20"/>
+          <w:lang w:bidi="fa-IR"/>
+        </w:rPr>
+        <w:t>x</w:t>
+      </w:r>
+      <w:r>
+        <w:rPr>
+          <w:sz w:val="20"/>
+          <w:szCs w:val="20"/>
+          <w:rtl/>
+        </w:rPr>
+        <w:t>$ در دو وضعیت مختلف قرار گرفته‌اند (یکی عمود بر $</w:t>
+      </w:r>
+      <w:r>
+        <w:rPr>
+          <w:sz w:val="20"/>
+          <w:szCs w:val="20"/>
+          <w:lang w:bidi="fa-IR"/>
+        </w:rPr>
+        <w:t>x</w:t>
+      </w:r>
+      <w:r>
+        <w:rPr>
+          <w:sz w:val="20"/>
+          <w:szCs w:val="20"/>
+          <w:rtl/>
+        </w:rPr>
+        <w:t>$ و دیگری $</w:t>
+      </w:r>
+      <w:r>
+        <w:rPr>
+          <w:sz w:val="20"/>
+          <w:szCs w:val="20"/>
+          <w:lang w:bidi="fa-IR"/>
+        </w:rPr>
+        <w:t>x</w:t>
+      </w:r>
+      <w:r>
+        <w:rPr>
+          <w:sz w:val="20"/>
+          <w:szCs w:val="20"/>
+          <w:rtl/>
+        </w:rPr>
+        <w:t>$ عمود بر آن است) تا تفاوت تعامد چپ و راست به صورت بصری لمس شود.</w:t>
+      </w:r>
+    </w:p>
+    <w:p>
+      <w:pPr>
+        <w:numPr>
+          <w:ilvl w:val="0"/>
+          <w:numId w:val="45"/>
+        </w:numPr>
+        <w:bidi/>
+        <w:rPr>
+          <w:sz w:val="20"/>
+          <w:szCs w:val="20"/>
+          <w:rtl/>
+        </w:rPr>
+      </w:pPr>
+      <w:r>
+        <w:rPr>
+          <w:b/>
+          <w:bCs/>
+          <w:sz w:val="20"/>
+          <w:szCs w:val="20"/>
+          <w:rtl/>
+        </w:rPr>
+        <w:t>توضیحات گوینده (نریشن):</w:t>
+      </w:r>
+    </w:p>
+    <w:p>
+      <w:pPr>
+        <w:numPr>
+          <w:ilvl w:val="1"/>
+          <w:numId w:val="45"/>
+        </w:numPr>
+        <w:bidi/>
+        <w:rPr>
+          <w:sz w:val="20"/>
+          <w:szCs w:val="20"/>
+          <w:rtl/>
+        </w:rPr>
+      </w:pPr>
+      <w:r>
+        <w:rPr>
+          <w:sz w:val="20"/>
+          <w:szCs w:val="20"/>
+          <w:rtl/>
+        </w:rPr>
+        <w:t>"سلام. در هندسه فضاهای برداری نرم‌دار، تعریف تعامد به سادگی فضاهای هیلبرت نیست. جیمز تعامدی را تعریف کرد که ضعف‌های تعامد قبلی (مثل تعامد روبرتز) را نداشت. اولین دستاورد جیمز این بود که نشان داد در هر فضای نرم‌دار، برای هر بردار دلخواه و ناصفر $</w:t>
+      </w:r>
+      <w:r>
+        <w:rPr>
+          <w:sz w:val="20"/>
+          <w:szCs w:val="20"/>
+          <w:lang w:bidi="fa-IR"/>
+        </w:rPr>
+        <w:t>x</w:t>
+      </w:r>
+      <w:r>
+        <w:rPr>
+          <w:sz w:val="20"/>
+          <w:szCs w:val="20"/>
+          <w:rtl/>
+        </w:rPr>
+        <w:t>$، همیشه می‌توان بردارهایی پیدا کرد که از چپ یا از راست بر آن عمود باشند."</w:t>
+      </w:r>
+    </w:p>
+    <w:p>
+      <w:pPr>
+        <w:bidi/>
+        <w:rPr>
+          <w:b/>
+          <w:bCs/>
+          <w:sz w:val="20"/>
+          <w:szCs w:val="20"/>
+          <w:rtl/>
+        </w:rPr>
+      </w:pPr>
+      <w:r>
+        <w:rPr>
+          <w:b/>
+          <w:bCs/>
+          <w:sz w:val="20"/>
+          <w:szCs w:val="20"/>
+          <w:rtl/>
+        </w:rPr>
+        <w:t xml:space="preserve">بخش </w:t>
+      </w:r>
+      <w:r>
+        <w:rPr>
+          <w:b/>
+          <w:bCs/>
+          <w:sz w:val="20"/>
+          <w:szCs w:val="20"/>
+          <w:rtl/>
+          <w:lang w:bidi="fa-IR"/>
+        </w:rPr>
+        <w:t xml:space="preserve">۲: </w:t>
+      </w:r>
+      <w:r>
+        <w:rPr>
+          <w:b/>
+          <w:bCs/>
+          <w:sz w:val="20"/>
+          <w:szCs w:val="20"/>
+          <w:rtl/>
+        </w:rPr>
+        <w:t>قضیه وجودی ضرایب (نقش قضیه هان-باناخ)</w:t>
+      </w:r>
+    </w:p>
+    <w:p>
+      <w:pPr>
+        <w:numPr>
+          <w:ilvl w:val="0"/>
+          <w:numId w:val="46"/>
+        </w:numPr>
+        <w:bidi/>
+        <w:rPr>
+          <w:sz w:val="20"/>
+          <w:szCs w:val="20"/>
+          <w:rtl/>
+        </w:rPr>
+      </w:pPr>
+      <w:r>
+        <w:rPr>
+          <w:b/>
+          <w:bCs/>
+          <w:sz w:val="20"/>
+          <w:szCs w:val="20"/>
+          <w:rtl/>
+        </w:rPr>
+        <w:t>هدف:</w:t>
+      </w:r>
+      <w:r>
+        <w:rPr>
+          <w:sz w:val="20"/>
+          <w:szCs w:val="20"/>
+          <w:rtl/>
+        </w:rPr>
+        <w:t xml:space="preserve"> معرفی ضرایب $\</w:t>
+      </w:r>
+      <w:r>
+        <w:rPr>
+          <w:sz w:val="20"/>
+          <w:szCs w:val="20"/>
+          <w:lang w:bidi="fa-IR"/>
+        </w:rPr>
+        <w:t>lambda</w:t>
+      </w:r>
+      <w:r>
+        <w:rPr>
+          <w:sz w:val="20"/>
+          <w:szCs w:val="20"/>
+          <w:rtl/>
+        </w:rPr>
+        <w:t>$ و $\</w:t>
+      </w:r>
+      <w:r>
+        <w:rPr>
+          <w:sz w:val="20"/>
+          <w:szCs w:val="20"/>
+          <w:lang w:bidi="fa-IR"/>
+        </w:rPr>
+        <w:t>mu</w:t>
+      </w:r>
+      <w:r>
+        <w:rPr>
+          <w:sz w:val="20"/>
+          <w:szCs w:val="20"/>
+          <w:rtl/>
+        </w:rPr>
+        <w:t>$ و بازه‌های آن‌ها.</w:t>
+      </w:r>
+    </w:p>
+    <w:p>
+      <w:pPr>
+        <w:numPr>
+          <w:ilvl w:val="0"/>
+          <w:numId w:val="46"/>
+        </w:numPr>
+        <w:bidi/>
+        <w:rPr>
+          <w:sz w:val="20"/>
+          <w:szCs w:val="20"/>
+          <w:rtl/>
+        </w:rPr>
+      </w:pPr>
+      <w:r>
+        <w:rPr>
+          <w:b/>
+          <w:bCs/>
+          <w:sz w:val="20"/>
+          <w:szCs w:val="20"/>
+          <w:rtl/>
+        </w:rPr>
+        <w:t>متن‌های روی صفحه (اسلاید):</w:t>
+      </w:r>
+    </w:p>
+    <w:p>
+      <w:pPr>
+        <w:numPr>
+          <w:ilvl w:val="1"/>
+          <w:numId w:val="46"/>
+        </w:numPr>
+        <w:bidi/>
+        <w:rPr>
+          <w:sz w:val="20"/>
+          <w:szCs w:val="20"/>
+          <w:rtl/>
+        </w:rPr>
+      </w:pPr>
+      <w:r>
+        <w:rPr>
+          <w:sz w:val="20"/>
+          <w:szCs w:val="20"/>
+          <w:rtl/>
+        </w:rPr>
+        <w:t xml:space="preserve">ابزار اصلی: </w:t>
+      </w:r>
+      <w:r>
+        <w:rPr>
+          <w:b/>
+          <w:bCs/>
+          <w:sz w:val="20"/>
+          <w:szCs w:val="20"/>
+          <w:rtl/>
+        </w:rPr>
+        <w:t>قضیه هان-باناخ (</w:t>
+      </w:r>
+      <w:r>
+        <w:rPr>
+          <w:b/>
+          <w:bCs/>
+          <w:sz w:val="20"/>
+          <w:szCs w:val="20"/>
+          <w:lang w:bidi="fa-IR"/>
+        </w:rPr>
+        <w:t>Hahn-Banach</w:t>
+      </w:r>
+      <w:r>
+        <w:rPr>
+          <w:b/>
+          <w:bCs/>
+          <w:sz w:val="20"/>
+          <w:szCs w:val="20"/>
+          <w:rtl/>
+        </w:rPr>
+        <w:t>)</w:t>
+      </w:r>
+    </w:p>
+    <w:p>
+      <w:pPr>
+        <w:numPr>
+          <w:ilvl w:val="1"/>
+          <w:numId w:val="46"/>
+        </w:numPr>
+        <w:bidi/>
+        <w:rPr>
+          <w:sz w:val="20"/>
+          <w:szCs w:val="20"/>
+          <w:rtl/>
+        </w:rPr>
+      </w:pPr>
+      <w:r>
+        <w:rPr>
+          <w:sz w:val="20"/>
+          <w:szCs w:val="20"/>
+          <w:rtl/>
+        </w:rPr>
+        <w:t>برای هر دو بردار $</w:t>
+      </w:r>
+      <w:r>
+        <w:rPr>
+          <w:sz w:val="20"/>
+          <w:szCs w:val="20"/>
+          <w:lang w:bidi="fa-IR"/>
+        </w:rPr>
+        <w:t>x, y \in X</w:t>
+      </w:r>
+      <w:r>
+        <w:rPr>
+          <w:sz w:val="20"/>
+          <w:szCs w:val="20"/>
+          <w:rtl/>
+        </w:rPr>
+        <w:t>$:</w:t>
+      </w:r>
+    </w:p>
+    <w:p>
+      <w:pPr>
+        <w:numPr>
+          <w:ilvl w:val="2"/>
+          <w:numId w:val="46"/>
+        </w:numPr>
+        <w:bidi/>
+        <w:rPr>
+          <w:sz w:val="20"/>
+          <w:szCs w:val="20"/>
+          <w:rtl/>
+        </w:rPr>
+      </w:pPr>
+      <w:r>
+        <w:rPr>
+          <w:sz w:val="20"/>
+          <w:szCs w:val="20"/>
+          <w:rtl/>
+        </w:rPr>
+        <w:t>وجود عدد حقیقی $\</w:t>
+      </w:r>
+      <w:r>
+        <w:rPr>
+          <w:sz w:val="20"/>
+          <w:szCs w:val="20"/>
+          <w:lang w:bidi="fa-IR"/>
+        </w:rPr>
+        <w:t>lambda</w:t>
+      </w:r>
+      <w:r>
+        <w:rPr>
+          <w:sz w:val="20"/>
+          <w:szCs w:val="20"/>
+          <w:rtl/>
+        </w:rPr>
+        <w:t>$ به‌طوری که: $</w:t>
+      </w:r>
+      <w:r>
+        <w:rPr>
+          <w:sz w:val="20"/>
+          <w:szCs w:val="20"/>
+          <w:lang w:bidi="fa-IR"/>
+        </w:rPr>
+        <w:t>x \perp_{BJ} \lambda x + y</w:t>
+      </w:r>
+      <w:r>
+        <w:rPr>
+          <w:sz w:val="20"/>
+          <w:szCs w:val="20"/>
+          <w:rtl/>
+        </w:rPr>
+        <w:t>$</w:t>
+      </w:r>
+    </w:p>
+    <w:p>
+      <w:pPr>
+        <w:numPr>
+          <w:ilvl w:val="2"/>
+          <w:numId w:val="46"/>
+        </w:numPr>
+        <w:bidi/>
+        <w:rPr>
+          <w:sz w:val="20"/>
+          <w:szCs w:val="20"/>
+          <w:rtl/>
+        </w:rPr>
+      </w:pPr>
+      <w:r>
+        <w:rPr>
+          <w:sz w:val="20"/>
+          <w:szCs w:val="20"/>
+          <w:rtl/>
+        </w:rPr>
+        <w:t>وجود عدد حقیقی $\</w:t>
+      </w:r>
+      <w:r>
+        <w:rPr>
+          <w:sz w:val="20"/>
+          <w:szCs w:val="20"/>
+          <w:lang w:bidi="fa-IR"/>
+        </w:rPr>
+        <w:t>mu</w:t>
+      </w:r>
+      <w:r>
+        <w:rPr>
+          <w:sz w:val="20"/>
+          <w:szCs w:val="20"/>
+          <w:rtl/>
+        </w:rPr>
+        <w:t>$ به‌طوری که: $\</w:t>
+      </w:r>
+      <w:r>
+        <w:rPr>
+          <w:sz w:val="20"/>
+          <w:szCs w:val="20"/>
+          <w:lang w:bidi="fa-IR"/>
+        </w:rPr>
+        <w:t>mu x + y \perp_{BJ} x</w:t>
+      </w:r>
+      <w:r>
+        <w:rPr>
+          <w:sz w:val="20"/>
+          <w:szCs w:val="20"/>
+          <w:rtl/>
+        </w:rPr>
+        <w:t>$</w:t>
+      </w:r>
+    </w:p>
+    <w:p>
+      <w:pPr>
+        <w:numPr>
+          <w:ilvl w:val="1"/>
+          <w:numId w:val="46"/>
+        </w:numPr>
+        <w:bidi/>
+        <w:rPr>
+          <w:sz w:val="20"/>
+          <w:szCs w:val="20"/>
+          <w:rtl/>
+        </w:rPr>
+      </w:pPr>
+      <w:r>
+        <w:rPr>
+          <w:sz w:val="20"/>
+          <w:szCs w:val="20"/>
+          <w:rtl/>
+        </w:rPr>
+        <w:t>کران‌های ضرایب: $\</w:t>
+      </w:r>
+      <w:r>
+        <w:rPr>
+          <w:sz w:val="20"/>
+          <w:szCs w:val="20"/>
+          <w:lang w:bidi="fa-IR"/>
+        </w:rPr>
+        <w:t>alpha_1 \le \lambda \le \alpha_2$</w:t>
+      </w:r>
+      <w:r>
+        <w:rPr>
+          <w:sz w:val="20"/>
+          <w:szCs w:val="20"/>
+          <w:rtl/>
+        </w:rPr>
+        <w:t xml:space="preserve"> و $\</w:t>
+      </w:r>
+      <w:r>
+        <w:rPr>
+          <w:sz w:val="20"/>
+          <w:szCs w:val="20"/>
+          <w:lang w:bidi="fa-IR"/>
+        </w:rPr>
+        <w:t>beta_1 \le \mu \le \beta_2$</w:t>
+      </w:r>
+    </w:p>
+    <w:p>
+      <w:pPr>
+        <w:numPr>
+          <w:ilvl w:val="0"/>
+          <w:numId w:val="46"/>
+        </w:numPr>
+        <w:bidi/>
+        <w:rPr>
+          <w:sz w:val="20"/>
+          <w:szCs w:val="20"/>
+          <w:rtl/>
+        </w:rPr>
+      </w:pPr>
+      <w:r>
+        <w:rPr>
+          <w:b/>
+          <w:bCs/>
+          <w:sz w:val="20"/>
+          <w:szCs w:val="20"/>
+          <w:rtl/>
+        </w:rPr>
+        <w:t>شکل‌ها و تصاویر پیشنهادی:</w:t>
+      </w:r>
+    </w:p>
+    <w:p>
+      <w:pPr>
+        <w:numPr>
+          <w:ilvl w:val="1"/>
+          <w:numId w:val="46"/>
+        </w:numPr>
+        <w:bidi/>
+        <w:rPr>
+          <w:sz w:val="20"/>
+          <w:szCs w:val="20"/>
+          <w:rtl/>
+        </w:rPr>
+      </w:pPr>
+      <w:r>
+        <w:rPr>
+          <w:sz w:val="20"/>
+          <w:szCs w:val="20"/>
+          <w:rtl/>
+        </w:rPr>
+        <w:t>نمایش یک خط فرضی یا یک محور مختصات کوچک که روی آن دو بازه $[\</w:t>
+      </w:r>
+      <w:r>
+        <w:rPr>
+          <w:sz w:val="20"/>
+          <w:szCs w:val="20"/>
+          <w:lang w:bidi="fa-IR"/>
+        </w:rPr>
+        <w:t>alpha_1, \alpha_2</w:t>
+      </w:r>
+      <w:r>
+        <w:rPr>
+          <w:sz w:val="20"/>
+          <w:szCs w:val="20"/>
+          <w:rtl/>
+        </w:rPr>
+        <w:t>]$ و $[\</w:t>
+      </w:r>
+      <w:r>
+        <w:rPr>
+          <w:sz w:val="20"/>
+          <w:szCs w:val="20"/>
+          <w:lang w:bidi="fa-IR"/>
+        </w:rPr>
+        <w:t>beta_1, \beta_2</w:t>
+      </w:r>
+      <w:r>
+        <w:rPr>
+          <w:sz w:val="20"/>
+          <w:szCs w:val="20"/>
+          <w:rtl/>
+        </w:rPr>
+        <w:t>]$ برجسته (</w:t>
+      </w:r>
+      <w:r>
+        <w:rPr>
+          <w:sz w:val="20"/>
+          <w:szCs w:val="20"/>
+          <w:lang w:bidi="fa-IR"/>
+        </w:rPr>
+        <w:t>Highlight</w:t>
+      </w:r>
+      <w:r>
+        <w:rPr>
+          <w:sz w:val="20"/>
+          <w:szCs w:val="20"/>
+          <w:rtl/>
+        </w:rPr>
+        <w:t>) شده‌اند. این شکل نشان می‌دهد که این ضرایب در یک محدوده یا بازه مشخص قرار می‌گیرند.</w:t>
+      </w:r>
+    </w:p>
+    <w:p>
+      <w:pPr>
+        <w:numPr>
+          <w:ilvl w:val="0"/>
+          <w:numId w:val="46"/>
+        </w:numPr>
+        <w:bidi/>
+        <w:rPr>
+          <w:sz w:val="20"/>
+          <w:szCs w:val="20"/>
+          <w:rtl/>
+        </w:rPr>
+      </w:pPr>
+      <w:r>
+        <w:rPr>
+          <w:b/>
+          <w:bCs/>
+          <w:sz w:val="20"/>
+          <w:szCs w:val="20"/>
+          <w:rtl/>
+        </w:rPr>
+        <w:lastRenderedPageBreak/>
+        <w:t>توضیحات گوینده (نریشن):</w:t>
+      </w:r>
+    </w:p>
+    <w:p>
+      <w:pPr>
+        <w:numPr>
+          <w:ilvl w:val="1"/>
+          <w:numId w:val="46"/>
+        </w:numPr>
+        <w:bidi/>
+        <w:rPr>
+          <w:sz w:val="20"/>
+          <w:szCs w:val="20"/>
+          <w:rtl/>
+        </w:rPr>
+      </w:pPr>
+      <w:r>
+        <w:rPr>
+          <w:sz w:val="20"/>
+          <w:szCs w:val="20"/>
+          <w:rtl/>
+        </w:rPr>
+        <w:t>"جیمز با استفاده از قضیه قدرتمند هان-باناخ ثابت کرد که برای هر دو بردار دلخواه $</w:t>
+      </w:r>
+      <w:r>
+        <w:rPr>
+          <w:sz w:val="20"/>
+          <w:szCs w:val="20"/>
+          <w:lang w:bidi="fa-IR"/>
+        </w:rPr>
+        <w:t>x</w:t>
+      </w:r>
+      <w:r>
+        <w:rPr>
+          <w:sz w:val="20"/>
+          <w:szCs w:val="20"/>
+          <w:rtl/>
+        </w:rPr>
+        <w:t>$ و $</w:t>
+      </w:r>
+      <w:r>
+        <w:rPr>
+          <w:sz w:val="20"/>
+          <w:szCs w:val="20"/>
+          <w:lang w:bidi="fa-IR"/>
+        </w:rPr>
+        <w:t>y</w:t>
+      </w:r>
+      <w:r>
+        <w:rPr>
+          <w:sz w:val="20"/>
+          <w:szCs w:val="20"/>
+          <w:rtl/>
+        </w:rPr>
+        <w:t>$، ضرایب حقیقی $\</w:t>
+      </w:r>
+      <w:r>
+        <w:rPr>
+          <w:sz w:val="20"/>
+          <w:szCs w:val="20"/>
+          <w:lang w:bidi="fa-IR"/>
+        </w:rPr>
+        <w:t>lambda</w:t>
+      </w:r>
+      <w:r>
+        <w:rPr>
+          <w:sz w:val="20"/>
+          <w:szCs w:val="20"/>
+          <w:rtl/>
+        </w:rPr>
+        <w:t>$ و $\</w:t>
+      </w:r>
+      <w:r>
+        <w:rPr>
+          <w:sz w:val="20"/>
+          <w:szCs w:val="20"/>
+          <w:lang w:bidi="fa-IR"/>
+        </w:rPr>
+        <w:t>mu</w:t>
+      </w:r>
+      <w:r>
+        <w:rPr>
+          <w:sz w:val="20"/>
+          <w:szCs w:val="20"/>
+          <w:rtl/>
+        </w:rPr>
+        <w:t>$ وجود دارند که روابط تعامد را برقرار می‌کنند. نکته جالب اینجاست که این ضرایب می‌توانند در بازه‌های مشخصی تغییر کنند که در اینجا با آلفا و بتا نشان داده شده‌اند."</w:t>
+      </w:r>
+    </w:p>
+    <w:p>
+      <w:pPr>
+        <w:bidi/>
+        <w:rPr>
+          <w:b/>
+          <w:bCs/>
+          <w:sz w:val="20"/>
+          <w:szCs w:val="20"/>
+          <w:rtl/>
+        </w:rPr>
+      </w:pPr>
+      <w:r>
+        <w:rPr>
+          <w:b/>
+          <w:bCs/>
+          <w:sz w:val="20"/>
+          <w:szCs w:val="20"/>
+          <w:rtl/>
+        </w:rPr>
+        <w:t xml:space="preserve">بخش </w:t>
+      </w:r>
+      <w:r>
+        <w:rPr>
+          <w:b/>
+          <w:bCs/>
+          <w:sz w:val="20"/>
+          <w:szCs w:val="20"/>
+          <w:rtl/>
+          <w:lang w:bidi="fa-IR"/>
+        </w:rPr>
+        <w:t xml:space="preserve">۳: </w:t>
+      </w:r>
+      <w:r>
+        <w:rPr>
+          <w:b/>
+          <w:bCs/>
+          <w:sz w:val="20"/>
+          <w:szCs w:val="20"/>
+          <w:rtl/>
+        </w:rPr>
+        <w:t>چالش عدم تقارن و تعاریف یکتایی (چپ و راست)</w:t>
+      </w:r>
+    </w:p>
+    <w:p>
+      <w:pPr>
+        <w:numPr>
+          <w:ilvl w:val="0"/>
+          <w:numId w:val="47"/>
+        </w:numPr>
+        <w:bidi/>
+        <w:rPr>
+          <w:sz w:val="20"/>
+          <w:szCs w:val="20"/>
+          <w:rtl/>
+        </w:rPr>
+      </w:pPr>
+      <w:r>
+        <w:rPr>
+          <w:b/>
+          <w:bCs/>
+          <w:sz w:val="20"/>
+          <w:szCs w:val="20"/>
+          <w:rtl/>
+        </w:rPr>
+        <w:t>هدف:</w:t>
+      </w:r>
+      <w:r>
+        <w:rPr>
+          <w:sz w:val="20"/>
+          <w:szCs w:val="20"/>
+          <w:rtl/>
+        </w:rPr>
+        <w:t xml:space="preserve"> توضیح اینکه چرا یکتایی این ضرایب مهم است و تعریف یکتایی راست و چپ.</w:t>
+      </w:r>
+    </w:p>
+    <w:p>
+      <w:pPr>
+        <w:numPr>
+          <w:ilvl w:val="0"/>
+          <w:numId w:val="47"/>
+        </w:numPr>
+        <w:bidi/>
+        <w:rPr>
+          <w:sz w:val="20"/>
+          <w:szCs w:val="20"/>
+          <w:rtl/>
+        </w:rPr>
+      </w:pPr>
+      <w:r>
+        <w:rPr>
+          <w:b/>
+          <w:bCs/>
+          <w:sz w:val="20"/>
+          <w:szCs w:val="20"/>
+          <w:rtl/>
+        </w:rPr>
+        <w:t>متن‌های روی صفحه (اسلاید):</w:t>
+      </w:r>
+    </w:p>
+    <w:p>
+      <w:pPr>
+        <w:numPr>
+          <w:ilvl w:val="1"/>
+          <w:numId w:val="47"/>
+        </w:numPr>
+        <w:bidi/>
+        <w:rPr>
+          <w:sz w:val="20"/>
+          <w:szCs w:val="20"/>
+          <w:rtl/>
+        </w:rPr>
+      </w:pPr>
+      <w:r>
+        <w:rPr>
+          <w:sz w:val="20"/>
+          <w:szCs w:val="20"/>
+          <w:rtl/>
+        </w:rPr>
+        <w:t>نکته کلیدی: رابطه تعامد $\</w:t>
+      </w:r>
+      <w:r>
+        <w:rPr>
+          <w:sz w:val="20"/>
+          <w:szCs w:val="20"/>
+          <w:lang w:bidi="fa-IR"/>
+        </w:rPr>
+        <w:t>perp_{BJ}</w:t>
+      </w:r>
+      <w:r>
+        <w:rPr>
+          <w:sz w:val="20"/>
+          <w:szCs w:val="20"/>
+          <w:rtl/>
+        </w:rPr>
+        <w:t xml:space="preserve">$ </w:t>
+      </w:r>
+      <w:r>
+        <w:rPr>
+          <w:b/>
+          <w:bCs/>
+          <w:sz w:val="20"/>
+          <w:szCs w:val="20"/>
+          <w:rtl/>
+        </w:rPr>
+        <w:t>متن‌اقارن نیست</w:t>
+      </w:r>
+      <w:r>
+        <w:rPr>
+          <w:sz w:val="20"/>
+          <w:szCs w:val="20"/>
+          <w:rtl/>
+        </w:rPr>
+        <w:t>! (یعنی $</w:t>
+      </w:r>
+      <w:r>
+        <w:rPr>
+          <w:sz w:val="20"/>
+          <w:szCs w:val="20"/>
+          <w:lang w:bidi="fa-IR"/>
+        </w:rPr>
+        <w:t>x \perp y</w:t>
+      </w:r>
+      <w:r>
+        <w:rPr>
+          <w:sz w:val="20"/>
+          <w:szCs w:val="20"/>
+          <w:rtl/>
+        </w:rPr>
+        <w:t>$ لزوماً به معنای $</w:t>
+      </w:r>
+      <w:r>
+        <w:rPr>
+          <w:sz w:val="20"/>
+          <w:szCs w:val="20"/>
+          <w:lang w:bidi="fa-IR"/>
+        </w:rPr>
+        <w:t>y \perp x</w:t>
+      </w:r>
+      <w:r>
+        <w:rPr>
+          <w:sz w:val="20"/>
+          <w:szCs w:val="20"/>
+          <w:rtl/>
+        </w:rPr>
+        <w:t>$ نیست).</w:t>
+      </w:r>
+    </w:p>
+    <w:p>
+      <w:pPr>
+        <w:numPr>
+          <w:ilvl w:val="1"/>
+          <w:numId w:val="47"/>
+        </w:numPr>
+        <w:bidi/>
+        <w:rPr>
+          <w:sz w:val="20"/>
+          <w:szCs w:val="20"/>
+          <w:rtl/>
+        </w:rPr>
+      </w:pPr>
+      <w:r>
+        <w:rPr>
+          <w:b/>
+          <w:bCs/>
+          <w:sz w:val="20"/>
+          <w:szCs w:val="20"/>
+          <w:rtl/>
+        </w:rPr>
+        <w:t>یکتایی از راست:</w:t>
+      </w:r>
+      <w:r>
+        <w:rPr>
+          <w:sz w:val="20"/>
+          <w:szCs w:val="20"/>
+          <w:rtl/>
+        </w:rPr>
+        <w:t xml:space="preserve"> وجود تنها یک $\</w:t>
+      </w:r>
+      <w:r>
+        <w:rPr>
+          <w:sz w:val="20"/>
+          <w:szCs w:val="20"/>
+          <w:lang w:bidi="fa-IR"/>
+        </w:rPr>
+        <w:t>lambda</w:t>
+      </w:r>
+      <w:r>
+        <w:rPr>
+          <w:sz w:val="20"/>
+          <w:szCs w:val="20"/>
+          <w:rtl/>
+        </w:rPr>
+        <w:t>$ برای رابطه $</w:t>
+      </w:r>
+      <w:r>
+        <w:rPr>
+          <w:sz w:val="20"/>
+          <w:szCs w:val="20"/>
+          <w:lang w:bidi="fa-IR"/>
+        </w:rPr>
+        <w:t>x \perp_{BJ} \lambda x + y</w:t>
+      </w:r>
+      <w:r>
+        <w:rPr>
+          <w:sz w:val="20"/>
+          <w:szCs w:val="20"/>
+          <w:rtl/>
+        </w:rPr>
+        <w:t>$</w:t>
+      </w:r>
+    </w:p>
+    <w:p>
+      <w:pPr>
+        <w:numPr>
+          <w:ilvl w:val="1"/>
+          <w:numId w:val="47"/>
+        </w:numPr>
+        <w:bidi/>
+        <w:rPr>
+          <w:sz w:val="20"/>
+          <w:szCs w:val="20"/>
+          <w:rtl/>
+        </w:rPr>
+      </w:pPr>
+      <w:r>
+        <w:rPr>
+          <w:b/>
+          <w:bCs/>
+          <w:sz w:val="20"/>
+          <w:szCs w:val="20"/>
+          <w:rtl/>
+        </w:rPr>
+        <w:t>یکتایی از چپ:</w:t>
+      </w:r>
+      <w:r>
+        <w:rPr>
+          <w:sz w:val="20"/>
+          <w:szCs w:val="20"/>
+          <w:rtl/>
+        </w:rPr>
+        <w:t xml:space="preserve"> وجود تنها یک $\</w:t>
+      </w:r>
+      <w:r>
+        <w:rPr>
+          <w:sz w:val="20"/>
+          <w:szCs w:val="20"/>
+          <w:lang w:bidi="fa-IR"/>
+        </w:rPr>
+        <w:t>mu</w:t>
+      </w:r>
+      <w:r>
+        <w:rPr>
+          <w:sz w:val="20"/>
+          <w:szCs w:val="20"/>
+          <w:rtl/>
+        </w:rPr>
+        <w:t>$ برای رابطه $\</w:t>
+      </w:r>
+      <w:r>
+        <w:rPr>
+          <w:sz w:val="20"/>
+          <w:szCs w:val="20"/>
+          <w:lang w:bidi="fa-IR"/>
+        </w:rPr>
+        <w:t>mu x + y \perp_{BJ} x</w:t>
+      </w:r>
+      <w:r>
+        <w:rPr>
+          <w:sz w:val="20"/>
+          <w:szCs w:val="20"/>
+          <w:rtl/>
+        </w:rPr>
+        <w:t>$</w:t>
+      </w:r>
+    </w:p>
+    <w:p>
+      <w:pPr>
+        <w:numPr>
+          <w:ilvl w:val="0"/>
+          <w:numId w:val="47"/>
+        </w:numPr>
+        <w:bidi/>
+        <w:rPr>
+          <w:sz w:val="20"/>
+          <w:szCs w:val="20"/>
+          <w:rtl/>
+        </w:rPr>
+      </w:pPr>
+      <w:r>
+        <w:rPr>
+          <w:b/>
+          <w:bCs/>
+          <w:sz w:val="20"/>
+          <w:szCs w:val="20"/>
+          <w:rtl/>
+        </w:rPr>
+        <w:t>شکل‌ها و تصاویر پیشنهادی:</w:t>
+      </w:r>
+    </w:p>
+    <w:p>
+      <w:pPr>
+        <w:numPr>
+          <w:ilvl w:val="1"/>
+          <w:numId w:val="47"/>
+        </w:numPr>
+        <w:bidi/>
+        <w:rPr>
+          <w:sz w:val="20"/>
+          <w:szCs w:val="20"/>
+          <w:rtl/>
+        </w:rPr>
+      </w:pPr>
+      <w:r>
+        <w:rPr>
+          <w:sz w:val="20"/>
+          <w:szCs w:val="20"/>
+          <w:rtl/>
+        </w:rPr>
+        <w:t>یک علامت نابرابری بزرگ یا نماد "عدم تقارن" (مثلاً دو فلش متقاطع که روی یکی خط قرمز کشیده شده) برای تأکید بر عدم تقارن تعامد.</w:t>
+      </w:r>
+    </w:p>
+    <w:p>
+      <w:pPr>
+        <w:numPr>
+          <w:ilvl w:val="1"/>
+          <w:numId w:val="47"/>
+        </w:numPr>
+        <w:bidi/>
+        <w:rPr>
+          <w:sz w:val="20"/>
+          <w:szCs w:val="20"/>
+          <w:rtl/>
+        </w:rPr>
+      </w:pPr>
+      <w:r>
+        <w:rPr>
+          <w:sz w:val="20"/>
+          <w:szCs w:val="20"/>
+          <w:rtl/>
+        </w:rPr>
+        <w:t>یک جدول دو ستونه: ستون راست (یکتایی راست / وابسته به خواص خودِ رابطه تعامد)، ستون چپ (یکتایی چپ / وابسته به ساختار فضای $</w:t>
+      </w:r>
+      <w:r>
+        <w:rPr>
+          <w:sz w:val="20"/>
+          <w:szCs w:val="20"/>
+          <w:lang w:bidi="fa-IR"/>
+        </w:rPr>
+        <w:t>X</w:t>
+      </w:r>
+      <w:r>
+        <w:rPr>
+          <w:sz w:val="20"/>
+          <w:szCs w:val="20"/>
+          <w:rtl/>
+        </w:rPr>
+        <w:t>$).</w:t>
+      </w:r>
+    </w:p>
+    <w:p>
+      <w:pPr>
+        <w:numPr>
+          <w:ilvl w:val="0"/>
+          <w:numId w:val="47"/>
+        </w:numPr>
+        <w:bidi/>
+        <w:rPr>
+          <w:sz w:val="20"/>
+          <w:szCs w:val="20"/>
+          <w:rtl/>
+        </w:rPr>
+      </w:pPr>
+      <w:r>
+        <w:rPr>
+          <w:b/>
+          <w:bCs/>
+          <w:sz w:val="20"/>
+          <w:szCs w:val="20"/>
+          <w:rtl/>
+        </w:rPr>
+        <w:t>توضیحات گوینده (نریشن):</w:t>
+      </w:r>
+    </w:p>
+    <w:p>
+      <w:pPr>
+        <w:numPr>
+          <w:ilvl w:val="1"/>
+          <w:numId w:val="47"/>
+        </w:numPr>
+        <w:bidi/>
+        <w:rPr>
+          <w:sz w:val="20"/>
+          <w:szCs w:val="20"/>
+          <w:rtl/>
+        </w:rPr>
+      </w:pPr>
+      <w:r>
+        <w:rPr>
+          <w:sz w:val="20"/>
+          <w:szCs w:val="20"/>
+          <w:rtl/>
+        </w:rPr>
+        <w:t>"چون در این نوع هندسه، اگر $</w:t>
+      </w:r>
+      <w:r>
+        <w:rPr>
+          <w:sz w:val="20"/>
+          <w:szCs w:val="20"/>
+          <w:lang w:bidi="fa-IR"/>
+        </w:rPr>
+        <w:t>x</w:t>
+      </w:r>
+      <w:r>
+        <w:rPr>
+          <w:sz w:val="20"/>
+          <w:szCs w:val="20"/>
+          <w:rtl/>
+        </w:rPr>
+        <w:t>$ بر $</w:t>
+      </w:r>
+      <w:r>
+        <w:rPr>
+          <w:sz w:val="20"/>
+          <w:szCs w:val="20"/>
+          <w:lang w:bidi="fa-IR"/>
+        </w:rPr>
+        <w:t>y</w:t>
+      </w:r>
+      <w:r>
+        <w:rPr>
+          <w:sz w:val="20"/>
+          <w:szCs w:val="20"/>
+          <w:rtl/>
+        </w:rPr>
+        <w:t>$ عمود باشد، لزوماً $</w:t>
+      </w:r>
+      <w:r>
+        <w:rPr>
+          <w:sz w:val="20"/>
+          <w:szCs w:val="20"/>
+          <w:lang w:bidi="fa-IR"/>
+        </w:rPr>
+        <w:t>y</w:t>
+      </w:r>
+      <w:r>
+        <w:rPr>
+          <w:sz w:val="20"/>
+          <w:szCs w:val="20"/>
+          <w:rtl/>
+        </w:rPr>
+        <w:t>$ بر $</w:t>
+      </w:r>
+      <w:r>
+        <w:rPr>
+          <w:sz w:val="20"/>
+          <w:szCs w:val="20"/>
+          <w:lang w:bidi="fa-IR"/>
+        </w:rPr>
+        <w:t>x</w:t>
+      </w:r>
+      <w:r>
+        <w:rPr>
+          <w:sz w:val="20"/>
+          <w:szCs w:val="20"/>
+          <w:rtl/>
+        </w:rPr>
+        <w:t>$ عمود نیست، ما با پدیده عدم تقارن روبرو هستیم. به همین دلیل، مفهوم یکتایی این ضرایب به دو بخش تقسیم می‌شود: یکتایی از راست و یکتایی از چپ. این دو کاملاً با هم متفاوتند؛ یکتایی چپ به ساختار خودِ فضا بستگی دارد، اما یکتایی راست به ویژگی‌های خودِ رابطه تعامد مرتبط است."</w:t>
+      </w:r>
+    </w:p>
+    <w:p>
+      <w:pPr>
+        <w:bidi/>
+        <w:rPr>
+          <w:b/>
+          <w:bCs/>
+          <w:sz w:val="20"/>
+          <w:szCs w:val="20"/>
+          <w:rtl/>
+        </w:rPr>
+      </w:pPr>
+      <w:r>
+        <w:rPr>
+          <w:b/>
+          <w:bCs/>
+          <w:sz w:val="20"/>
+          <w:szCs w:val="20"/>
+          <w:rtl/>
+        </w:rPr>
+        <w:t xml:space="preserve">بخش </w:t>
+      </w:r>
+      <w:r>
+        <w:rPr>
+          <w:b/>
+          <w:bCs/>
+          <w:sz w:val="20"/>
+          <w:szCs w:val="20"/>
+          <w:rtl/>
+          <w:lang w:bidi="fa-IR"/>
+        </w:rPr>
+        <w:t xml:space="preserve">۴: </w:t>
+      </w:r>
+      <w:r>
+        <w:rPr>
+          <w:b/>
+          <w:bCs/>
+          <w:sz w:val="20"/>
+          <w:szCs w:val="20"/>
+          <w:rtl/>
+        </w:rPr>
+        <w:t>یکتایی از راست و خاصیت جمعی</w:t>
+      </w:r>
+    </w:p>
+    <w:p>
+      <w:pPr>
+        <w:numPr>
+          <w:ilvl w:val="0"/>
+          <w:numId w:val="48"/>
+        </w:numPr>
+        <w:bidi/>
+        <w:rPr>
+          <w:sz w:val="20"/>
+          <w:szCs w:val="20"/>
+          <w:rtl/>
+        </w:rPr>
+      </w:pPr>
+      <w:r>
+        <w:rPr>
+          <w:b/>
+          <w:bCs/>
+          <w:sz w:val="20"/>
+          <w:szCs w:val="20"/>
+          <w:rtl/>
+        </w:rPr>
+        <w:t>هدف:</w:t>
+      </w:r>
+      <w:r>
+        <w:rPr>
+          <w:sz w:val="20"/>
+          <w:szCs w:val="20"/>
+          <w:rtl/>
+        </w:rPr>
+        <w:t xml:space="preserve"> توضیح گزاره </w:t>
+      </w:r>
+      <w:r>
+        <w:rPr>
+          <w:sz w:val="20"/>
+          <w:szCs w:val="20"/>
+          <w:rtl/>
+          <w:lang w:bidi="fa-IR"/>
+        </w:rPr>
+        <w:t>۲.۳</w:t>
+      </w:r>
+      <w:r>
+        <w:rPr>
+          <w:sz w:val="20"/>
+          <w:szCs w:val="20"/>
+          <w:rtl/>
+        </w:rPr>
+        <w:t xml:space="preserve"> متن.</w:t>
+      </w:r>
+    </w:p>
+    <w:p>
+      <w:pPr>
+        <w:numPr>
+          <w:ilvl w:val="0"/>
+          <w:numId w:val="48"/>
+        </w:numPr>
+        <w:bidi/>
+        <w:rPr>
+          <w:sz w:val="20"/>
+          <w:szCs w:val="20"/>
+          <w:rtl/>
+        </w:rPr>
+      </w:pPr>
+      <w:r>
+        <w:rPr>
+          <w:b/>
+          <w:bCs/>
+          <w:sz w:val="20"/>
+          <w:szCs w:val="20"/>
+          <w:rtl/>
+        </w:rPr>
+        <w:t>متن‌های روی صفحه (اسلاید):</w:t>
+      </w:r>
+    </w:p>
+    <w:p>
+      <w:pPr>
+        <w:numPr>
+          <w:ilvl w:val="1"/>
+          <w:numId w:val="48"/>
+        </w:numPr>
+        <w:bidi/>
+        <w:rPr>
+          <w:sz w:val="20"/>
+          <w:szCs w:val="20"/>
+          <w:rtl/>
+        </w:rPr>
+      </w:pPr>
+      <w:r>
+        <w:rPr>
+          <w:b/>
+          <w:bCs/>
+          <w:sz w:val="20"/>
+          <w:szCs w:val="20"/>
+          <w:rtl/>
+        </w:rPr>
+        <w:t xml:space="preserve">گزاره </w:t>
+      </w:r>
+      <w:r>
+        <w:rPr>
+          <w:b/>
+          <w:bCs/>
+          <w:sz w:val="20"/>
+          <w:szCs w:val="20"/>
+          <w:rtl/>
+          <w:lang w:bidi="fa-IR"/>
+        </w:rPr>
+        <w:t>۲.۳:</w:t>
+      </w:r>
+      <w:r>
+        <w:rPr>
+          <w:sz w:val="20"/>
+          <w:szCs w:val="20"/>
+          <w:rtl/>
+        </w:rPr>
+        <w:t xml:space="preserve"> رابطه تعامد از راست یکتاست $\</w:t>
+      </w:r>
+      <w:proofErr w:type="spellStart"/>
+      <w:r>
+        <w:rPr>
+          <w:sz w:val="20"/>
+          <w:szCs w:val="20"/>
+          <w:lang w:bidi="fa-IR"/>
+        </w:rPr>
+        <w:t>iff</w:t>
+      </w:r>
+      <w:proofErr w:type="spellEnd"/>
+      <w:r>
+        <w:rPr>
+          <w:sz w:val="20"/>
+          <w:szCs w:val="20"/>
+          <w:rtl/>
+        </w:rPr>
+        <w:t>$ رابطه تعامد خاصیت جمعی داشته باشد.</w:t>
+      </w:r>
+    </w:p>
+    <w:p>
+      <w:pPr>
+        <w:numPr>
+          <w:ilvl w:val="1"/>
+          <w:numId w:val="48"/>
+        </w:numPr>
+        <w:bidi/>
+        <w:rPr>
+          <w:sz w:val="20"/>
+          <w:szCs w:val="20"/>
+          <w:rtl/>
+        </w:rPr>
+      </w:pPr>
+      <w:r>
+        <w:rPr>
+          <w:sz w:val="20"/>
+          <w:szCs w:val="20"/>
+          <w:rtl/>
+        </w:rPr>
+        <w:t>فرمول جمعی بودن:</w:t>
+      </w:r>
+    </w:p>
+    <w:p>
+      <w:pPr>
+        <w:bidi/>
+        <w:rPr>
+          <w:sz w:val="20"/>
+          <w:szCs w:val="20"/>
+          <w:rtl/>
+        </w:rPr>
+      </w:pPr>
+      <w:r>
+        <w:rPr>
+          <w:sz w:val="20"/>
+          <w:szCs w:val="20"/>
+          <w:rtl/>
+        </w:rPr>
+        <w:t>اگر $</w:t>
+      </w:r>
+      <w:r>
+        <w:rPr>
+          <w:sz w:val="20"/>
+          <w:szCs w:val="20"/>
+          <w:lang w:bidi="fa-IR"/>
+        </w:rPr>
+        <w:t>x \perp_{BJ} y</w:t>
+      </w:r>
+      <w:r>
+        <w:rPr>
+          <w:sz w:val="20"/>
+          <w:szCs w:val="20"/>
+          <w:rtl/>
+        </w:rPr>
+        <w:t>$ و $</w:t>
+      </w:r>
+      <w:r>
+        <w:rPr>
+          <w:sz w:val="20"/>
+          <w:szCs w:val="20"/>
+          <w:lang w:bidi="fa-IR"/>
+        </w:rPr>
+        <w:t>x \perp_{BJ} z \implies x \perp_{BJ} (y + z)</w:t>
+      </w:r>
+      <w:r>
+        <w:rPr>
+          <w:sz w:val="20"/>
+          <w:szCs w:val="20"/>
+          <w:rtl/>
+        </w:rPr>
+        <w:t>$</w:t>
+      </w:r>
+    </w:p>
+    <w:p>
+      <w:pPr>
+        <w:numPr>
+          <w:ilvl w:val="0"/>
+          <w:numId w:val="48"/>
+        </w:numPr>
+        <w:bidi/>
+        <w:rPr>
+          <w:sz w:val="20"/>
+          <w:szCs w:val="20"/>
+          <w:rtl/>
+        </w:rPr>
+      </w:pPr>
+      <w:r>
+        <w:rPr>
+          <w:b/>
+          <w:bCs/>
+          <w:sz w:val="20"/>
+          <w:szCs w:val="20"/>
+          <w:rtl/>
+        </w:rPr>
+        <w:t>شکل‌ها و تصاویر پیشنهادی:</w:t>
+      </w:r>
+    </w:p>
+    <w:p>
+      <w:pPr>
+        <w:numPr>
+          <w:ilvl w:val="1"/>
+          <w:numId w:val="48"/>
+        </w:numPr>
+        <w:bidi/>
+        <w:rPr>
+          <w:sz w:val="20"/>
+          <w:szCs w:val="20"/>
+          <w:rtl/>
+        </w:rPr>
+      </w:pPr>
+      <w:r>
+        <w:rPr>
+          <w:sz w:val="20"/>
+          <w:szCs w:val="20"/>
+          <w:rtl/>
+        </w:rPr>
+        <w:t>نمایش برداری: بردار $</w:t>
+      </w:r>
+      <w:r>
+        <w:rPr>
+          <w:sz w:val="20"/>
+          <w:szCs w:val="20"/>
+          <w:lang w:bidi="fa-IR"/>
+        </w:rPr>
+        <w:t>x</w:t>
+      </w:r>
+      <w:r>
+        <w:rPr>
+          <w:sz w:val="20"/>
+          <w:szCs w:val="20"/>
+          <w:rtl/>
+        </w:rPr>
+        <w:t>$ را رسم کنید. دو بردار $</w:t>
+      </w:r>
+      <w:r>
+        <w:rPr>
+          <w:sz w:val="20"/>
+          <w:szCs w:val="20"/>
+          <w:lang w:bidi="fa-IR"/>
+        </w:rPr>
+        <w:t>y</w:t>
+      </w:r>
+      <w:r>
+        <w:rPr>
+          <w:sz w:val="20"/>
+          <w:szCs w:val="20"/>
+          <w:rtl/>
+        </w:rPr>
+        <w:t>$ و $</w:t>
+      </w:r>
+      <w:r>
+        <w:rPr>
+          <w:sz w:val="20"/>
+          <w:szCs w:val="20"/>
+          <w:lang w:bidi="fa-IR"/>
+        </w:rPr>
+        <w:t>z</w:t>
+      </w:r>
+      <w:r>
+        <w:rPr>
+          <w:sz w:val="20"/>
+          <w:szCs w:val="20"/>
+          <w:rtl/>
+        </w:rPr>
+        <w:t>$ را رسم کنید که $</w:t>
+      </w:r>
+      <w:r>
+        <w:rPr>
+          <w:sz w:val="20"/>
+          <w:szCs w:val="20"/>
+          <w:lang w:bidi="fa-IR"/>
+        </w:rPr>
+        <w:t>x</w:t>
+      </w:r>
+      <w:r>
+        <w:rPr>
+          <w:sz w:val="20"/>
+          <w:szCs w:val="20"/>
+          <w:rtl/>
+        </w:rPr>
+        <w:t>$ بر هر دوی آنها عمود است. سپس با رسم متوازی‌الاضلاع، بردار $</w:t>
+      </w:r>
+      <w:proofErr w:type="spellStart"/>
+      <w:r>
+        <w:rPr>
+          <w:sz w:val="20"/>
+          <w:szCs w:val="20"/>
+          <w:lang w:bidi="fa-IR"/>
+        </w:rPr>
+        <w:t>y+z</w:t>
+      </w:r>
+      <w:proofErr w:type="spellEnd"/>
+      <w:r>
+        <w:rPr>
+          <w:sz w:val="20"/>
+          <w:szCs w:val="20"/>
+          <w:rtl/>
+        </w:rPr>
+        <w:t>$ را نشان دهید و مشخص کنید که $</w:t>
+      </w:r>
+      <w:r>
+        <w:rPr>
+          <w:sz w:val="20"/>
+          <w:szCs w:val="20"/>
+          <w:lang w:bidi="fa-IR"/>
+        </w:rPr>
+        <w:t>x</w:t>
+      </w:r>
+      <w:r>
+        <w:rPr>
+          <w:sz w:val="20"/>
+          <w:szCs w:val="20"/>
+          <w:rtl/>
+        </w:rPr>
+        <w:t>$ بر این بردار حاصل‌جمع نیز عمود شده است.</w:t>
+      </w:r>
+    </w:p>
+    <w:p>
+      <w:pPr>
+        <w:numPr>
+          <w:ilvl w:val="0"/>
+          <w:numId w:val="48"/>
+        </w:numPr>
+        <w:bidi/>
+        <w:rPr>
+          <w:sz w:val="20"/>
+          <w:szCs w:val="20"/>
+          <w:rtl/>
+        </w:rPr>
+      </w:pPr>
+      <w:r>
+        <w:rPr>
+          <w:b/>
+          <w:bCs/>
+          <w:sz w:val="20"/>
+          <w:szCs w:val="20"/>
+          <w:rtl/>
+        </w:rPr>
+        <w:t>توضیحات گوینده (نریشن):</w:t>
+      </w:r>
+    </w:p>
+    <w:p>
+      <w:pPr>
+        <w:numPr>
+          <w:ilvl w:val="1"/>
+          <w:numId w:val="48"/>
+        </w:numPr>
+        <w:bidi/>
+        <w:rPr>
+          <w:sz w:val="20"/>
+          <w:szCs w:val="20"/>
+          <w:rtl/>
+        </w:rPr>
+      </w:pPr>
+      <w:r>
+        <w:rPr>
+          <w:sz w:val="20"/>
+          <w:szCs w:val="20"/>
+          <w:rtl/>
+        </w:rPr>
+        <w:t xml:space="preserve">"طبق گزاره </w:t>
+      </w:r>
+      <w:r>
+        <w:rPr>
+          <w:sz w:val="20"/>
+          <w:szCs w:val="20"/>
+          <w:rtl/>
+          <w:lang w:bidi="fa-IR"/>
+        </w:rPr>
+        <w:t>۲.۳</w:t>
+      </w:r>
+      <w:r>
+        <w:rPr>
+          <w:sz w:val="20"/>
+          <w:szCs w:val="20"/>
+          <w:rtl/>
+        </w:rPr>
+        <w:t>، شرط لازم و کافی برای اینکه ضرایب از راست یکتا باشند این است که رابطه تعامد خاصیت جمعی داشته باشد. یعنی اگر بردار $</w:t>
+      </w:r>
+      <w:r>
+        <w:rPr>
+          <w:sz w:val="20"/>
+          <w:szCs w:val="20"/>
+          <w:lang w:bidi="fa-IR"/>
+        </w:rPr>
+        <w:t>x</w:t>
+      </w:r>
+      <w:r>
+        <w:rPr>
+          <w:sz w:val="20"/>
+          <w:szCs w:val="20"/>
+          <w:rtl/>
+        </w:rPr>
+        <w:t>$ هم بر $</w:t>
+      </w:r>
+      <w:r>
+        <w:rPr>
+          <w:sz w:val="20"/>
+          <w:szCs w:val="20"/>
+          <w:lang w:bidi="fa-IR"/>
+        </w:rPr>
+        <w:t>y</w:t>
+      </w:r>
+      <w:r>
+        <w:rPr>
+          <w:sz w:val="20"/>
+          <w:szCs w:val="20"/>
+          <w:rtl/>
+        </w:rPr>
+        <w:t>$ و هم بر $</w:t>
+      </w:r>
+      <w:r>
+        <w:rPr>
+          <w:sz w:val="20"/>
+          <w:szCs w:val="20"/>
+          <w:lang w:bidi="fa-IR"/>
+        </w:rPr>
+        <w:t>z</w:t>
+      </w:r>
+      <w:r>
+        <w:rPr>
+          <w:sz w:val="20"/>
+          <w:szCs w:val="20"/>
+          <w:rtl/>
+        </w:rPr>
+        <w:t>$ عمود باشد، باید بر حاصل‌جمع آن‌ها یعنی $</w:t>
+      </w:r>
+      <w:proofErr w:type="spellStart"/>
+      <w:r>
+        <w:rPr>
+          <w:sz w:val="20"/>
+          <w:szCs w:val="20"/>
+          <w:lang w:bidi="fa-IR"/>
+        </w:rPr>
+        <w:t>y+z</w:t>
+      </w:r>
+      <w:proofErr w:type="spellEnd"/>
+      <w:r>
+        <w:rPr>
+          <w:sz w:val="20"/>
+          <w:szCs w:val="20"/>
+          <w:rtl/>
+        </w:rPr>
+        <w:t>$ نیز عمود باشد."</w:t>
+      </w:r>
+    </w:p>
+    <w:p>
+      <w:pPr>
+        <w:bidi/>
+        <w:rPr>
+          <w:b/>
+          <w:bCs/>
+          <w:sz w:val="20"/>
+          <w:szCs w:val="20"/>
+          <w:rtl/>
+        </w:rPr>
+      </w:pPr>
+      <w:r>
+        <w:rPr>
+          <w:b/>
+          <w:bCs/>
+          <w:sz w:val="20"/>
+          <w:szCs w:val="20"/>
+          <w:rtl/>
+        </w:rPr>
+        <w:lastRenderedPageBreak/>
+        <w:t xml:space="preserve">بخش </w:t>
+      </w:r>
+      <w:r>
+        <w:rPr>
+          <w:b/>
+          <w:bCs/>
+          <w:sz w:val="20"/>
+          <w:szCs w:val="20"/>
+          <w:rtl/>
+          <w:lang w:bidi="fa-IR"/>
+        </w:rPr>
+        <w:t xml:space="preserve">۵: </w:t>
+      </w:r>
+      <w:r>
+        <w:rPr>
+          <w:b/>
+          <w:bCs/>
+          <w:sz w:val="20"/>
+          <w:szCs w:val="20"/>
+          <w:rtl/>
+        </w:rPr>
+        <w:t>یکتایی از چپ و فضاهای اکیداً محدب (بخش بسیار مهم و بصری)</w:t>
+      </w:r>
+    </w:p>
+    <w:p>
+      <w:pPr>
+        <w:numPr>
+          <w:ilvl w:val="0"/>
+          <w:numId w:val="49"/>
+        </w:numPr>
+        <w:bidi/>
+        <w:rPr>
+          <w:sz w:val="20"/>
+          <w:szCs w:val="20"/>
+          <w:rtl/>
+        </w:rPr>
+      </w:pPr>
+      <w:r>
+        <w:rPr>
+          <w:b/>
+          <w:bCs/>
+          <w:sz w:val="20"/>
+          <w:szCs w:val="20"/>
+          <w:rtl/>
+        </w:rPr>
+        <w:t>هدف:</w:t>
+      </w:r>
+      <w:r>
+        <w:rPr>
+          <w:sz w:val="20"/>
+          <w:szCs w:val="20"/>
+          <w:rtl/>
+        </w:rPr>
+        <w:t xml:space="preserve"> تعریف فضای اکیداً محدب و ارتباط آن با یکتایی چپ.</w:t>
+      </w:r>
+    </w:p>
+    <w:p>
+      <w:pPr>
+        <w:numPr>
+          <w:ilvl w:val="0"/>
+          <w:numId w:val="49"/>
+        </w:numPr>
+        <w:bidi/>
+        <w:rPr>
+          <w:sz w:val="20"/>
+          <w:szCs w:val="20"/>
+          <w:rtl/>
+        </w:rPr>
+      </w:pPr>
+      <w:r>
+        <w:rPr>
+          <w:b/>
+          <w:bCs/>
+          <w:sz w:val="20"/>
+          <w:szCs w:val="20"/>
+          <w:rtl/>
+        </w:rPr>
+        <w:t>متن‌های روی صفحه (اسلاید):</w:t>
+      </w:r>
+    </w:p>
+    <w:p>
+      <w:pPr>
+        <w:numPr>
+          <w:ilvl w:val="1"/>
+          <w:numId w:val="49"/>
+        </w:numPr>
+        <w:bidi/>
+        <w:rPr>
+          <w:sz w:val="20"/>
+          <w:szCs w:val="20"/>
+          <w:rtl/>
+        </w:rPr>
+      </w:pPr>
+      <w:r>
+        <w:rPr>
+          <w:b/>
+          <w:bCs/>
+          <w:sz w:val="20"/>
+          <w:szCs w:val="20"/>
+          <w:rtl/>
+        </w:rPr>
+        <w:t xml:space="preserve">تعریف </w:t>
+      </w:r>
+      <w:r>
+        <w:rPr>
+          <w:b/>
+          <w:bCs/>
+          <w:sz w:val="20"/>
+          <w:szCs w:val="20"/>
+          <w:rtl/>
+          <w:lang w:bidi="fa-IR"/>
+        </w:rPr>
+        <w:t>۲.۴ (</w:t>
+      </w:r>
+      <w:r>
+        <w:rPr>
+          <w:b/>
+          <w:bCs/>
+          <w:sz w:val="20"/>
+          <w:szCs w:val="20"/>
+          <w:rtl/>
+        </w:rPr>
+        <w:t xml:space="preserve">فضای اکیداً محدب / </w:t>
+      </w:r>
+      <w:r>
+        <w:rPr>
+          <w:b/>
+          <w:bCs/>
+          <w:sz w:val="20"/>
+          <w:szCs w:val="20"/>
+          <w:lang w:bidi="fa-IR"/>
+        </w:rPr>
+        <w:t>Strictly Convex</w:t>
+      </w:r>
+      <w:r>
+        <w:rPr>
+          <w:b/>
+          <w:bCs/>
+          <w:sz w:val="20"/>
+          <w:szCs w:val="20"/>
+          <w:rtl/>
+        </w:rPr>
+        <w:t>):</w:t>
+      </w:r>
+    </w:p>
+    <w:p>
+      <w:pPr>
+        <w:bidi/>
+        <w:rPr>
+          <w:sz w:val="20"/>
+          <w:szCs w:val="20"/>
+          <w:rtl/>
+        </w:rPr>
+      </w:pPr>
+      <w:r>
+        <w:rPr>
+          <w:sz w:val="20"/>
+          <w:szCs w:val="20"/>
+          <w:rtl/>
+        </w:rPr>
+        <w:t>فضای $</w:t>
+      </w:r>
+      <w:r>
+        <w:rPr>
+          <w:sz w:val="20"/>
+          <w:szCs w:val="20"/>
+          <w:lang w:bidi="fa-IR"/>
+        </w:rPr>
+        <w:t>X</w:t>
+      </w:r>
+      <w:r>
+        <w:rPr>
+          <w:sz w:val="20"/>
+          <w:szCs w:val="20"/>
+          <w:rtl/>
+        </w:rPr>
+        <w:t>$ اکیداً محدب است اگر خط گذارنده از هر دو نقطه روی مرز گوی واحد، مرز را فقط و فقط در همان دو نقطه قطع کند (و بقیه خط کاملاً درون گوی قرار بگیرد).</w:t>
+      </w:r>
+    </w:p>
+    <w:p>
+      <w:pPr>
+        <w:numPr>
+          <w:ilvl w:val="1"/>
+          <w:numId w:val="49"/>
+        </w:numPr>
+        <w:bidi/>
+        <w:rPr>
+          <w:sz w:val="20"/>
+          <w:szCs w:val="20"/>
+          <w:rtl/>
+        </w:rPr>
+      </w:pPr>
+      <w:r>
+        <w:rPr>
+          <w:b/>
+          <w:bCs/>
+          <w:sz w:val="20"/>
+          <w:szCs w:val="20"/>
+          <w:rtl/>
+        </w:rPr>
+        <w:t>قضیه نهایی:</w:t>
+      </w:r>
+      <w:r>
+        <w:rPr>
+          <w:sz w:val="20"/>
+          <w:szCs w:val="20"/>
+          <w:rtl/>
+        </w:rPr>
+        <w:t xml:space="preserve"> رابطه تعامد از چپ یکتاست $\</w:t>
+      </w:r>
+      <w:proofErr w:type="spellStart"/>
+      <w:r>
+        <w:rPr>
+          <w:sz w:val="20"/>
+          <w:szCs w:val="20"/>
+          <w:lang w:bidi="fa-IR"/>
+        </w:rPr>
+        <w:t>iff</w:t>
+      </w:r>
+      <w:proofErr w:type="spellEnd"/>
+      <w:r>
+        <w:rPr>
+          <w:sz w:val="20"/>
+          <w:szCs w:val="20"/>
+          <w:rtl/>
+        </w:rPr>
+        <w:t>$ فضای برداری $</w:t>
+      </w:r>
+      <w:r>
+        <w:rPr>
+          <w:sz w:val="20"/>
+          <w:szCs w:val="20"/>
+          <w:lang w:bidi="fa-IR"/>
+        </w:rPr>
+        <w:t>X</w:t>
+      </w:r>
+      <w:r>
+        <w:rPr>
+          <w:sz w:val="20"/>
+          <w:szCs w:val="20"/>
+          <w:rtl/>
+        </w:rPr>
+        <w:t>$ اکیداً محدب باشد.</w:t>
+      </w:r>
+    </w:p>
+    <w:p>
+      <w:pPr>
+        <w:numPr>
+          <w:ilvl w:val="0"/>
+          <w:numId w:val="49"/>
+        </w:numPr>
+        <w:bidi/>
+        <w:rPr>
+          <w:sz w:val="20"/>
+          <w:szCs w:val="20"/>
+          <w:rtl/>
+        </w:rPr>
+      </w:pPr>
+      <w:r>
+        <w:rPr>
+          <w:b/>
+          <w:bCs/>
+          <w:sz w:val="20"/>
+          <w:szCs w:val="20"/>
+          <w:rtl/>
+        </w:rPr>
+        <w:t>شکل‌ها و تصاویر پیشنهادی (حیاتی برای درک مطلب):</w:t>
+      </w:r>
+    </w:p>
+    <w:p>
+      <w:pPr>
+        <w:numPr>
+          <w:ilvl w:val="1"/>
+          <w:numId w:val="49"/>
+        </w:numPr>
+        <w:bidi/>
+        <w:rPr>
+          <w:sz w:val="20"/>
+          <w:szCs w:val="20"/>
+          <w:rtl/>
+        </w:rPr>
+      </w:pPr>
+      <w:r>
+        <w:rPr>
+          <w:sz w:val="20"/>
+          <w:szCs w:val="20"/>
+          <w:rtl/>
+        </w:rPr>
+        <w:t>رسم دو شکل در کنار هم جهت مقایسه:</w:t>
+      </w:r>
+    </w:p>
+    <w:p>
+      <w:pPr>
+        <w:numPr>
+          <w:ilvl w:val="2"/>
+          <w:numId w:val="49"/>
+        </w:numPr>
+        <w:bidi/>
+        <w:rPr>
+          <w:sz w:val="20"/>
+          <w:szCs w:val="20"/>
+          <w:rtl/>
+        </w:rPr>
+      </w:pPr>
+      <w:r>
+        <w:rPr>
+          <w:b/>
+          <w:bCs/>
+          <w:sz w:val="20"/>
+          <w:szCs w:val="20"/>
+          <w:rtl/>
+        </w:rPr>
+        <w:t>شکل اول (اکیداً محدب):</w:t>
+      </w:r>
+      <w:r>
+        <w:rPr>
+          <w:sz w:val="20"/>
+          <w:szCs w:val="20"/>
+          <w:rtl/>
+        </w:rPr>
+        <w:t xml:space="preserve"> یک دایره (گوی واحد در نرم </w:t>
+      </w:r>
+      <w:r>
+        <w:rPr>
+          <w:sz w:val="20"/>
+          <w:szCs w:val="20"/>
+          <w:rtl/>
+          <w:lang w:bidi="fa-IR"/>
+        </w:rPr>
+        <w:t xml:space="preserve">۲). </w:t>
+      </w:r>
+      <w:r>
+        <w:rPr>
+          <w:sz w:val="20"/>
+          <w:szCs w:val="20"/>
+          <w:rtl/>
+        </w:rPr>
+        <w:t>یک خط راست رسم کنید که از دو نقطه روی محیط دایره می‌گذرد. کاملاً واضح است که خط فقط در همان دو نقطه مرز را قطع کرده و وسط خط داخل دایره است.</w:t>
+      </w:r>
+    </w:p>
+    <w:p>
+      <w:pPr>
+        <w:numPr>
+          <w:ilvl w:val="2"/>
+          <w:numId w:val="49"/>
+        </w:numPr>
+        <w:bidi/>
+        <w:rPr>
+          <w:sz w:val="20"/>
+          <w:szCs w:val="20"/>
+          <w:rtl/>
+        </w:rPr>
+      </w:pPr>
+      <w:r>
+        <w:rPr>
+          <w:b/>
+          <w:bCs/>
+          <w:sz w:val="20"/>
+          <w:szCs w:val="20"/>
+          <w:rtl/>
+        </w:rPr>
+        <w:t>شکل دوم (غیر اکیداً محدب):</w:t>
+      </w:r>
+      <w:r>
+        <w:rPr>
+          <w:sz w:val="20"/>
+          <w:szCs w:val="20"/>
+          <w:rtl/>
+        </w:rPr>
+        <w:t xml:space="preserve"> یک مربع یا لوزی (گوی واحد در نرم </w:t>
+      </w:r>
+      <w:r>
+        <w:rPr>
+          <w:sz w:val="20"/>
+          <w:szCs w:val="20"/>
+          <w:rtl/>
+          <w:lang w:bidi="fa-IR"/>
+        </w:rPr>
+        <w:t>۱</w:t>
+      </w:r>
+      <w:r>
+        <w:rPr>
+          <w:sz w:val="20"/>
+          <w:szCs w:val="20"/>
+          <w:rtl/>
+        </w:rPr>
+        <w:t xml:space="preserve"> یا بی‌نهایت). خط را طوری رسم کنید که مماس بر یکی از ضلع‌های مربع باشد. در این حالت، خط با بخشی از مرز گوی (یک پاره‌خط کامل) همپوشانی دارد و بیش از دو نقطه تماس دارد.</w:t>
+      </w:r>
+    </w:p>
+    <w:p>
+      <w:pPr>
+        <w:numPr>
+          <w:ilvl w:val="0"/>
+          <w:numId w:val="49"/>
+        </w:numPr>
+        <w:bidi/>
+        <w:rPr>
+          <w:sz w:val="20"/>
+          <w:szCs w:val="20"/>
+          <w:rtl/>
+        </w:rPr>
+      </w:pPr>
+      <w:r>
+        <w:rPr>
+          <w:b/>
+          <w:bCs/>
+          <w:sz w:val="20"/>
+          <w:szCs w:val="20"/>
+          <w:rtl/>
+        </w:rPr>
+        <w:t>توضیحات گوینده (نریشن):</w:t>
+      </w:r>
+    </w:p>
+    <w:p>
+      <w:pPr>
+        <w:numPr>
+          <w:ilvl w:val="1"/>
+          <w:numId w:val="49"/>
+        </w:numPr>
+        <w:bidi/>
+        <w:rPr>
+          <w:sz w:val="20"/>
+          <w:szCs w:val="20"/>
+          <w:rtl/>
+        </w:rPr>
+      </w:pPr>
+      <w:r>
+        <w:rPr>
+          <w:sz w:val="20"/>
+          <w:szCs w:val="20"/>
+          <w:rtl/>
+        </w:rPr>
+        <w:t xml:space="preserve">"اما برای یکتایی از چپ، داستان هندسی‌تر می‌شود. ابتدا باید بدانیم فضای اکیداً محدب چیست. در یک فضای اکیداً محدب مثل یک دایره کامل، اگر خطی از دو نقطه روی مرز بگذرد، مرز را فقط در همان دو نقطه قطع می‌کند و روی مرز نمی‌خوابد (برعکسِ یک مربع که لبه‌های صاف دارد). جیمز نشان داد که شرط لازم و کافی برای اینکه تعامد از چپ یکتا باشد، این است که فضای ما اکیداً محدب یا اصطلاحاً </w:t>
+      </w:r>
+      <w:r>
+        <w:rPr>
+          <w:sz w:val="20"/>
+          <w:szCs w:val="20"/>
+          <w:lang w:bidi="fa-IR"/>
+        </w:rPr>
+        <w:t>Strictly Convex</w:t>
+      </w:r>
+      <w:r>
+        <w:rPr>
+          <w:sz w:val="20"/>
+          <w:szCs w:val="20"/>
+          <w:rtl/>
+        </w:rPr>
+        <w:t xml:space="preserve"> باشد."</w:t>
+      </w:r>
+    </w:p>
+    <w:p>
+      <w:pPr>
+        <w:bidi/>
+        <w:rPr>
+          <w:b/>
+          <w:bCs/>
+          <w:sz w:val="20"/>
+          <w:szCs w:val="20"/>
+          <w:rtl/>
+        </w:rPr>
+      </w:pPr>
+      <w:r>
+        <w:rPr>
+          <w:b/>
+          <w:bCs/>
+          <w:sz w:val="20"/>
+          <w:szCs w:val="20"/>
+          <w:rtl/>
+        </w:rPr>
+        <w:t>نکات فنی برای ادیت و تدوین ویدیو:</w:t>
+      </w:r>
+    </w:p>
+    <w:p>
+      <w:pPr>
+        <w:numPr>
+          <w:ilvl w:val="0"/>
+          <w:numId w:val="50"/>
+        </w:numPr>
+        <w:bidi/>
+        <w:rPr>
+          <w:sz w:val="20"/>
+          <w:szCs w:val="20"/>
+          <w:rtl/>
+        </w:rPr>
+      </w:pPr>
+      <w:r>
+        <w:rPr>
+          <w:b/>
+          <w:bCs/>
+          <w:sz w:val="20"/>
+          <w:szCs w:val="20"/>
+          <w:rtl/>
+        </w:rPr>
+        <w:t>رنگ‌بندی بردارهای تعامد:</w:t>
+      </w:r>
+      <w:r>
+        <w:rPr>
+          <w:sz w:val="20"/>
+          <w:szCs w:val="20"/>
+          <w:rtl/>
+        </w:rPr>
+        <w:t xml:space="preserve"> برای تعامد چپ از یک رنگ (مثلاً آبی) و برای تعامد راست از رنگ دیگر (مثلاً قرمز) استفاده کنید تا بیننده در طول ویدیو گیج نشود.</w:t>
+      </w:r>
+    </w:p>
+    <w:p>
+      <w:pPr>
+        <w:numPr>
+          <w:ilvl w:val="0"/>
+          <w:numId w:val="50"/>
+        </w:numPr>
+        <w:bidi/>
+        <w:rPr>
+          <w:sz w:val="20"/>
+          <w:szCs w:val="20"/>
+          <w:rtl/>
+        </w:rPr>
+      </w:pPr>
+      <w:r>
+        <w:rPr>
+          <w:b/>
+          <w:bCs/>
+          <w:sz w:val="20"/>
+          <w:szCs w:val="20"/>
+          <w:rtl/>
+        </w:rPr>
+        <w:t>انیمیشن فرمول‌ها:</w:t>
+      </w:r>
+      <w:r>
+        <w:rPr>
+          <w:sz w:val="20"/>
+          <w:szCs w:val="20"/>
+          <w:rtl/>
+        </w:rPr>
+        <w:t xml:space="preserve"> فرمول‌های طولانی بخش </w:t>
+      </w:r>
+      <w:r>
+        <w:rPr>
+          <w:sz w:val="20"/>
+          <w:szCs w:val="20"/>
+          <w:rtl/>
+          <w:lang w:bidi="fa-IR"/>
+        </w:rPr>
+        <w:t>۲</w:t>
+      </w:r>
+      <w:r>
+        <w:rPr>
+          <w:sz w:val="20"/>
+          <w:szCs w:val="20"/>
+          <w:rtl/>
+        </w:rPr>
+        <w:t xml:space="preserve"> را یک‌باره نمایش ندهید. اجازه دهید ابتدا فرمول اصلی ظاهر شود و سپس بازه‌های $\</w:t>
+      </w:r>
+      <w:r>
+        <w:rPr>
+          <w:sz w:val="20"/>
+          <w:szCs w:val="20"/>
+          <w:lang w:bidi="fa-IR"/>
+        </w:rPr>
+        <w:t>alpha</w:t>
+      </w:r>
+      <w:r>
+        <w:rPr>
+          <w:sz w:val="20"/>
+          <w:szCs w:val="20"/>
+          <w:rtl/>
+        </w:rPr>
+        <w:t>$ و $\</w:t>
+      </w:r>
+      <w:r>
+        <w:rPr>
+          <w:sz w:val="20"/>
+          <w:szCs w:val="20"/>
+          <w:lang w:bidi="fa-IR"/>
+        </w:rPr>
+        <w:t>beta</w:t>
+      </w:r>
+      <w:r>
+        <w:rPr>
+          <w:sz w:val="20"/>
+          <w:szCs w:val="20"/>
+          <w:rtl/>
+        </w:rPr>
+        <w:t>$ با یک افکت ساده زیر آن‌ها زیرنویس شوند.</w:t>
+      </w:r>
+    </w:p>
+    <w:p>
+      <w:pPr>
+        <w:numPr>
+          <w:ilvl w:val="0"/>
+          <w:numId w:val="50"/>
+        </w:numPr>
+        <w:bidi/>
+        <w:rPr>
+          <w:sz w:val="20"/>
+          <w:szCs w:val="20"/>
+          <w:rtl/>
+        </w:rPr>
+      </w:pPr>
+      <w:r>
+        <w:rPr>
+          <w:b/>
+          <w:bCs/>
+          <w:sz w:val="20"/>
+          <w:szCs w:val="20"/>
+          <w:rtl/>
+        </w:rPr>
+        <w:t>پایان‌بندی:</w:t>
+      </w:r>
+      <w:r>
+        <w:rPr>
+          <w:sz w:val="20"/>
+          <w:szCs w:val="20"/>
+          <w:rtl/>
+        </w:rPr>
+        <w:t xml:space="preserve"> در اسلاید آخر یک جمع‌بندی یک جمله‌ای قرار دهید: </w:t>
+      </w:r>
+      <w:r>
+        <w:rPr>
+          <w:i/>
+          <w:iCs/>
+          <w:sz w:val="20"/>
+          <w:szCs w:val="20"/>
+          <w:rtl/>
+        </w:rPr>
+        <w:t>«یکتایی راست وابسته به رفتارِ رابطه $\</w:t>
+      </w:r>
+      <w:proofErr w:type="spellStart"/>
+      <w:r>
+        <w:rPr>
+          <w:i/>
+          <w:iCs/>
+          <w:sz w:val="20"/>
+          <w:szCs w:val="20"/>
+          <w:lang w:bidi="fa-IR"/>
+        </w:rPr>
+        <w:t>leftarrow</w:t>
+      </w:r>
+      <w:proofErr w:type="spellEnd"/>
+      <w:r>
+        <w:rPr>
+          <w:i/>
+          <w:iCs/>
+          <w:sz w:val="20"/>
+          <w:szCs w:val="20"/>
+          <w:rtl/>
+        </w:rPr>
+        <w:t>$ یکتایی چپ وابسته به شکلِ فضا (اِکیداً محدب بودن)».</w:t>
+      </w:r>
+    </w:p>
+    <w:p>
+      <w:pPr>
+        <w:bidi/>
+        <w:rPr>
+          <w:sz w:val="20"/>
+          <w:szCs w:val="20"/>
         </w:rPr>
       </w:pPr>
     </w:p>
@@ -40107,6 +43095,119 @@
     </w:lvl>
   </w:abstractNum>
   <w:abstractNum w:abstractNumId="3" w15:restartNumberingAfterBreak="0">
+    <w:nsid w:val="07AA26E8"/>
+    <w:multiLevelType w:val="multilevel"/>
+    <w:tmpl w:val="9208BE7A"/>
+    <w:lvl w:ilvl="0">
+      <w:start w:val="1"/>
+      <w:numFmt w:val="decimal"/>
+      <w:lvlText w:val="%1."/>
+      <w:lvlJc w:val="left"/>
+      <w:pPr>
+        <w:tabs>
+          <w:tab w:val="num" w:pos="720"/>
+        </w:tabs>
+        <w:ind w:left="720" w:hanging="360"/>
+      </w:pPr>
+    </w:lvl>
+    <w:lvl w:ilvl="1" w:tentative="1">
+      <w:start w:val="1"/>
+      <w:numFmt w:val="decimal"/>
+      <w:lvlText w:val="%2."/>
+      <w:lvlJc w:val="left"/>
+      <w:pPr>
+        <w:tabs>
+          <w:tab w:val="num" w:pos="1440"/>
+        </w:tabs>
+        <w:ind w:left="1440" w:hanging="360"/>
+      </w:pPr>
+    </w:lvl>
+    <w:lvl w:ilvl="2" w:tentative="1">
+      <w:start w:val="1"/>
+      <w:numFmt w:val="decimal"/>
+      <w:lvlText w:val="%3."/>
+      <w:lvlJc w:val="left"/>
+      <w:pPr>
+        <w:tabs>
+          <w:tab w:val="num" w:pos="2160"/>
+        </w:tabs>
+        <w:ind w:left="2160" w:hanging="360"/>
+      </w:pPr>
+    </w:lvl>
+    <w:lvl w:ilvl="3" w:tentative="1">
+      <w:start w:val="1"/>
+      <w:numFmt w:val="decimal"/>
+      <w:lvlText w:val="%4."/>
+      <w:lvlJc w:val="left"/>
+      <w:pPr>
+        <w:tabs>
+          <w:tab w:val="num" w:pos="2880"/>
+        </w:tabs>
+        <w:ind w:left="2880" w:hanging="360"/>
+      </w:pPr>
+    </w:lvl>
+    <w:lvl w:ilvl="4" w:tentative="1">
+      <w:start w:val="1"/>
+      <w:numFmt w:val="decimal"/>
+      <w:lvlText w:val="%5."/>
+      <w:lvlJc w:val="left"/>
+      <w:pPr>
+        <w:tabs>
+          <w:tab w:val="num" w:pos="3600"/>
+        </w:tabs>
+        <w:ind w:left="3600" w:hanging="360"/>
+      </w:pPr>
+    </w:lvl>
+    <w:lvl w:ilvl="5" w:tentative="1">
+      <w:start w:val="1"/>
+      <w:numFmt w:val="decimal"/>
+      <w:lvlText w:val="%6."/>
+      <w:lvlJc w:val="left"/>
+      <w:pPr>
+        <w:tabs>
+          <w:tab w:val="num" w:pos="4320"/>
+        </w:tabs>
+        <w:ind w:left="4320" w:hanging="360"/>
+      </w:pPr>
+    </w:lvl>
+    <w:lvl w:ilvl="6" w:tentative="1">
+      <w:start w:val="1"/>
+      <w:numFmt w:val="decimal"/>
+      <w:lvlText w:val="%7."/>
+      <w:lvlJc w:val="left"/>
+      <w:pPr>
+        <w:tabs>
+          <w:tab w:val="num" w:pos="5040"/>
+        </w:tabs>
+        <w:ind w:left="5040" w:hanging="360"/>
+      </w:pPr>
+    </w:lvl>
+    <w:lvl w:ilvl="7" w:tentative="1">
+      <w:start w:val="1"/>
+      <w:numFmt w:val="decimal"/>
+      <w:lvlText w:val="%8."/>
+      <w:lvlJc w:val="left"/>
+      <w:pPr>
+        <w:tabs>
+          <w:tab w:val="num" w:pos="5760"/>
+        </w:tabs>
+        <w:ind w:left="5760" w:hanging="360"/>
+      </w:pPr>
+    </w:lvl>
+    <w:lvl w:ilvl="8" w:tentative="1">
+      <w:start w:val="1"/>
+      <w:numFmt w:val="decimal"/>
+      <w:lvlText w:val="%9."/>
+      <w:lvlJc w:val="left"/>
+      <w:pPr>
+        <w:tabs>
+          <w:tab w:val="num" w:pos="6480"/>
+        </w:tabs>
+        <w:ind w:left="6480" w:hanging="360"/>
+      </w:pPr>
+    </w:lvl>
+  </w:abstractNum>
+  <w:abstractNum w:abstractNumId="4" w15:restartNumberingAfterBreak="0">
     <w:nsid w:val="110237B2"/>
     <w:multiLevelType w:val="multilevel"/>
     <w:tmpl w:val="D43A3B32"/>
@@ -40219,7 +43320,7 @@
       </w:pPr>
     </w:lvl>
   </w:abstractNum>
-  <w:abstractNum w:abstractNumId="4" w15:restartNumberingAfterBreak="0">
+  <w:abstractNum w:abstractNumId="5" w15:restartNumberingAfterBreak="0">
     <w:nsid w:val="121C63A5"/>
     <w:multiLevelType w:val="multilevel"/>
     <w:tmpl w:val="01D6A9F2"/>
@@ -40368,7 +43469,156 @@
       </w:rPr>
     </w:lvl>
   </w:abstractNum>
-  <w:abstractNum w:abstractNumId="5" w15:restartNumberingAfterBreak="0">
+  <w:abstractNum w:abstractNumId="6" w15:restartNumberingAfterBreak="0">
+    <w:nsid w:val="1223075B"/>
+    <w:multiLevelType w:val="multilevel"/>
+    <w:tmpl w:val="BD922744"/>
+    <w:lvl w:ilvl="0">
+      <w:start w:val="1"/>
+      <w:numFmt w:val="bullet"/>
+      <w:lvlText w:val=""/>
+      <w:lvlJc w:val="left"/>
+      <w:pPr>
+        <w:tabs>
+          <w:tab w:val="num" w:pos="720"/>
+        </w:tabs>
+        <w:ind w:left="720" w:hanging="360"/>
+      </w:pPr>
+      <w:rPr>
+        <w:rFonts w:ascii="Symbol" w:hAnsi="Symbol" w:hint="default"/>
+        <w:sz w:val="20"/>
+      </w:rPr>
+    </w:lvl>
+    <w:lvl w:ilvl="1">
+      <w:start w:val="1"/>
+      <w:numFmt w:val="bullet"/>
+      <w:lvlText w:val="o"/>
+      <w:lvlJc w:val="left"/>
+      <w:pPr>
+        <w:tabs>
+          <w:tab w:val="num" w:pos="1440"/>
+        </w:tabs>
+        <w:ind w:left="1440" w:hanging="360"/>
+      </w:pPr>
+      <w:rPr>
+        <w:rFonts w:ascii="Courier New" w:hAnsi="Courier New" w:hint="default"/>
+        <w:sz w:val="20"/>
+      </w:rPr>
+    </w:lvl>
+    <w:lvl w:ilvl="2" w:tentative="1">
+      <w:start w:val="1"/>
+      <w:numFmt w:val="bullet"/>
+      <w:lvlText w:val=""/>
+      <w:lvlJc w:val="left"/>
+      <w:pPr>
+        <w:tabs>
+          <w:tab w:val="num" w:pos="2160"/>
+        </w:tabs>
+        <w:ind w:left="2160" w:hanging="360"/>
+      </w:pPr>
+      <w:rPr>
+        <w:rFonts w:ascii="Wingdings" w:hAnsi="Wingdings" w:hint="default"/>
+        <w:sz w:val="20"/>
+      </w:rPr>
+    </w:lvl>
+    <w:lvl w:ilvl="3" w:tentative="1">
+      <w:start w:val="1"/>
+      <w:numFmt w:val="bullet"/>
+      <w:lvlText w:val=""/>
+      <w:lvlJc w:val="left"/>
+      <w:pPr>
+        <w:tabs>
+          <w:tab w:val="num" w:pos="2880"/>
+        </w:tabs>
+        <w:ind w:left="2880" w:hanging="360"/>
+      </w:pPr>
+      <w:rPr>
+        <w:rFonts w:ascii="Wingdings" w:hAnsi="Wingdings" w:hint="default"/>
+        <w:sz w:val="20"/>
+      </w:rPr>
+    </w:lvl>
+    <w:lvl w:ilvl="4" w:tentative="1">
+      <w:start w:val="1"/>
+      <w:numFmt w:val="bullet"/>
+      <w:lvlText w:val=""/>
+      <w:lvlJc w:val="left"/>
+      <w:pPr>
+        <w:tabs>
+          <w:tab w:val="num" w:pos="3600"/>
+        </w:tabs>
+        <w:ind w:left="3600" w:hanging="360"/>
+      </w:pPr>
+      <w:rPr>
+        <w:rFonts w:ascii="Wingdings" w:hAnsi="Wingdings" w:hint="default"/>
+        <w:sz w:val="20"/>
+      </w:rPr>
+    </w:lvl>
+    <w:lvl w:ilvl="5" w:tentative="1">
+      <w:start w:val="1"/>
+      <w:numFmt w:val="bullet"/>
+      <w:lvlText w:val=""/>
+      <w:lvlJc w:val="left"/>
+      <w:pPr>
+        <w:tabs>
+          <w:tab w:val="num" w:pos="4320"/>
+        </w:tabs>
+        <w:ind w:left="4320" w:hanging="360"/>
+      </w:pPr>
+      <w:rPr>
+        <w:rFonts w:ascii="Wingdings" w:hAnsi="Wingdings" w:hint="default"/>
+        <w:sz w:val="20"/>
+      </w:rPr>
+    </w:lvl>
+    <w:lvl w:ilvl="6" w:tentative="1">
+      <w:start w:val="1"/>
+      <w:numFmt w:val="bullet"/>
+      <w:lvlText w:val=""/>
+      <w:lvlJc w:val="left"/>
+      <w:pPr>
+        <w:tabs>
+          <w:tab w:val="num" w:pos="5040"/>
+        </w:tabs>
+        <w:ind w:left="5040" w:hanging="360"/>
+      </w:pPr>
+      <w:rPr>
+        <w:rFonts w:ascii="Wingdings" w:hAnsi="Wingdings" w:hint="default"/>
+        <w:sz w:val="20"/>
+      </w:rPr>
+    </w:lvl>
+    <w:lvl w:ilvl="7" w:tentative="1">
+      <w:start w:val="1"/>
+      <w:numFmt w:val="bullet"/>
+      <w:lvlText w:val=""/>
+      <w:lvlJc w:val="left"/>
+      <w:pPr>
+        <w:tabs>
+          <w:tab w:val="num" w:pos="5760"/>
+        </w:tabs>
+        <w:ind w:left="5760" w:hanging="360"/>
+      </w:pPr>
+      <w:rPr>
+        <w:rFonts w:ascii="Wingdings" w:hAnsi="Wingdings" w:hint="default"/>
+        <w:sz w:val="20"/>
+      </w:rPr>
+    </w:lvl>
+    <w:lvl w:ilvl="8" w:tentative="1">
+      <w:start w:val="1"/>
+      <w:numFmt w:val="bullet"/>
+      <w:lvlText w:val=""/>
+      <w:lvlJc w:val="left"/>
+      <w:pPr>
+        <w:tabs>
+          <w:tab w:val="num" w:pos="6480"/>
+        </w:tabs>
+        <w:ind w:left="6480" w:hanging="360"/>
+      </w:pPr>
+      <w:rPr>
+        <w:rFonts w:ascii="Wingdings" w:hAnsi="Wingdings" w:hint="default"/>
+        <w:sz w:val="20"/>
+      </w:rPr>
+    </w:lvl>
+  </w:abstractNum>
+  <w:abstractNum w:abstractNumId="7" w15:restartNumberingAfterBreak="0">
     <w:nsid w:val="13316C92"/>
     <w:multiLevelType w:val="multilevel"/>
     <w:tmpl w:val="EDC41D04"/>
@@ -40517,7 +43767,7 @@
       </w:rPr>
     </w:lvl>
   </w:abstractNum>
-  <w:abstractNum w:abstractNumId="6" w15:restartNumberingAfterBreak="0">
+  <w:abstractNum w:abstractNumId="8" w15:restartNumberingAfterBreak="0">
     <w:nsid w:val="167665B9"/>
     <w:multiLevelType w:val="multilevel"/>
     <w:tmpl w:val="47BA2512"/>
@@ -40666,7 +43916,7 @@
       </w:rPr>
     </w:lvl>
   </w:abstractNum>
-  <w:abstractNum w:abstractNumId="7" w15:restartNumberingAfterBreak="0">
+  <w:abstractNum w:abstractNumId="9" w15:restartNumberingAfterBreak="0">
     <w:nsid w:val="19A0491A"/>
     <w:multiLevelType w:val="multilevel"/>
     <w:tmpl w:val="7AB4BC8E"/>
@@ -40815,7 +44065,152 @@
       </w:rPr>
     </w:lvl>
   </w:abstractNum>
-  <w:abstractNum w:abstractNumId="8" w15:restartNumberingAfterBreak="0">
+  <w:abstractNum w:abstractNumId="10" w15:restartNumberingAfterBreak="0">
+    <w:nsid w:val="1AEF0776"/>
+    <w:multiLevelType w:val="multilevel"/>
+    <w:tmpl w:val="C660FBF0"/>
+    <w:lvl w:ilvl="0">
+      <w:start w:val="1"/>
+      <w:numFmt w:val="bullet"/>
+      <w:lvlText w:val=""/>
+      <w:lvlJc w:val="left"/>
+      <w:pPr>
+        <w:tabs>
+          <w:tab w:val="num" w:pos="720"/>
+        </w:tabs>
+        <w:ind w:left="720" w:hanging="360"/>
+      </w:pPr>
+      <w:rPr>
+        <w:rFonts w:ascii="Symbol" w:hAnsi="Symbol" w:hint="default"/>
+        <w:sz w:val="20"/>
+      </w:rPr>
+    </w:lvl>
+    <w:lvl w:ilvl="1">
+      <w:start w:val="1"/>
+      <w:numFmt w:val="bullet"/>
+      <w:lvlText w:val="o"/>
+      <w:lvlJc w:val="left"/>
+      <w:pPr>
+        <w:tabs>
+          <w:tab w:val="num" w:pos="1440"/>
+        </w:tabs>
+        <w:ind w:left="1440" w:hanging="360"/>
+      </w:pPr>
+      <w:rPr>
+        <w:rFonts w:ascii="Courier New" w:hAnsi="Courier New" w:hint="default"/>
+        <w:sz w:val="20"/>
+      </w:rPr>
+    </w:lvl>
+    <w:lvl w:ilvl="2">
+      <w:start w:val="1"/>
+      <w:numFmt w:val="decimal"/>
+      <w:lvlText w:val="%3."/>
+      <w:lvlJc w:val="left"/>
+      <w:pPr>
+        <w:tabs>
+          <w:tab w:val="num" w:pos="2160"/>
+        </w:tabs>
+        <w:ind w:left="2160" w:hanging="360"/>
+      </w:pPr>
+    </w:lvl>
+    <w:lvl w:ilvl="3" w:tentative="1">
+      <w:start w:val="1"/>
+      <w:numFmt w:val="bullet"/>
+      <w:lvlText w:val=""/>
+      <w:lvlJc w:val="left"/>
+      <w:pPr>
+        <w:tabs>
+          <w:tab w:val="num" w:pos="2880"/>
+        </w:tabs>
+        <w:ind w:left="2880" w:hanging="360"/>
+      </w:pPr>
+      <w:rPr>
+        <w:rFonts w:ascii="Wingdings" w:hAnsi="Wingdings" w:hint="default"/>
+        <w:sz w:val="20"/>
+      </w:rPr>
+    </w:lvl>
+    <w:lvl w:ilvl="4" w:tentative="1">
+      <w:start w:val="1"/>
+      <w:numFmt w:val="bullet"/>
+      <w:lvlText w:val=""/>
+      <w:lvlJc w:val="left"/>
+      <w:pPr>
+        <w:tabs>
+          <w:tab w:val="num" w:pos="3600"/>
+        </w:tabs>
+        <w:ind w:left="3600" w:hanging="360"/>
+      </w:pPr>
+      <w:rPr>
+        <w:rFonts w:ascii="Wingdings" w:hAnsi="Wingdings" w:hint="default"/>
+        <w:sz w:val="20"/>
+      </w:rPr>
+    </w:lvl>
+    <w:lvl w:ilvl="5" w:tentative="1">
+      <w:start w:val="1"/>
+      <w:numFmt w:val="bullet"/>
+      <w:lvlText w:val=""/>
+      <w:lvlJc w:val="left"/>
+      <w:pPr>
+        <w:tabs>
+          <w:tab w:val="num" w:pos="4320"/>
+        </w:tabs>
+        <w:ind w:left="4320" w:hanging="360"/>
+      </w:pPr>
+      <w:rPr>
+        <w:rFonts w:ascii="Wingdings" w:hAnsi="Wingdings" w:hint="default"/>
+        <w:sz w:val="20"/>
+      </w:rPr>
+    </w:lvl>
+    <w:lvl w:ilvl="6" w:tentative="1">
+      <w:start w:val="1"/>
+      <w:numFmt w:val="bullet"/>
+      <w:lvlText w:val=""/>
+      <w:lvlJc w:val="left"/>
+      <w:pPr>
+        <w:tabs>
+          <w:tab w:val="num" w:pos="5040"/>
+        </w:tabs>
+        <w:ind w:left="5040" w:hanging="360"/>
+      </w:pPr>
+      <w:rPr>
+        <w:rFonts w:ascii="Wingdings" w:hAnsi="Wingdings" w:hint="default"/>
+        <w:sz w:val="20"/>
+      </w:rPr>
+    </w:lvl>
+    <w:lvl w:ilvl="7" w:tentative="1">
+      <w:start w:val="1"/>
+      <w:numFmt w:val="bullet"/>
+      <w:lvlText w:val=""/>
+      <w:lvlJc w:val="left"/>
+      <w:pPr>
+        <w:tabs>
+          <w:tab w:val="num" w:pos="5760"/>
+        </w:tabs>
+        <w:ind w:left="5760" w:hanging="360"/>
+      </w:pPr>
+      <w:rPr>
+        <w:rFonts w:ascii="Wingdings" w:hAnsi="Wingdings" w:hint="default"/>
+        <w:sz w:val="20"/>
+      </w:rPr>
+    </w:lvl>
+    <w:lvl w:ilvl="8" w:tentative="1">
+      <w:start w:val="1"/>
+      <w:numFmt w:val="bullet"/>
+      <w:lvlText w:val=""/>
+      <w:lvlJc w:val="left"/>
+      <w:pPr>
+        <w:tabs>
+          <w:tab w:val="num" w:pos="6480"/>
+        </w:tabs>
+        <w:ind w:left="6480" w:hanging="360"/>
+      </w:pPr>
+      <w:rPr>
+        <w:rFonts w:ascii="Wingdings" w:hAnsi="Wingdings" w:hint="default"/>
+        <w:sz w:val="20"/>
+      </w:rPr>
+    </w:lvl>
+  </w:abstractNum>
+  <w:abstractNum w:abstractNumId="11" w15:restartNumberingAfterBreak="0">
     <w:nsid w:val="20307937"/>
     <w:multiLevelType w:val="multilevel"/>
     <w:tmpl w:val="098ED47C"/>
@@ -40964,7 +44359,7 @@
       </w:rPr>
     </w:lvl>
   </w:abstractNum>
-  <w:abstractNum w:abstractNumId="9" w15:restartNumberingAfterBreak="0">
+  <w:abstractNum w:abstractNumId="12" w15:restartNumberingAfterBreak="0">
     <w:nsid w:val="205632E0"/>
     <w:multiLevelType w:val="multilevel"/>
     <w:tmpl w:val="FD3EFC26"/>
@@ -41113,7 +44508,7 @@
       </w:rPr>
     </w:lvl>
   </w:abstractNum>
-  <w:abstractNum w:abstractNumId="10" w15:restartNumberingAfterBreak="0">
+  <w:abstractNum w:abstractNumId="13" w15:restartNumberingAfterBreak="0">
     <w:nsid w:val="26BC438B"/>
     <w:multiLevelType w:val="multilevel"/>
     <w:tmpl w:val="F11A37CE"/>
@@ -41262,7 +44657,7 @@
       </w:rPr>
     </w:lvl>
   </w:abstractNum>
-  <w:abstractNum w:abstractNumId="11" w15:restartNumberingAfterBreak="0">
+  <w:abstractNum w:abstractNumId="14" w15:restartNumberingAfterBreak="0">
     <w:nsid w:val="271041A4"/>
     <w:multiLevelType w:val="multilevel"/>
     <w:tmpl w:val="F63CF5CE"/>
@@ -41411,7 +44806,7 @@
       </w:rPr>
     </w:lvl>
   </w:abstractNum>
-  <w:abstractNum w:abstractNumId="12" w15:restartNumberingAfterBreak="0">
+  <w:abstractNum w:abstractNumId="15" w15:restartNumberingAfterBreak="0">
     <w:nsid w:val="30752863"/>
     <w:multiLevelType w:val="multilevel"/>
     <w:tmpl w:val="3600288C"/>
@@ -41524,7 +44919,7 @@
       </w:pPr>
     </w:lvl>
   </w:abstractNum>
-  <w:abstractNum w:abstractNumId="13" w15:restartNumberingAfterBreak="0">
+  <w:abstractNum w:abstractNumId="16" w15:restartNumberingAfterBreak="0">
     <w:nsid w:val="37D771B8"/>
     <w:multiLevelType w:val="multilevel"/>
     <w:tmpl w:val="BEC4058A"/>
@@ -41673,7 +45068,7 @@
       </w:rPr>
     </w:lvl>
   </w:abstractNum>
-  <w:abstractNum w:abstractNumId="14" w15:restartNumberingAfterBreak="0">
+  <w:abstractNum w:abstractNumId="17" w15:restartNumberingAfterBreak="0">
     <w:nsid w:val="3F712458"/>
     <w:multiLevelType w:val="multilevel"/>
     <w:tmpl w:val="119CF06C"/>
@@ -41822,7 +45217,156 @@
       </w:rPr>
     </w:lvl>
   </w:abstractNum>
-  <w:abstractNum w:abstractNumId="15" w15:restartNumberingAfterBreak="0">
+  <w:abstractNum w:abstractNumId="18" w15:restartNumberingAfterBreak="0">
+    <w:nsid w:val="3F9B64C9"/>
+    <w:multiLevelType w:val="multilevel"/>
+    <w:tmpl w:val="7E3AD654"/>
+    <w:lvl w:ilvl="0">
+      <w:start w:val="1"/>
+      <w:numFmt w:val="bullet"/>
+      <w:lvlText w:val=""/>
+      <w:lvlJc w:val="left"/>
+      <w:pPr>
+        <w:tabs>
+          <w:tab w:val="num" w:pos="720"/>
+        </w:tabs>
+        <w:ind w:left="720" w:hanging="360"/>
+      </w:pPr>
+      <w:rPr>
+        <w:rFonts w:ascii="Symbol" w:hAnsi="Symbol" w:hint="default"/>
+        <w:sz w:val="20"/>
+      </w:rPr>
+    </w:lvl>
+    <w:lvl w:ilvl="1">
+      <w:start w:val="1"/>
+      <w:numFmt w:val="bullet"/>
+      <w:lvlText w:val="o"/>
+      <w:lvlJc w:val="left"/>
+      <w:pPr>
+        <w:tabs>
+          <w:tab w:val="num" w:pos="1440"/>
+        </w:tabs>
+        <w:ind w:left="1440" w:hanging="360"/>
+      </w:pPr>
+      <w:rPr>
+        <w:rFonts w:ascii="Courier New" w:hAnsi="Courier New" w:hint="default"/>
+        <w:sz w:val="20"/>
+      </w:rPr>
+    </w:lvl>
+    <w:lvl w:ilvl="2">
+      <w:start w:val="1"/>
+      <w:numFmt w:val="bullet"/>
+      <w:lvlText w:val=""/>
+      <w:lvlJc w:val="left"/>
+      <w:pPr>
+        <w:tabs>
+          <w:tab w:val="num" w:pos="2160"/>
+        </w:tabs>
+        <w:ind w:left="2160" w:hanging="360"/>
+      </w:pPr>
+      <w:rPr>
+        <w:rFonts w:ascii="Wingdings" w:hAnsi="Wingdings" w:hint="default"/>
+        <w:sz w:val="20"/>
+      </w:rPr>
+    </w:lvl>
+    <w:lvl w:ilvl="3" w:tentative="1">
+      <w:start w:val="1"/>
+      <w:numFmt w:val="bullet"/>
+      <w:lvlText w:val=""/>
+      <w:lvlJc w:val="left"/>
+      <w:pPr>
+        <w:tabs>
+          <w:tab w:val="num" w:pos="2880"/>
+        </w:tabs>
+        <w:ind w:left="2880" w:hanging="360"/>
+      </w:pPr>
+      <w:rPr>
+        <w:rFonts w:ascii="Wingdings" w:hAnsi="Wingdings" w:hint="default"/>
+        <w:sz w:val="20"/>
+      </w:rPr>
+    </w:lvl>
+    <w:lvl w:ilvl="4" w:tentative="1">
+      <w:start w:val="1"/>
+      <w:numFmt w:val="bullet"/>
+      <w:lvlText w:val=""/>
+      <w:lvlJc w:val="left"/>
+      <w:pPr>
+        <w:tabs>
+          <w:tab w:val="num" w:pos="3600"/>
+        </w:tabs>
+        <w:ind w:left="3600" w:hanging="360"/>
+      </w:pPr>
+      <w:rPr>
+        <w:rFonts w:ascii="Wingdings" w:hAnsi="Wingdings" w:hint="default"/>
+        <w:sz w:val="20"/>
+      </w:rPr>
+    </w:lvl>
+    <w:lvl w:ilvl="5" w:tentative="1">
+      <w:start w:val="1"/>
+      <w:numFmt w:val="bullet"/>
+      <w:lvlText w:val=""/>
+      <w:lvlJc w:val="left"/>
+      <w:pPr>
+        <w:tabs>
+          <w:tab w:val="num" w:pos="4320"/>
+        </w:tabs>
+        <w:ind w:left="4320" w:hanging="360"/>
+      </w:pPr>
+      <w:rPr>
+        <w:rFonts w:ascii="Wingdings" w:hAnsi="Wingdings" w:hint="default"/>
+        <w:sz w:val="20"/>
+      </w:rPr>
+    </w:lvl>
+    <w:lvl w:ilvl="6" w:tentative="1">
+      <w:start w:val="1"/>
+      <w:numFmt w:val="bullet"/>
+      <w:lvlText w:val=""/>
+      <w:lvlJc w:val="left"/>
+      <w:pPr>
+        <w:tabs>
+          <w:tab w:val="num" w:pos="5040"/>
+        </w:tabs>
+        <w:ind w:left="5040" w:hanging="360"/>
+      </w:pPr>
+      <w:rPr>
+        <w:rFonts w:ascii="Wingdings" w:hAnsi="Wingdings" w:hint="default"/>
+        <w:sz w:val="20"/>
+      </w:rPr>
+    </w:lvl>
+    <w:lvl w:ilvl="7" w:tentative="1">
+      <w:start w:val="1"/>
+      <w:numFmt w:val="bullet"/>
+      <w:lvlText w:val=""/>
+      <w:lvlJc w:val="left"/>
+      <w:pPr>
+        <w:tabs>
+          <w:tab w:val="num" w:pos="5760"/>
+        </w:tabs>
+        <w:ind w:left="5760" w:hanging="360"/>
+      </w:pPr>
+      <w:rPr>
+        <w:rFonts w:ascii="Wingdings" w:hAnsi="Wingdings" w:hint="default"/>
+        <w:sz w:val="20"/>
+      </w:rPr>
+    </w:lvl>
+    <w:lvl w:ilvl="8" w:tentative="1">
+      <w:start w:val="1"/>
+      <w:numFmt w:val="bullet"/>
+      <w:lvlText w:val=""/>
+      <w:lvlJc w:val="left"/>
+      <w:pPr>
+        <w:tabs>
+          <w:tab w:val="num" w:pos="6480"/>
+        </w:tabs>
+        <w:ind w:left="6480" w:hanging="360"/>
+      </w:pPr>
+      <w:rPr>
+        <w:rFonts w:ascii="Wingdings" w:hAnsi="Wingdings" w:hint="default"/>
+        <w:sz w:val="20"/>
+      </w:rPr>
+    </w:lvl>
+  </w:abstractNum>
+  <w:abstractNum w:abstractNumId="19" w15:restartNumberingAfterBreak="0">
     <w:nsid w:val="44775DF2"/>
     <w:multiLevelType w:val="multilevel"/>
     <w:tmpl w:val="B19E7EEE"/>
@@ -41971,7 +45515,7 @@
       </w:rPr>
     </w:lvl>
   </w:abstractNum>
-  <w:abstractNum w:abstractNumId="16" w15:restartNumberingAfterBreak="0">
+  <w:abstractNum w:abstractNumId="20" w15:restartNumberingAfterBreak="0">
     <w:nsid w:val="454C2989"/>
     <w:multiLevelType w:val="multilevel"/>
     <w:tmpl w:val="707816C2"/>
@@ -42084,7 +45628,7 @@
       </w:pPr>
     </w:lvl>
   </w:abstractNum>
-  <w:abstractNum w:abstractNumId="17" w15:restartNumberingAfterBreak="0">
+  <w:abstractNum w:abstractNumId="21" w15:restartNumberingAfterBreak="0">
     <w:nsid w:val="475E371E"/>
     <w:multiLevelType w:val="multilevel"/>
     <w:tmpl w:val="8FC4FC0E"/>
@@ -42233,7 +45777,7 @@
       </w:rPr>
     </w:lvl>
   </w:abstractNum>
-  <w:abstractNum w:abstractNumId="18" w15:restartNumberingAfterBreak="0">
+  <w:abstractNum w:abstractNumId="22" w15:restartNumberingAfterBreak="0">
     <w:nsid w:val="485D5154"/>
     <w:multiLevelType w:val="multilevel"/>
     <w:tmpl w:val="7BB8D4CC"/>
@@ -42382,7 +45926,7 @@
       </w:rPr>
     </w:lvl>
   </w:abstractNum>
-  <w:abstractNum w:abstractNumId="19" w15:restartNumberingAfterBreak="0">
+  <w:abstractNum w:abstractNumId="23" w15:restartNumberingAfterBreak="0">
     <w:nsid w:val="488A2A18"/>
     <w:multiLevelType w:val="multilevel"/>
     <w:tmpl w:val="35A09B12"/>
@@ -42531,7 +46075,7 @@
       </w:rPr>
     </w:lvl>
   </w:abstractNum>
-  <w:abstractNum w:abstractNumId="20" w15:restartNumberingAfterBreak="0">
+  <w:abstractNum w:abstractNumId="24" w15:restartNumberingAfterBreak="0">
     <w:nsid w:val="492C6B88"/>
     <w:multiLevelType w:val="multilevel"/>
     <w:tmpl w:val="0D3879CE"/>
@@ -42680,7 +46224,7 @@
       </w:rPr>
     </w:lvl>
   </w:abstractNum>
-  <w:abstractNum w:abstractNumId="21" w15:restartNumberingAfterBreak="0">
+  <w:abstractNum w:abstractNumId="25" w15:restartNumberingAfterBreak="0">
     <w:nsid w:val="4AD35524"/>
     <w:multiLevelType w:val="multilevel"/>
     <w:tmpl w:val="FB3A666C"/>
@@ -42829,7 +46373,7 @@
       </w:rPr>
     </w:lvl>
   </w:abstractNum>
-  <w:abstractNum w:abstractNumId="22" w15:restartNumberingAfterBreak="0">
+  <w:abstractNum w:abstractNumId="26" w15:restartNumberingAfterBreak="0">
     <w:nsid w:val="4B443AB3"/>
     <w:multiLevelType w:val="multilevel"/>
     <w:tmpl w:val="45B83494"/>
@@ -42978,7 +46522,7 @@
       </w:rPr>
     </w:lvl>
   </w:abstractNum>
-  <w:abstractNum w:abstractNumId="23" w15:restartNumberingAfterBreak="0">
+  <w:abstractNum w:abstractNumId="27" w15:restartNumberingAfterBreak="0">
     <w:nsid w:val="4B8A2132"/>
     <w:multiLevelType w:val="multilevel"/>
     <w:tmpl w:val="6090D214"/>
@@ -43127,7 +46671,7 @@
       </w:rPr>
     </w:lvl>
   </w:abstractNum>
-  <w:abstractNum w:abstractNumId="24" w15:restartNumberingAfterBreak="0">
+  <w:abstractNum w:abstractNumId="28" w15:restartNumberingAfterBreak="0">
     <w:nsid w:val="4E042705"/>
     <w:multiLevelType w:val="multilevel"/>
     <w:tmpl w:val="5832F920"/>
@@ -43276,7 +46820,7 @@
       </w:rPr>
     </w:lvl>
   </w:abstractNum>
-  <w:abstractNum w:abstractNumId="25" w15:restartNumberingAfterBreak="0">
+  <w:abstractNum w:abstractNumId="29" w15:restartNumberingAfterBreak="0">
     <w:nsid w:val="56943D38"/>
     <w:multiLevelType w:val="multilevel"/>
     <w:tmpl w:val="7F48705E"/>
@@ -43389,7 +46933,7 @@
       </w:pPr>
     </w:lvl>
   </w:abstractNum>
-  <w:abstractNum w:abstractNumId="26" w15:restartNumberingAfterBreak="0">
+  <w:abstractNum w:abstractNumId="30" w15:restartNumberingAfterBreak="0">
     <w:nsid w:val="5E9A0932"/>
     <w:multiLevelType w:val="multilevel"/>
     <w:tmpl w:val="EC6465FC"/>
@@ -43538,7 +47082,7 @@
       </w:rPr>
     </w:lvl>
   </w:abstractNum>
-  <w:abstractNum w:abstractNumId="27" w15:restartNumberingAfterBreak="0">
+  <w:abstractNum w:abstractNumId="31" w15:restartNumberingAfterBreak="0">
     <w:nsid w:val="61E02C96"/>
     <w:multiLevelType w:val="multilevel"/>
     <w:tmpl w:val="7A2442DE"/>
@@ -43687,7 +47231,7 @@
       </w:rPr>
     </w:lvl>
   </w:abstractNum>
-  <w:abstractNum w:abstractNumId="28" w15:restartNumberingAfterBreak="0">
+  <w:abstractNum w:abstractNumId="32" w15:restartNumberingAfterBreak="0">
     <w:nsid w:val="61E54955"/>
     <w:multiLevelType w:val="multilevel"/>
     <w:tmpl w:val="20E2E3AA"/>
@@ -43836,7 +47380,7 @@
       </w:rPr>
     </w:lvl>
   </w:abstractNum>
-  <w:abstractNum w:abstractNumId="29" w15:restartNumberingAfterBreak="0">
+  <w:abstractNum w:abstractNumId="33" w15:restartNumberingAfterBreak="0">
     <w:nsid w:val="622855B4"/>
     <w:multiLevelType w:val="multilevel"/>
     <w:tmpl w:val="4EA0A6D4"/>
@@ -43949,7 +47493,7 @@
       </w:pPr>
     </w:lvl>
   </w:abstractNum>
-  <w:abstractNum w:abstractNumId="30" w15:restartNumberingAfterBreak="0">
+  <w:abstractNum w:abstractNumId="34" w15:restartNumberingAfterBreak="0">
     <w:nsid w:val="623F66A7"/>
     <w:multiLevelType w:val="multilevel"/>
     <w:tmpl w:val="C3226CDA"/>
@@ -44098,7 +47642,7 @@
       </w:rPr>
     </w:lvl>
   </w:abstractNum>
-  <w:abstractNum w:abstractNumId="31" w15:restartNumberingAfterBreak="0">
+  <w:abstractNum w:abstractNumId="35" w15:restartNumberingAfterBreak="0">
     <w:nsid w:val="62EA6A97"/>
     <w:multiLevelType w:val="multilevel"/>
     <w:tmpl w:val="07ACD11A"/>
@@ -44247,7 +47791,156 @@
       </w:rPr>
     </w:lvl>
   </w:abstractNum>
-  <w:abstractNum w:abstractNumId="32" w15:restartNumberingAfterBreak="0">
+  <w:abstractNum w:abstractNumId="36" w15:restartNumberingAfterBreak="0">
+    <w:nsid w:val="638E1453"/>
+    <w:multiLevelType w:val="multilevel"/>
+    <w:tmpl w:val="BC605E92"/>
+    <w:lvl w:ilvl="0">
+      <w:start w:val="1"/>
+      <w:numFmt w:val="bullet"/>
+      <w:lvlText w:val=""/>
+      <w:lvlJc w:val="left"/>
+      <w:pPr>
+        <w:tabs>
+          <w:tab w:val="num" w:pos="720"/>
+        </w:tabs>
+        <w:ind w:left="720" w:hanging="360"/>
+      </w:pPr>
+      <w:rPr>
+        <w:rFonts w:ascii="Symbol" w:hAnsi="Symbol" w:hint="default"/>
+        <w:sz w:val="20"/>
+      </w:rPr>
+    </w:lvl>
+    <w:lvl w:ilvl="1">
+      <w:start w:val="1"/>
+      <w:numFmt w:val="bullet"/>
+      <w:lvlText w:val="o"/>
+      <w:lvlJc w:val="left"/>
+      <w:pPr>
+        <w:tabs>
+          <w:tab w:val="num" w:pos="1440"/>
+        </w:tabs>
+        <w:ind w:left="1440" w:hanging="360"/>
+      </w:pPr>
+      <w:rPr>
+        <w:rFonts w:ascii="Courier New" w:hAnsi="Courier New" w:hint="default"/>
+        <w:sz w:val="20"/>
+      </w:rPr>
+    </w:lvl>
+    <w:lvl w:ilvl="2" w:tentative="1">
+      <w:start w:val="1"/>
+      <w:numFmt w:val="bullet"/>
+      <w:lvlText w:val=""/>
+      <w:lvlJc w:val="left"/>
+      <w:pPr>
+        <w:tabs>
+          <w:tab w:val="num" w:pos="2160"/>
+        </w:tabs>
+        <w:ind w:left="2160" w:hanging="360"/>
+      </w:pPr>
+      <w:rPr>
+        <w:rFonts w:ascii="Wingdings" w:hAnsi="Wingdings" w:hint="default"/>
+        <w:sz w:val="20"/>
+      </w:rPr>
+    </w:lvl>
+    <w:lvl w:ilvl="3" w:tentative="1">
+      <w:start w:val="1"/>
+      <w:numFmt w:val="bullet"/>
+      <w:lvlText w:val=""/>
+      <w:lvlJc w:val="left"/>
+      <w:pPr>
+        <w:tabs>
+          <w:tab w:val="num" w:pos="2880"/>
+        </w:tabs>
+        <w:ind w:left="2880" w:hanging="360"/>
+      </w:pPr>
+      <w:rPr>
+        <w:rFonts w:ascii="Wingdings" w:hAnsi="Wingdings" w:hint="default"/>
+        <w:sz w:val="20"/>
+      </w:rPr>
+    </w:lvl>
+    <w:lvl w:ilvl="4" w:tentative="1">
+      <w:start w:val="1"/>
+      <w:numFmt w:val="bullet"/>
+      <w:lvlText w:val=""/>
+      <w:lvlJc w:val="left"/>
+      <w:pPr>
+        <w:tabs>
+          <w:tab w:val="num" w:pos="3600"/>
+        </w:tabs>
+        <w:ind w:left="3600" w:hanging="360"/>
+      </w:pPr>
+      <w:rPr>
+        <w:rFonts w:ascii="Wingdings" w:hAnsi="Wingdings" w:hint="default"/>
+        <w:sz w:val="20"/>
+      </w:rPr>
+    </w:lvl>
+    <w:lvl w:ilvl="5" w:tentative="1">
+      <w:start w:val="1"/>
+      <w:numFmt w:val="bullet"/>
+      <w:lvlText w:val=""/>
+      <w:lvlJc w:val="left"/>
+      <w:pPr>
+        <w:tabs>
+          <w:tab w:val="num" w:pos="4320"/>
+        </w:tabs>
+        <w:ind w:left="4320" w:hanging="360"/>
+      </w:pPr>
+      <w:rPr>
+        <w:rFonts w:ascii="Wingdings" w:hAnsi="Wingdings" w:hint="default"/>
+        <w:sz w:val="20"/>
+      </w:rPr>
+    </w:lvl>
+    <w:lvl w:ilvl="6" w:tentative="1">
+      <w:start w:val="1"/>
+      <w:numFmt w:val="bullet"/>
+      <w:lvlText w:val=""/>
+      <w:lvlJc w:val="left"/>
+      <w:pPr>
+        <w:tabs>
+          <w:tab w:val="num" w:pos="5040"/>
+        </w:tabs>
+        <w:ind w:left="5040" w:hanging="360"/>
+      </w:pPr>
+      <w:rPr>
+        <w:rFonts w:ascii="Wingdings" w:hAnsi="Wingdings" w:hint="default"/>
+        <w:sz w:val="20"/>
+      </w:rPr>
+    </w:lvl>
+    <w:lvl w:ilvl="7" w:tentative="1">
+      <w:start w:val="1"/>
+      <w:numFmt w:val="bullet"/>
+      <w:lvlText w:val=""/>
+      <w:lvlJc w:val="left"/>
+      <w:pPr>
+        <w:tabs>
+          <w:tab w:val="num" w:pos="5760"/>
+        </w:tabs>
+        <w:ind w:left="5760" w:hanging="360"/>
+      </w:pPr>
+      <w:rPr>
+        <w:rFonts w:ascii="Wingdings" w:hAnsi="Wingdings" w:hint="default"/>
+        <w:sz w:val="20"/>
+      </w:rPr>
+    </w:lvl>
+    <w:lvl w:ilvl="8" w:tentative="1">
+      <w:start w:val="1"/>
+      <w:numFmt w:val="bullet"/>
+      <w:lvlText w:val=""/>
+      <w:lvlJc w:val="left"/>
+      <w:pPr>
+        <w:tabs>
+          <w:tab w:val="num" w:pos="6480"/>
+        </w:tabs>
+        <w:ind w:left="6480" w:hanging="360"/>
+      </w:pPr>
+      <w:rPr>
+        <w:rFonts w:ascii="Wingdings" w:hAnsi="Wingdings" w:hint="default"/>
+        <w:sz w:val="20"/>
+      </w:rPr>
+    </w:lvl>
+  </w:abstractNum>
+  <w:abstractNum w:abstractNumId="37" w15:restartNumberingAfterBreak="0">
     <w:nsid w:val="64027CC0"/>
     <w:multiLevelType w:val="multilevel"/>
     <w:tmpl w:val="2B36F9E6"/>
@@ -44392,7 +48085,7 @@
       </w:rPr>
     </w:lvl>
   </w:abstractNum>
-  <w:abstractNum w:abstractNumId="33" w15:restartNumberingAfterBreak="0">
+  <w:abstractNum w:abstractNumId="38" w15:restartNumberingAfterBreak="0">
     <w:nsid w:val="653448CF"/>
     <w:multiLevelType w:val="multilevel"/>
     <w:tmpl w:val="FC40D69A"/>
@@ -44541,7 +48234,7 @@
       </w:rPr>
     </w:lvl>
   </w:abstractNum>
-  <w:abstractNum w:abstractNumId="34" w15:restartNumberingAfterBreak="0">
+  <w:abstractNum w:abstractNumId="39" w15:restartNumberingAfterBreak="0">
     <w:nsid w:val="679B0233"/>
     <w:multiLevelType w:val="multilevel"/>
     <w:tmpl w:val="312020A4"/>
@@ -44690,7 +48383,7 @@
       </w:rPr>
     </w:lvl>
   </w:abstractNum>
-  <w:abstractNum w:abstractNumId="35" w15:restartNumberingAfterBreak="0">
+  <w:abstractNum w:abstractNumId="40" w15:restartNumberingAfterBreak="0">
     <w:nsid w:val="68B23748"/>
     <w:multiLevelType w:val="multilevel"/>
     <w:tmpl w:val="0F00F4EC"/>
@@ -44839,7 +48532,7 @@
       </w:rPr>
     </w:lvl>
   </w:abstractNum>
-  <w:abstractNum w:abstractNumId="36" w15:restartNumberingAfterBreak="0">
+  <w:abstractNum w:abstractNumId="41" w15:restartNumberingAfterBreak="0">
     <w:nsid w:val="6A18728E"/>
     <w:multiLevelType w:val="multilevel"/>
     <w:tmpl w:val="0D5E11C4"/>
@@ -44988,7 +48681,156 @@
       </w:rPr>
     </w:lvl>
   </w:abstractNum>
-  <w:abstractNum w:abstractNumId="37" w15:restartNumberingAfterBreak="0">
+  <w:abstractNum w:abstractNumId="42" w15:restartNumberingAfterBreak="0">
+    <w:nsid w:val="6BC93EDD"/>
+    <w:multiLevelType w:val="multilevel"/>
+    <w:tmpl w:val="F0580D14"/>
+    <w:lvl w:ilvl="0">
+      <w:start w:val="1"/>
+      <w:numFmt w:val="bullet"/>
+      <w:lvlText w:val=""/>
+      <w:lvlJc w:val="left"/>
+      <w:pPr>
+        <w:tabs>
+          <w:tab w:val="num" w:pos="720"/>
+        </w:tabs>
+        <w:ind w:left="720" w:hanging="360"/>
+      </w:pPr>
+      <w:rPr>
+        <w:rFonts w:ascii="Symbol" w:hAnsi="Symbol" w:hint="default"/>
+        <w:sz w:val="20"/>
+      </w:rPr>
+    </w:lvl>
+    <w:lvl w:ilvl="1">
+      <w:start w:val="1"/>
+      <w:numFmt w:val="bullet"/>
+      <w:lvlText w:val="o"/>
+      <w:lvlJc w:val="left"/>
+      <w:pPr>
+        <w:tabs>
+          <w:tab w:val="num" w:pos="1440"/>
+        </w:tabs>
+        <w:ind w:left="1440" w:hanging="360"/>
+      </w:pPr>
+      <w:rPr>
+        <w:rFonts w:ascii="Courier New" w:hAnsi="Courier New" w:hint="default"/>
+        <w:sz w:val="20"/>
+      </w:rPr>
+    </w:lvl>
+    <w:lvl w:ilvl="2">
+      <w:start w:val="1"/>
+      <w:numFmt w:val="bullet"/>
+      <w:lvlText w:val=""/>
+      <w:lvlJc w:val="left"/>
+      <w:pPr>
+        <w:tabs>
+          <w:tab w:val="num" w:pos="2160"/>
+        </w:tabs>
+        <w:ind w:left="2160" w:hanging="360"/>
+      </w:pPr>
+      <w:rPr>
+        <w:rFonts w:ascii="Wingdings" w:hAnsi="Wingdings" w:hint="default"/>
+        <w:sz w:val="20"/>
+      </w:rPr>
+    </w:lvl>
+    <w:lvl w:ilvl="3" w:tentative="1">
+      <w:start w:val="1"/>
+      <w:numFmt w:val="bullet"/>
+      <w:lvlText w:val=""/>
+      <w:lvlJc w:val="left"/>
+      <w:pPr>
+        <w:tabs>
+          <w:tab w:val="num" w:pos="2880"/>
+        </w:tabs>
+        <w:ind w:left="2880" w:hanging="360"/>
+      </w:pPr>
+      <w:rPr>
+        <w:rFonts w:ascii="Wingdings" w:hAnsi="Wingdings" w:hint="default"/>
+        <w:sz w:val="20"/>
+      </w:rPr>
+    </w:lvl>
+    <w:lvl w:ilvl="4" w:tentative="1">
+      <w:start w:val="1"/>
+      <w:numFmt w:val="bullet"/>
+      <w:lvlText w:val=""/>
+      <w:lvlJc w:val="left"/>
+      <w:pPr>
+        <w:tabs>
+          <w:tab w:val="num" w:pos="3600"/>
+        </w:tabs>
+        <w:ind w:left="3600" w:hanging="360"/>
+      </w:pPr>
+      <w:rPr>
+        <w:rFonts w:ascii="Wingdings" w:hAnsi="Wingdings" w:hint="default"/>
+        <w:sz w:val="20"/>
+      </w:rPr>
+    </w:lvl>
+    <w:lvl w:ilvl="5" w:tentative="1">
+      <w:start w:val="1"/>
+      <w:numFmt w:val="bullet"/>
+      <w:lvlText w:val=""/>
+      <w:lvlJc w:val="left"/>
+      <w:pPr>
+        <w:tabs>
+          <w:tab w:val="num" w:pos="4320"/>
+        </w:tabs>
+        <w:ind w:left="4320" w:hanging="360"/>
+      </w:pPr>
+      <w:rPr>
+        <w:rFonts w:ascii="Wingdings" w:hAnsi="Wingdings" w:hint="default"/>
+        <w:sz w:val="20"/>
+      </w:rPr>
+    </w:lvl>
+    <w:lvl w:ilvl="6" w:tentative="1">
+      <w:start w:val="1"/>
+      <w:numFmt w:val="bullet"/>
+      <w:lvlText w:val=""/>
+      <w:lvlJc w:val="left"/>
+      <w:pPr>
+        <w:tabs>
+          <w:tab w:val="num" w:pos="5040"/>
+        </w:tabs>
+        <w:ind w:left="5040" w:hanging="360"/>
+      </w:pPr>
+      <w:rPr>
+        <w:rFonts w:ascii="Wingdings" w:hAnsi="Wingdings" w:hint="default"/>
+        <w:sz w:val="20"/>
+      </w:rPr>
+    </w:lvl>
+    <w:lvl w:ilvl="7" w:tentative="1">
+      <w:start w:val="1"/>
+      <w:numFmt w:val="bullet"/>
+      <w:lvlText w:val=""/>
+      <w:lvlJc w:val="left"/>
+      <w:pPr>
+        <w:tabs>
+          <w:tab w:val="num" w:pos="5760"/>
+        </w:tabs>
+        <w:ind w:left="5760" w:hanging="360"/>
+      </w:pPr>
+      <w:rPr>
+        <w:rFonts w:ascii="Wingdings" w:hAnsi="Wingdings" w:hint="default"/>
+        <w:sz w:val="20"/>
+      </w:rPr>
+    </w:lvl>
+    <w:lvl w:ilvl="8" w:tentative="1">
+      <w:start w:val="1"/>
+      <w:numFmt w:val="bullet"/>
+      <w:lvlText w:val=""/>
+      <w:lvlJc w:val="left"/>
+      <w:pPr>
+        <w:tabs>
+          <w:tab w:val="num" w:pos="6480"/>
+        </w:tabs>
+        <w:ind w:left="6480" w:hanging="360"/>
+      </w:pPr>
+      <w:rPr>
+        <w:rFonts w:ascii="Wingdings" w:hAnsi="Wingdings" w:hint="default"/>
+        <w:sz w:val="20"/>
+      </w:rPr>
+    </w:lvl>
+  </w:abstractNum>
+  <w:abstractNum w:abstractNumId="43" w15:restartNumberingAfterBreak="0">
     <w:nsid w:val="77217981"/>
     <w:multiLevelType w:val="multilevel"/>
     <w:tmpl w:val="2012A6E4"/>
@@ -45101,7 +48943,7 @@
       </w:pPr>
     </w:lvl>
   </w:abstractNum>
-  <w:abstractNum w:abstractNumId="38" w15:restartNumberingAfterBreak="0">
+  <w:abstractNum w:abstractNumId="44" w15:restartNumberingAfterBreak="0">
     <w:nsid w:val="77321159"/>
     <w:multiLevelType w:val="multilevel"/>
     <w:tmpl w:val="8DE06702"/>
@@ -45250,7 +49092,7 @@
       </w:rPr>
     </w:lvl>
   </w:abstractNum>
-  <w:abstractNum w:abstractNumId="39" w15:restartNumberingAfterBreak="0">
+  <w:abstractNum w:abstractNumId="45" w15:restartNumberingAfterBreak="0">
     <w:nsid w:val="796A38C5"/>
     <w:multiLevelType w:val="hybridMultilevel"/>
     <w:tmpl w:val="1404469E"/>
@@ -45363,7 +49205,7 @@
       </w:rPr>
     </w:lvl>
   </w:abstractNum>
-  <w:abstractNum w:abstractNumId="40" w15:restartNumberingAfterBreak="0">
+  <w:abstractNum w:abstractNumId="46" w15:restartNumberingAfterBreak="0">
     <w:nsid w:val="7CA942BD"/>
     <w:multiLevelType w:val="multilevel"/>
     <w:tmpl w:val="0B16B2FA"/>
@@ -45512,7 +49354,7 @@
       </w:rPr>
     </w:lvl>
   </w:abstractNum>
-  <w:abstractNum w:abstractNumId="41" w15:restartNumberingAfterBreak="0">
+  <w:abstractNum w:abstractNumId="47" w15:restartNumberingAfterBreak="0">
     <w:nsid w:val="7D921E58"/>
     <w:multiLevelType w:val="multilevel"/>
     <w:tmpl w:val="93EA13F8"/>
@@ -45661,7 +49503,7 @@
       </w:rPr>
     </w:lvl>
   </w:abstractNum>
-  <w:abstractNum w:abstractNumId="42" w15:restartNumberingAfterBreak="0">
+  <w:abstractNum w:abstractNumId="48" w15:restartNumberingAfterBreak="0">
     <w:nsid w:val="7F0A6A47"/>
     <w:multiLevelType w:val="multilevel"/>
     <w:tmpl w:val="EEAA81D8"/>
@@ -45810,7 +49652,7 @@
       </w:rPr>
     </w:lvl>
   </w:abstractNum>
-  <w:abstractNum w:abstractNumId="43" w15:restartNumberingAfterBreak="0">
+  <w:abstractNum w:abstractNumId="49" w15:restartNumberingAfterBreak="0">
     <w:nsid w:val="7F55327D"/>
     <w:multiLevelType w:val="multilevel"/>
     <w:tmpl w:val="3CE0C7E0"/>
@@ -45960,136 +49802,154 @@
     </w:lvl>
   </w:abstractNum>
   <w:num w:numId="1" w16cid:durableId="184102653">
-    <w:abstractNumId w:val="38"/>
+    <w:abstractNumId w:val="44"/>
   </w:num>
   <w:num w:numId="2" w16cid:durableId="1003583758">
-    <w:abstractNumId w:val="20"/>
+    <w:abstractNumId w:val="24"/>
   </w:num>
   <w:num w:numId="3" w16cid:durableId="1651444461">
-    <w:abstractNumId w:val="27"/>
+    <w:abstractNumId w:val="31"/>
   </w:num>
   <w:num w:numId="4" w16cid:durableId="136608272">
-    <w:abstractNumId w:val="15"/>
+    <w:abstractNumId w:val="19"/>
   </w:num>
   <w:num w:numId="5" w16cid:durableId="1090353503">
-    <w:abstractNumId w:val="6"/>
+    <w:abstractNumId w:val="8"/>
   </w:num>
   <w:num w:numId="6" w16cid:durableId="1683043692">
-    <w:abstractNumId w:val="42"/>
+    <w:abstractNumId w:val="48"/>
   </w:num>
   <w:num w:numId="7" w16cid:durableId="1824854707">
-    <w:abstractNumId w:val="9"/>
+    <w:abstractNumId w:val="12"/>
   </w:num>
   <w:num w:numId="8" w16cid:durableId="1063257185">
-    <w:abstractNumId w:val="5"/>
+    <w:abstractNumId w:val="7"/>
   </w:num>
   <w:num w:numId="9" w16cid:durableId="889267297">
-    <w:abstractNumId w:val="10"/>
+    <w:abstractNumId w:val="13"/>
   </w:num>
   <w:num w:numId="10" w16cid:durableId="1191454127">
-    <w:abstractNumId w:val="28"/>
+    <w:abstractNumId w:val="32"/>
   </w:num>
   <w:num w:numId="11" w16cid:durableId="32510889">
-    <w:abstractNumId w:val="26"/>
+    <w:abstractNumId w:val="30"/>
   </w:num>
   <w:num w:numId="12" w16cid:durableId="359167799">
     <w:abstractNumId w:val="0"/>
   </w:num>
   <w:num w:numId="13" w16cid:durableId="1755591443">
-    <w:abstractNumId w:val="21"/>
+    <w:abstractNumId w:val="25"/>
   </w:num>
   <w:num w:numId="14" w16cid:durableId="44530987">
-    <w:abstractNumId w:val="7"/>
+    <w:abstractNumId w:val="9"/>
   </w:num>
   <w:num w:numId="15" w16cid:durableId="1030455134">
-    <w:abstractNumId w:val="11"/>
+    <w:abstractNumId w:val="14"/>
   </w:num>
   <w:num w:numId="16" w16cid:durableId="439227151">
-    <w:abstractNumId w:val="4"/>
+    <w:abstractNumId w:val="5"/>
   </w:num>
   <w:num w:numId="17" w16cid:durableId="1650018006">
-    <w:abstractNumId w:val="23"/>
+    <w:abstractNumId w:val="27"/>
   </w:num>
   <w:num w:numId="18" w16cid:durableId="158424202">
-    <w:abstractNumId w:val="14"/>
+    <w:abstractNumId w:val="17"/>
   </w:num>
   <w:num w:numId="19" w16cid:durableId="1158572409">
-    <w:abstractNumId w:val="29"/>
+    <w:abstractNumId w:val="33"/>
   </w:num>
   <w:num w:numId="20" w16cid:durableId="370038589">
-    <w:abstractNumId w:val="39"/>
+    <w:abstractNumId w:val="45"/>
   </w:num>
   <w:num w:numId="21" w16cid:durableId="1172986391">
     <w:abstractNumId w:val="2"/>
   </w:num>
   <w:num w:numId="22" w16cid:durableId="1735857931">
+    <w:abstractNumId w:val="46"/>
+  </w:num>
+  <w:num w:numId="23" w16cid:durableId="986668761">
+    <w:abstractNumId w:val="23"/>
+  </w:num>
+  <w:num w:numId="24" w16cid:durableId="1300762213">
+    <w:abstractNumId w:val="37"/>
+  </w:num>
+  <w:num w:numId="25" w16cid:durableId="2004772222">
+    <w:abstractNumId w:val="28"/>
+  </w:num>
+  <w:num w:numId="26" w16cid:durableId="599291654">
+    <w:abstractNumId w:val="29"/>
+  </w:num>
+  <w:num w:numId="27" w16cid:durableId="706416369">
+    <w:abstractNumId w:val="38"/>
+  </w:num>
+  <w:num w:numId="28" w16cid:durableId="1430656554">
     <w:abstractNumId w:val="40"/>
   </w:num>
-  <w:num w:numId="23" w16cid:durableId="986668761">
-    <w:abstractNumId w:val="19"/>
-  </w:num>
-  <w:num w:numId="24" w16cid:durableId="1300762213">
-    <w:abstractNumId w:val="32"/>
-  </w:num>
-  <w:num w:numId="25" w16cid:durableId="2004772222">
-    <w:abstractNumId w:val="24"/>
-  </w:num>
-  <w:num w:numId="26" w16cid:durableId="599291654">
-    <w:abstractNumId w:val="25"/>
-  </w:num>
-  <w:num w:numId="27" w16cid:durableId="706416369">
-    <w:abstractNumId w:val="33"/>
-  </w:num>
-  <w:num w:numId="28" w16cid:durableId="1430656554">
-    <w:abstractNumId w:val="35"/>
-  </w:num>
   <w:num w:numId="29" w16cid:durableId="1123226736">
-    <w:abstractNumId w:val="41"/>
+    <w:abstractNumId w:val="47"/>
   </w:num>
   <w:num w:numId="30" w16cid:durableId="499472526">
-    <w:abstractNumId w:val="17"/>
+    <w:abstractNumId w:val="21"/>
   </w:num>
   <w:num w:numId="31" w16cid:durableId="1115904584">
     <w:abstractNumId w:val="1"/>
   </w:num>
   <w:num w:numId="32" w16cid:durableId="740371177">
+    <w:abstractNumId w:val="22"/>
+  </w:num>
+  <w:num w:numId="33" w16cid:durableId="1978146567">
+    <w:abstractNumId w:val="41"/>
+  </w:num>
+  <w:num w:numId="34" w16cid:durableId="1205606027">
+    <w:abstractNumId w:val="26"/>
+  </w:num>
+  <w:num w:numId="35" w16cid:durableId="731587083">
+    <w:abstractNumId w:val="49"/>
+  </w:num>
+  <w:num w:numId="36" w16cid:durableId="1971402414">
+    <w:abstractNumId w:val="16"/>
+  </w:num>
+  <w:num w:numId="37" w16cid:durableId="780152051">
+    <w:abstractNumId w:val="34"/>
+  </w:num>
+  <w:num w:numId="38" w16cid:durableId="161968327">
+    <w:abstractNumId w:val="11"/>
+  </w:num>
+  <w:num w:numId="39" w16cid:durableId="1079718605">
+    <w:abstractNumId w:val="39"/>
+  </w:num>
+  <w:num w:numId="40" w16cid:durableId="568618614">
+    <w:abstractNumId w:val="4"/>
+  </w:num>
+  <w:num w:numId="41" w16cid:durableId="1240284075">
+    <w:abstractNumId w:val="35"/>
+  </w:num>
+  <w:num w:numId="42" w16cid:durableId="790367031">
+    <w:abstractNumId w:val="20"/>
+  </w:num>
+  <w:num w:numId="43" w16cid:durableId="1932355">
+    <w:abstractNumId w:val="15"/>
+  </w:num>
+  <w:num w:numId="44" w16cid:durableId="73090763">
+    <w:abstractNumId w:val="43"/>
+  </w:num>
+  <w:num w:numId="45" w16cid:durableId="305016245">
+    <w:abstractNumId w:val="42"/>
+  </w:num>
+  <w:num w:numId="46" w16cid:durableId="183830930">
     <w:abstractNumId w:val="18"/>
   </w:num>
-  <w:num w:numId="33" w16cid:durableId="1978146567">
+  <w:num w:numId="47" w16cid:durableId="888999399">
     <w:abstractNumId w:val="36"/>
   </w:num>
-  <w:num w:numId="34" w16cid:durableId="1205606027">
-    <w:abstractNumId w:val="22"/>
+  <w:num w:numId="48" w16cid:durableId="1622033446">
+    <w:abstractNumId w:val="6"/>
   </w:num>
-  <w:num w:numId="35" w16cid:durableId="731587083">
-    <w:abstractNumId w:val="43"/>
+  <w:num w:numId="49" w16cid:durableId="1447193183">
+    <w:abstractNumId w:val="10"/>
   </w:num>
-  <w:num w:numId="36" w16cid:durableId="1971402414">
-    <w:abstractNumId w:val="13"/>
-  </w:num>
-  <w:num w:numId="37" w16cid:durableId="780152051">
-    <w:abstractNumId w:val="30"/>
-  </w:num>
-  <w:num w:numId="38" w16cid:durableId="161968327">
-    <w:abstractNumId w:val="8"/>
-  </w:num>
-  <w:num w:numId="39" w16cid:durableId="1079718605">
-    <w:abstractNumId w:val="34"/>
-  </w:num>
-  <w:num w:numId="40" w16cid:durableId="568618614">
+  <w:num w:numId="50" w16cid:durableId="1858151243">
     <w:abstractNumId w:val="3"/>
-  </w:num>
-  <w:num w:numId="41" w16cid:durableId="1240284075">
-    <w:abstractNumId w:val="31"/>
-  </w:num>
-  <w:num w:numId="42" w16cid:durableId="790367031">
-    <w:abstractNumId w:val="16"/>
-  </w:num>
-  <w:num w:numId="43" w16cid:durableId="1932355">
-    <w:abstractNumId w:val="12"/>
-  </w:num>
-  <w:num w:numId="44" w16cid:durableId="73090763">
-    <w:abstractNumId w:val="37"/>
   </w:num>
 </w:numbering>
 </file>

</xml_diff>

<commit_message>
step 73 : add property and fix bugs
</commit_message>
<xml_diff>
--- a/notes/video-overview-notes.docx
+++ b/notes/video-overview-notes.docx
@@ -203,6 +203,14 @@
           <w:lang w:bidi="fa-IR"/>
         </w:rPr>
         <w:t xml:space="preserve">ص1 : </w:t>
+      </w:r>
+      <w:r>
+        <w:rPr>
+          <w:sz w:val="56"/>
+          <w:szCs w:val="56"/>
+          <w:lang w:bidi="fa-IR"/>
+        </w:rPr>
+        <w:t>o</w:t>
       </w:r>
     </w:p>
     <w:p>
@@ -34038,7 +34046,6 @@
       <w:pPr>
         <w:bidi/>
         <w:rPr>
-          <w:rFonts w:hint="cs"/>
           <w:sz w:val="20"/>
           <w:szCs w:val="20"/>
           <w:rtl/>
@@ -40898,7 +40905,24 @@
           <w:szCs w:val="20"/>
           <w:rtl/>
         </w:rPr>
-        <w:t>"جیمز با استفاده از قضیه قدرتمند هان-باناخ ثابت کرد که برای هر دو بردار دلخواه $</w:t>
+        <w:t xml:space="preserve">"جیمز با استفاده </w:t>
+      </w:r>
+      <w:r>
+        <w:rPr>
+          <w:sz w:val="20"/>
+          <w:szCs w:val="20"/>
+          <w:highlight w:val="yellow"/>
+          <w:rtl/>
+        </w:rPr>
+        <w:t>از قضیه قدرتمند هان-باناخ</w:t>
+      </w:r>
+      <w:r>
+        <w:rPr>
+          <w:sz w:val="20"/>
+          <w:szCs w:val="20"/>
+          <w:rtl/>
+        </w:rPr>
+        <w:t xml:space="preserve"> ثابت کرد که برای هر دو بردار دلخواه $</w:t>
       </w:r>
       <w:r>
         <w:rPr>
@@ -40969,11 +40993,13 @@
       <w:pPr>
         <w:bidi/>
         <w:rPr>
-          <w:b/>
-          <w:bCs/>
-          <w:sz w:val="20"/>
-          <w:szCs w:val="20"/>
-          <w:rtl/>
+          <w:rFonts w:hint="cs"/>
+          <w:b/>
+          <w:bCs/>
+          <w:sz w:val="20"/>
+          <w:szCs w:val="20"/>
+          <w:rtl/>
+          <w:lang w:bidi="fa-IR"/>
         </w:rPr>
       </w:pPr>
       <w:r>
@@ -42664,6 +42690,890 @@
           <w:rtl/>
         </w:rPr>
         <w:t>$ یکتایی چپ وابسته به شکلِ فضا (اِکیداً محدب بودن)».</w:t>
+      </w:r>
+    </w:p>
+    <w:p>
+      <w:pPr>
+        <w:bidi/>
+        <w:rPr>
+          <w:sz w:val="20"/>
+          <w:szCs w:val="20"/>
+          <w:rtl/>
+        </w:rPr>
+      </w:pPr>
+    </w:p>
+    <w:p>
+      <w:pPr>
+        <w:bidi/>
+        <w:rPr>
+          <w:sz w:val="20"/>
+          <w:szCs w:val="20"/>
+        </w:rPr>
+      </w:pPr>
+      <w:r>
+        <w:rPr>
+          <w:sz w:val="20"/>
+          <w:szCs w:val="20"/>
+          <w:rtl/>
+        </w:rPr>
+        <w:t>سلام! برای اینکه این مفهوم انتزاعی ریاضی را در یک ویدیو به جذاب‌ترین و قابل‌فهم‌ترین شکل ممکن آموزش دهید، پیشنهاد می‌کنم ویدیو را به سه بخش (سکانس) تقسیم کنید.</w:t>
+      </w:r>
+    </w:p>
+    <w:p>
+      <w:pPr>
+        <w:bidi/>
+        <w:rPr>
+          <w:sz w:val="20"/>
+          <w:szCs w:val="20"/>
+          <w:rtl/>
+        </w:rPr>
+      </w:pPr>
+      <w:r>
+        <w:rPr>
+          <w:sz w:val="20"/>
+          <w:szCs w:val="20"/>
+          <w:rtl/>
+        </w:rPr>
+        <w:t>در ادامه، دقیقاً به شما می‌گویم که در هر بخش چه متنی را بگویید (یا روی صفحه بنویسید) و چه شکلی را رسم کنید:</w:t>
+      </w:r>
+    </w:p>
+    <w:p>
+      <w:pPr>
+        <w:bidi/>
+        <w:rPr>
+          <w:b/>
+          <w:bCs/>
+          <w:sz w:val="20"/>
+          <w:szCs w:val="20"/>
+          <w:rtl/>
+        </w:rPr>
+      </w:pPr>
+      <w:r>
+        <w:rPr>
+          <w:b/>
+          <w:bCs/>
+          <w:sz w:val="20"/>
+          <w:szCs w:val="20"/>
+          <w:rtl/>
+        </w:rPr>
+        <w:t>بخش اول: تعریف فضای اکیداً محدب (</w:t>
+      </w:r>
+      <w:r>
+        <w:rPr>
+          <w:b/>
+          <w:bCs/>
+          <w:sz w:val="20"/>
+          <w:szCs w:val="20"/>
+        </w:rPr>
+        <w:t>Strictly Convex</w:t>
+      </w:r>
+      <w:r>
+        <w:rPr>
+          <w:b/>
+          <w:bCs/>
+          <w:sz w:val="20"/>
+          <w:szCs w:val="20"/>
+          <w:rtl/>
+        </w:rPr>
+        <w:t>)</w:t>
+      </w:r>
+    </w:p>
+    <w:p>
+      <w:pPr>
+        <w:numPr>
+          <w:ilvl w:val="0"/>
+          <w:numId w:val="51"/>
+        </w:numPr>
+        <w:bidi/>
+        <w:rPr>
+          <w:sz w:val="20"/>
+          <w:szCs w:val="20"/>
+          <w:rtl/>
+        </w:rPr>
+      </w:pPr>
+      <w:r>
+        <w:rPr>
+          <w:b/>
+          <w:bCs/>
+          <w:sz w:val="20"/>
+          <w:szCs w:val="20"/>
+          <w:rtl/>
+        </w:rPr>
+        <w:t>متنی که باید خوانده/نوشته شود:</w:t>
+      </w:r>
+    </w:p>
+    <w:p>
+      <w:pPr>
+        <w:bidi/>
+        <w:rPr>
+          <w:sz w:val="20"/>
+          <w:szCs w:val="20"/>
+          <w:rtl/>
+        </w:rPr>
+      </w:pPr>
+      <w:r>
+        <w:rPr>
+          <w:sz w:val="20"/>
+          <w:szCs w:val="20"/>
+          <w:rtl/>
+        </w:rPr>
+        <w:t>«یک فضای برداری نرم‌دار $</w:t>
+      </w:r>
+      <w:r>
+        <w:rPr>
+          <w:sz w:val="20"/>
+          <w:szCs w:val="20"/>
+        </w:rPr>
+        <w:t>X</w:t>
+      </w:r>
+      <w:r>
+        <w:rPr>
+          <w:sz w:val="20"/>
+          <w:szCs w:val="20"/>
+          <w:rtl/>
+        </w:rPr>
+        <w:t xml:space="preserve">$ را </w:t>
+      </w:r>
+      <w:r>
+        <w:rPr>
+          <w:b/>
+          <w:bCs/>
+          <w:sz w:val="20"/>
+          <w:szCs w:val="20"/>
+          <w:rtl/>
+        </w:rPr>
+        <w:t>اکیداً محدب</w:t>
+      </w:r>
+      <w:r>
+        <w:rPr>
+          <w:sz w:val="20"/>
+          <w:szCs w:val="20"/>
+          <w:rtl/>
+        </w:rPr>
+        <w:t xml:space="preserve"> می‌گوییم، اگر یک شرط مهم در گوی واحد آن برقرار باشد: اگر هر دو نقطه دلخواه مانند $</w:t>
+      </w:r>
+      <w:r>
+        <w:rPr>
+          <w:sz w:val="20"/>
+          <w:szCs w:val="20"/>
+        </w:rPr>
+        <w:t>x</w:t>
+      </w:r>
+      <w:r>
+        <w:rPr>
+          <w:sz w:val="20"/>
+          <w:szCs w:val="20"/>
+          <w:rtl/>
+        </w:rPr>
+        <w:t>$ و $</w:t>
+      </w:r>
+      <w:r>
+        <w:rPr>
+          <w:sz w:val="20"/>
+          <w:szCs w:val="20"/>
+        </w:rPr>
+        <w:t>y</w:t>
+      </w:r>
+      <w:r>
+        <w:rPr>
+          <w:sz w:val="20"/>
+          <w:szCs w:val="20"/>
+          <w:rtl/>
+        </w:rPr>
+        <w:t xml:space="preserve">$ را روی </w:t>
+      </w:r>
+      <w:r>
+        <w:rPr>
+          <w:b/>
+          <w:bCs/>
+          <w:sz w:val="20"/>
+          <w:szCs w:val="20"/>
+          <w:rtl/>
+        </w:rPr>
+        <w:t>مرز</w:t>
+      </w:r>
+      <w:r>
+        <w:rPr>
+          <w:sz w:val="20"/>
+          <w:szCs w:val="20"/>
+          <w:rtl/>
+        </w:rPr>
+        <w:t xml:space="preserve"> این گوی انتخاب کنیم، پاره‌خطی که این دو نقطه را به هم وصل می‌کند، باید مرز گوی را </w:t>
+      </w:r>
+      <w:r>
+        <w:rPr>
+          <w:b/>
+          <w:bCs/>
+          <w:sz w:val="20"/>
+          <w:szCs w:val="20"/>
+          <w:rtl/>
+        </w:rPr>
+        <w:t>فقط و فقط</w:t>
+      </w:r>
+      <w:r>
+        <w:rPr>
+          <w:sz w:val="20"/>
+          <w:szCs w:val="20"/>
+          <w:rtl/>
+        </w:rPr>
+        <w:t xml:space="preserve"> در همان دو نقطه $</w:t>
+      </w:r>
+      <w:r>
+        <w:rPr>
+          <w:sz w:val="20"/>
+          <w:szCs w:val="20"/>
+        </w:rPr>
+        <w:t>x</w:t>
+      </w:r>
+      <w:r>
+        <w:rPr>
+          <w:sz w:val="20"/>
+          <w:szCs w:val="20"/>
+          <w:rtl/>
+        </w:rPr>
+        <w:t>$ و $</w:t>
+      </w:r>
+      <w:r>
+        <w:rPr>
+          <w:sz w:val="20"/>
+          <w:szCs w:val="20"/>
+        </w:rPr>
+        <w:t>y</w:t>
+      </w:r>
+      <w:r>
+        <w:rPr>
+          <w:sz w:val="20"/>
+          <w:szCs w:val="20"/>
+          <w:rtl/>
+        </w:rPr>
+        <w:t>$ قطع کند. به زبان ساده‌تر، تمام نقاط وسط این پاره‌خط باید کاملاً به داخل گوی بیفتند.»</w:t>
+      </w:r>
+    </w:p>
+    <w:p>
+      <w:pPr>
+        <w:numPr>
+          <w:ilvl w:val="0"/>
+          <w:numId w:val="51"/>
+        </w:numPr>
+        <w:bidi/>
+        <w:rPr>
+          <w:sz w:val="20"/>
+          <w:szCs w:val="20"/>
+          <w:rtl/>
+        </w:rPr>
+      </w:pPr>
+      <w:r>
+        <w:rPr>
+          <w:b/>
+          <w:bCs/>
+          <w:sz w:val="20"/>
+          <w:szCs w:val="20"/>
+          <w:rtl/>
+        </w:rPr>
+        <w:lastRenderedPageBreak/>
+        <w:t>تصویری که باید بکشید (نحوه نمایش):</w:t>
+      </w:r>
+    </w:p>
+    <w:p>
+      <w:pPr>
+        <w:numPr>
+          <w:ilvl w:val="1"/>
+          <w:numId w:val="51"/>
+        </w:numPr>
+        <w:bidi/>
+        <w:rPr>
+          <w:sz w:val="20"/>
+          <w:szCs w:val="20"/>
+          <w:rtl/>
+        </w:rPr>
+      </w:pPr>
+      <w:r>
+        <w:rPr>
+          <w:sz w:val="20"/>
+          <w:szCs w:val="20"/>
+          <w:rtl/>
+        </w:rPr>
+        <w:t>در این بخش هنوز نیازی به رسم کامل نیست؛ فقط عنوان «فضای اکیداً محدب» را با یک فونت خوانا در وسط صفحه بنویسید و نمادهای $</w:t>
+      </w:r>
+      <w:r>
+        <w:rPr>
+          <w:sz w:val="20"/>
+          <w:szCs w:val="20"/>
+        </w:rPr>
+        <w:t>X</w:t>
+      </w:r>
+      <w:r>
+        <w:rPr>
+          <w:sz w:val="20"/>
+          <w:szCs w:val="20"/>
+          <w:rtl/>
+        </w:rPr>
+        <w:t>$، $</w:t>
+      </w:r>
+      <w:r>
+        <w:rPr>
+          <w:sz w:val="20"/>
+          <w:szCs w:val="20"/>
+        </w:rPr>
+        <w:t>x</w:t>
+      </w:r>
+      <w:r>
+        <w:rPr>
+          <w:sz w:val="20"/>
+          <w:szCs w:val="20"/>
+          <w:rtl/>
+        </w:rPr>
+        <w:t>$ و $</w:t>
+      </w:r>
+      <w:r>
+        <w:rPr>
+          <w:sz w:val="20"/>
+          <w:szCs w:val="20"/>
+        </w:rPr>
+        <w:t>y</w:t>
+      </w:r>
+      <w:r>
+        <w:rPr>
+          <w:sz w:val="20"/>
+          <w:szCs w:val="20"/>
+          <w:rtl/>
+        </w:rPr>
+        <w:t>$ را در کنار آن ظاهر کنید تا ذهن بیننده آماده شود.</w:t>
+      </w:r>
+    </w:p>
+    <w:p>
+      <w:pPr>
+        <w:bidi/>
+        <w:rPr>
+          <w:b/>
+          <w:bCs/>
+          <w:sz w:val="20"/>
+          <w:szCs w:val="20"/>
+          <w:rtl/>
+        </w:rPr>
+      </w:pPr>
+      <w:r>
+        <w:rPr>
+          <w:b/>
+          <w:bCs/>
+          <w:sz w:val="20"/>
+          <w:szCs w:val="20"/>
+          <w:rtl/>
+        </w:rPr>
+        <w:t>بخش دوم: توضیح تصویری (مقایسه برای درک بهتر)</w:t>
+      </w:r>
+    </w:p>
+    <w:p>
+      <w:pPr>
+        <w:numPr>
+          <w:ilvl w:val="0"/>
+          <w:numId w:val="52"/>
+        </w:numPr>
+        <w:bidi/>
+        <w:rPr>
+          <w:sz w:val="20"/>
+          <w:szCs w:val="20"/>
+          <w:rtl/>
+        </w:rPr>
+      </w:pPr>
+      <w:r>
+        <w:rPr>
+          <w:b/>
+          <w:bCs/>
+          <w:sz w:val="20"/>
+          <w:szCs w:val="20"/>
+          <w:rtl/>
+        </w:rPr>
+        <w:t>متنی که باید خوانده/نوشته شود:</w:t>
+      </w:r>
+    </w:p>
+    <w:p>
+      <w:pPr>
+        <w:bidi/>
+        <w:rPr>
+          <w:sz w:val="20"/>
+          <w:szCs w:val="20"/>
+          <w:rtl/>
+        </w:rPr>
+      </w:pPr>
+      <w:r>
+        <w:rPr>
+          <w:sz w:val="20"/>
+          <w:szCs w:val="20"/>
+          <w:rtl/>
+        </w:rPr>
+        <w:t>«برای درک بهتر، بیایید دو شکل را با هم مقایسه کنیم. در شکل اول (یک دایره کامل)، اگر دو نقطه روی لبه‌ها انتخاب کنیم و به هم وصل کنیم، می‌بینید که خط ارتباطی وارد فضای داخل دایره می‌شود. این یعنی اکیداً محدب! اما در شکل دوم (یک مربع)، اگر دو نقطه را روی یکی از اضلاعِ تختِ آن انتخاب کنیم، خطی که آن‌ها را وصل می‌کند کاملاً روی خود لبه (مرز) می‌افتد و داخل نمی‌رود. پس این فضا اکیداً محدب نیست.»</w:t>
+      </w:r>
+    </w:p>
+    <w:p>
+      <w:pPr>
+        <w:numPr>
+          <w:ilvl w:val="0"/>
+          <w:numId w:val="52"/>
+        </w:numPr>
+        <w:bidi/>
+        <w:rPr>
+          <w:sz w:val="20"/>
+          <w:szCs w:val="20"/>
+          <w:rtl/>
+        </w:rPr>
+      </w:pPr>
+      <w:r>
+        <w:rPr>
+          <w:b/>
+          <w:bCs/>
+          <w:sz w:val="20"/>
+          <w:szCs w:val="20"/>
+          <w:rtl/>
+        </w:rPr>
+        <w:t>تصویری که باید بکشید (انیمیشن یا رسم روی تخته):</w:t>
+      </w:r>
+    </w:p>
+    <w:p>
+      <w:pPr>
+        <w:bidi/>
+        <w:rPr>
+          <w:sz w:val="20"/>
+          <w:szCs w:val="20"/>
+          <w:rtl/>
+        </w:rPr>
+      </w:pPr>
+      <w:r>
+        <w:rPr>
+          <w:sz w:val="20"/>
+          <w:szCs w:val="20"/>
+          <w:rtl/>
+        </w:rPr>
+        <w:t>صفحه را به دو قسمت تقسیم کنید:</w:t>
+      </w:r>
+    </w:p>
+    <w:p>
+      <w:pPr>
+        <w:numPr>
+          <w:ilvl w:val="1"/>
+          <w:numId w:val="52"/>
+        </w:numPr>
+        <w:bidi/>
+        <w:rPr>
+          <w:sz w:val="20"/>
+          <w:szCs w:val="20"/>
+          <w:rtl/>
+        </w:rPr>
+      </w:pPr>
+      <w:r>
+        <w:rPr>
+          <w:b/>
+          <w:bCs/>
+          <w:sz w:val="20"/>
+          <w:szCs w:val="20"/>
+          <w:rtl/>
+        </w:rPr>
+        <w:t>سمت راست (مثال صحیح - اکیداً محدب):</w:t>
+      </w:r>
+      <w:r>
+        <w:rPr>
+          <w:sz w:val="20"/>
+          <w:szCs w:val="20"/>
+          <w:rtl/>
+        </w:rPr>
+        <w:t xml:space="preserve"> یک دایره رسم کنید (نماینده گوی واحد در نرم </w:t>
+      </w:r>
+      <w:r>
+        <w:rPr>
+          <w:sz w:val="20"/>
+          <w:szCs w:val="20"/>
+          <w:rtl/>
+          <w:lang w:bidi="fa-IR"/>
+        </w:rPr>
+        <w:t xml:space="preserve">۲). </w:t>
+      </w:r>
+      <w:r>
+        <w:rPr>
+          <w:sz w:val="20"/>
+          <w:szCs w:val="20"/>
+          <w:rtl/>
+        </w:rPr>
+        <w:t>دو نقطه روی محیط دایره مشخص کنید و نام آن‌ها را $</w:t>
+      </w:r>
+      <w:r>
+        <w:rPr>
+          <w:sz w:val="20"/>
+          <w:szCs w:val="20"/>
+        </w:rPr>
+        <w:t>x</w:t>
+      </w:r>
+      <w:r>
+        <w:rPr>
+          <w:sz w:val="20"/>
+          <w:szCs w:val="20"/>
+          <w:rtl/>
+        </w:rPr>
+        <w:t>$ و $</w:t>
+      </w:r>
+      <w:r>
+        <w:rPr>
+          <w:sz w:val="20"/>
+          <w:szCs w:val="20"/>
+        </w:rPr>
+        <w:t>y</w:t>
+      </w:r>
+      <w:r>
+        <w:rPr>
+          <w:sz w:val="20"/>
+          <w:szCs w:val="20"/>
+          <w:rtl/>
+        </w:rPr>
+        <w:t>$ بگذارید. یک پاره‌خط (ترجیحاً نقطه‌چین یا با رنگ متفاوت) بین آن‌ها بکشید. نشان دهید که خط از داخل دایره عبور کرده است.</w:t>
+      </w:r>
+    </w:p>
+    <w:p>
+      <w:pPr>
+        <w:numPr>
+          <w:ilvl w:val="1"/>
+          <w:numId w:val="52"/>
+        </w:numPr>
+        <w:bidi/>
+        <w:rPr>
+          <w:sz w:val="20"/>
+          <w:szCs w:val="20"/>
+          <w:rtl/>
+        </w:rPr>
+      </w:pPr>
+      <w:r>
+        <w:rPr>
+          <w:b/>
+          <w:bCs/>
+          <w:sz w:val="20"/>
+          <w:szCs w:val="20"/>
+          <w:rtl/>
+        </w:rPr>
+        <w:t>سمت چپ (مثال نقض - غیر اکیداً محدب):</w:t>
+      </w:r>
+      <w:r>
+        <w:rPr>
+          <w:sz w:val="20"/>
+          <w:szCs w:val="20"/>
+          <w:rtl/>
+        </w:rPr>
+        <w:t xml:space="preserve"> یک مربع رسم کنید (نماینده گوی واحد در نرم بینهایت یا نرم </w:t>
+      </w:r>
+      <w:r>
+        <w:rPr>
+          <w:sz w:val="20"/>
+          <w:szCs w:val="20"/>
+          <w:rtl/>
+          <w:lang w:bidi="fa-IR"/>
+        </w:rPr>
+        <w:t xml:space="preserve">۱). </w:t>
+      </w:r>
+      <w:r>
+        <w:rPr>
+          <w:sz w:val="20"/>
+          <w:szCs w:val="20"/>
+          <w:rtl/>
+        </w:rPr>
+        <w:t xml:space="preserve">دو نقطه روی </w:t>
+      </w:r>
+      <w:r>
+        <w:rPr>
+          <w:b/>
+          <w:bCs/>
+          <w:sz w:val="20"/>
+          <w:szCs w:val="20"/>
+          <w:rtl/>
+        </w:rPr>
+        <w:t>یک ضلع</w:t>
+      </w:r>
+      <w:r>
+        <w:rPr>
+          <w:sz w:val="20"/>
+          <w:szCs w:val="20"/>
+          <w:rtl/>
+        </w:rPr>
+        <w:t xml:space="preserve"> مربع بگذارید و به هم وصل کنید. با یک رنگ قرمز یا هشداردهنده نشان دهید که این پاره‌خط دقیقاً روی مرز مماس شده و داخل گوی نرفته است.</w:t>
+      </w:r>
+    </w:p>
+    <w:p>
+      <w:pPr>
+        <w:bidi/>
+        <w:rPr>
+          <w:b/>
+          <w:bCs/>
+          <w:sz w:val="20"/>
+          <w:szCs w:val="20"/>
+          <w:rtl/>
+        </w:rPr>
+      </w:pPr>
+      <w:r>
+        <w:rPr>
+          <w:b/>
+          <w:bCs/>
+          <w:sz w:val="20"/>
+          <w:szCs w:val="20"/>
+          <w:rtl/>
+        </w:rPr>
+        <w:t>بخش سوم: نوشتن شرط مربوطه (قضیه تعامد)</w:t>
+      </w:r>
+    </w:p>
+    <w:p>
+      <w:pPr>
+        <w:numPr>
+          <w:ilvl w:val="0"/>
+          <w:numId w:val="53"/>
+        </w:numPr>
+        <w:bidi/>
+        <w:rPr>
+          <w:sz w:val="20"/>
+          <w:szCs w:val="20"/>
+          <w:rtl/>
+        </w:rPr>
+      </w:pPr>
+      <w:r>
+        <w:rPr>
+          <w:b/>
+          <w:bCs/>
+          <w:sz w:val="20"/>
+          <w:szCs w:val="20"/>
+          <w:rtl/>
+        </w:rPr>
+        <w:t>متنی که باید خوانده/نوشته شود:</w:t>
+      </w:r>
+    </w:p>
+    <w:p>
+      <w:pPr>
+        <w:bidi/>
+        <w:rPr>
+          <w:sz w:val="20"/>
+          <w:szCs w:val="20"/>
+          <w:rtl/>
+        </w:rPr>
+      </w:pPr>
+      <w:r>
+        <w:rPr>
+          <w:sz w:val="20"/>
+          <w:szCs w:val="20"/>
+          <w:rtl/>
+        </w:rPr>
+        <w:t xml:space="preserve">«حالا چرا این ویژگی هندسی برای ما مهم است؟ چون این خاصیت، کلیدِ حلِ یکتایی در ریاضیات است. بر اساس قضایای موجود در این فضا، ثابت می‌شود که شرط لازم و کافی برای اینکه </w:t>
+      </w:r>
+      <w:r>
+        <w:rPr>
+          <w:b/>
+          <w:bCs/>
+          <w:sz w:val="20"/>
+          <w:szCs w:val="20"/>
+          <w:rtl/>
+        </w:rPr>
+        <w:t>رابطه تعامد از چپ</w:t>
+      </w:r>
+      <w:r>
+        <w:rPr>
+          <w:sz w:val="20"/>
+          <w:szCs w:val="20"/>
+          <w:rtl/>
+        </w:rPr>
+        <w:t xml:space="preserve"> در فضای برداری $</w:t>
+      </w:r>
+      <w:r>
+        <w:rPr>
+          <w:sz w:val="20"/>
+          <w:szCs w:val="20"/>
+        </w:rPr>
+        <w:t>X</w:t>
+      </w:r>
+      <w:r>
+        <w:rPr>
+          <w:sz w:val="20"/>
+          <w:szCs w:val="20"/>
+          <w:rtl/>
+        </w:rPr>
+        <w:t>$ کاملاً یکتا باشد، این است که فضای ما حتماً اکیداً محدب باشد.»</w:t>
+      </w:r>
+    </w:p>
+    <w:p>
+      <w:pPr>
+        <w:numPr>
+          <w:ilvl w:val="0"/>
+          <w:numId w:val="53"/>
+        </w:numPr>
+        <w:bidi/>
+        <w:rPr>
+          <w:sz w:val="20"/>
+          <w:szCs w:val="20"/>
+          <w:rtl/>
+        </w:rPr>
+      </w:pPr>
+      <w:r>
+        <w:rPr>
+          <w:b/>
+          <w:bCs/>
+          <w:sz w:val="20"/>
+          <w:szCs w:val="20"/>
+          <w:rtl/>
+        </w:rPr>
+        <w:t>تصویری که باید بکشید (نحوه نمایش):</w:t>
+      </w:r>
+    </w:p>
+    <w:p>
+      <w:pPr>
+        <w:numPr>
+          <w:ilvl w:val="1"/>
+          <w:numId w:val="53"/>
+        </w:numPr>
+        <w:bidi/>
+        <w:rPr>
+          <w:sz w:val="20"/>
+          <w:szCs w:val="20"/>
+          <w:rtl/>
+        </w:rPr>
+      </w:pPr>
+      <w:r>
+        <w:rPr>
+          <w:sz w:val="20"/>
+          <w:szCs w:val="20"/>
+          <w:rtl/>
+        </w:rPr>
+        <w:t>تخته را پاک کنید (یا به یک قاب جدید بروید).</w:t>
+      </w:r>
+    </w:p>
+    <w:p>
+      <w:pPr>
+        <w:numPr>
+          <w:ilvl w:val="1"/>
+          <w:numId w:val="53"/>
+        </w:numPr>
+        <w:bidi/>
+        <w:rPr>
+          <w:sz w:val="20"/>
+          <w:szCs w:val="20"/>
+          <w:rtl/>
+        </w:rPr>
+      </w:pPr>
+      <w:r>
+        <w:rPr>
+          <w:sz w:val="20"/>
+          <w:szCs w:val="20"/>
+          <w:rtl/>
+        </w:rPr>
+        <w:t>این عبارت را به صورت یک فرمول دوطرفه (اگر و تنها اگر) با کادربندی جذاب بنویسید تا در ذهن مخاطب حک شود:</w:t>
+      </w:r>
+    </w:p>
+    <w:p>
+      <w:pPr>
+        <w:bidi/>
+        <w:rPr>
+          <w:sz w:val="20"/>
+          <w:szCs w:val="20"/>
+          <w:rtl/>
+        </w:rPr>
+      </w:pPr>
+      <w:r>
+        <w:rPr>
+          <w:b/>
+          <w:bCs/>
+          <w:sz w:val="20"/>
+          <w:szCs w:val="20"/>
+          <w:rtl/>
+        </w:rPr>
+        <w:t>رابطه تعامد از چپ یکتا است $\</w:t>
+      </w:r>
+      <w:proofErr w:type="spellStart"/>
+      <w:r>
+        <w:rPr>
+          <w:b/>
+          <w:bCs/>
+          <w:sz w:val="20"/>
+          <w:szCs w:val="20"/>
+        </w:rPr>
+        <w:t>iff</w:t>
+      </w:r>
+      <w:proofErr w:type="spellEnd"/>
+      <w:r>
+        <w:rPr>
+          <w:b/>
+          <w:bCs/>
+          <w:sz w:val="20"/>
+          <w:szCs w:val="20"/>
+          <w:rtl/>
+        </w:rPr>
+        <w:t>$ فضای برداری $</w:t>
+      </w:r>
+      <w:r>
+        <w:rPr>
+          <w:b/>
+          <w:bCs/>
+          <w:sz w:val="20"/>
+          <w:szCs w:val="20"/>
+        </w:rPr>
+        <w:t>X</w:t>
+      </w:r>
+      <w:r>
+        <w:rPr>
+          <w:b/>
+          <w:bCs/>
+          <w:sz w:val="20"/>
+          <w:szCs w:val="20"/>
+          <w:rtl/>
+        </w:rPr>
+        <w:t>$ اکیداً محدب است</w:t>
+      </w:r>
+    </w:p>
+    <w:p>
+      <w:pPr>
+        <w:bidi/>
+        <w:rPr>
+          <w:sz w:val="20"/>
+          <w:szCs w:val="20"/>
+          <w:rtl/>
+        </w:rPr>
+      </w:pPr>
+      <w:r>
+        <w:rPr>
+          <w:b/>
+          <w:bCs/>
+          <w:sz w:val="20"/>
+          <w:szCs w:val="20"/>
+          <w:rtl/>
+        </w:rPr>
+        <w:t>یک نکته کوچک برای تدوین:</w:t>
+      </w:r>
+      <w:r>
+        <w:rPr>
+          <w:sz w:val="20"/>
+          <w:szCs w:val="20"/>
+          <w:rtl/>
+        </w:rPr>
+        <w:t xml:space="preserve"> سعی کنید وقتی از کلمه «مرز» استفاده می‌کنید، محیط شکل‌ها را در ویدیو پررنگ کنید (مثلاً رنگ محیط دایره درخشان شود) و وقتی از پاره‌خط متصل‌کننده حرف می‌زنید، خط با یک افکت حرکتی از $</w:t>
+      </w:r>
+      <w:r>
+        <w:rPr>
+          <w:sz w:val="20"/>
+          <w:szCs w:val="20"/>
+        </w:rPr>
+        <w:t>x</w:t>
+      </w:r>
+      <w:r>
+        <w:rPr>
+          <w:sz w:val="20"/>
+          <w:szCs w:val="20"/>
+          <w:rtl/>
+        </w:rPr>
+        <w:t>$ به سمت $</w:t>
+      </w:r>
+      <w:r>
+        <w:rPr>
+          <w:sz w:val="20"/>
+          <w:szCs w:val="20"/>
+        </w:rPr>
+        <w:t>y</w:t>
+      </w:r>
+      <w:r>
+        <w:rPr>
+          <w:sz w:val="20"/>
+          <w:szCs w:val="20"/>
+          <w:rtl/>
+        </w:rPr>
+        <w:t>$ کشیده شود. این کار درک شهودی مخاطب را به شدت بالا می‌برد.</w:t>
       </w:r>
     </w:p>
     <w:p>
@@ -44807,6 +45717,155 @@
     </w:lvl>
   </w:abstractNum>
   <w:abstractNum w:abstractNumId="15" w15:restartNumberingAfterBreak="0">
+    <w:nsid w:val="285747C4"/>
+    <w:multiLevelType w:val="multilevel"/>
+    <w:tmpl w:val="E79CF110"/>
+    <w:lvl w:ilvl="0">
+      <w:start w:val="1"/>
+      <w:numFmt w:val="bullet"/>
+      <w:lvlText w:val=""/>
+      <w:lvlJc w:val="left"/>
+      <w:pPr>
+        <w:tabs>
+          <w:tab w:val="num" w:pos="720"/>
+        </w:tabs>
+        <w:ind w:left="720" w:hanging="360"/>
+      </w:pPr>
+      <w:rPr>
+        <w:rFonts w:ascii="Symbol" w:hAnsi="Symbol" w:hint="default"/>
+        <w:sz w:val="20"/>
+      </w:rPr>
+    </w:lvl>
+    <w:lvl w:ilvl="1">
+      <w:start w:val="1"/>
+      <w:numFmt w:val="bullet"/>
+      <w:lvlText w:val="o"/>
+      <w:lvlJc w:val="left"/>
+      <w:pPr>
+        <w:tabs>
+          <w:tab w:val="num" w:pos="1440"/>
+        </w:tabs>
+        <w:ind w:left="1440" w:hanging="360"/>
+      </w:pPr>
+      <w:rPr>
+        <w:rFonts w:ascii="Courier New" w:hAnsi="Courier New" w:hint="default"/>
+        <w:sz w:val="20"/>
+      </w:rPr>
+    </w:lvl>
+    <w:lvl w:ilvl="2" w:tentative="1">
+      <w:start w:val="1"/>
+      <w:numFmt w:val="bullet"/>
+      <w:lvlText w:val=""/>
+      <w:lvlJc w:val="left"/>
+      <w:pPr>
+        <w:tabs>
+          <w:tab w:val="num" w:pos="2160"/>
+        </w:tabs>
+        <w:ind w:left="2160" w:hanging="360"/>
+      </w:pPr>
+      <w:rPr>
+        <w:rFonts w:ascii="Wingdings" w:hAnsi="Wingdings" w:hint="default"/>
+        <w:sz w:val="20"/>
+      </w:rPr>
+    </w:lvl>
+    <w:lvl w:ilvl="3" w:tentative="1">
+      <w:start w:val="1"/>
+      <w:numFmt w:val="bullet"/>
+      <w:lvlText w:val=""/>
+      <w:lvlJc w:val="left"/>
+      <w:pPr>
+        <w:tabs>
+          <w:tab w:val="num" w:pos="2880"/>
+        </w:tabs>
+        <w:ind w:left="2880" w:hanging="360"/>
+      </w:pPr>
+      <w:rPr>
+        <w:rFonts w:ascii="Wingdings" w:hAnsi="Wingdings" w:hint="default"/>
+        <w:sz w:val="20"/>
+      </w:rPr>
+    </w:lvl>
+    <w:lvl w:ilvl="4" w:tentative="1">
+      <w:start w:val="1"/>
+      <w:numFmt w:val="bullet"/>
+      <w:lvlText w:val=""/>
+      <w:lvlJc w:val="left"/>
+      <w:pPr>
+        <w:tabs>
+          <w:tab w:val="num" w:pos="3600"/>
+        </w:tabs>
+        <w:ind w:left="3600" w:hanging="360"/>
+      </w:pPr>
+      <w:rPr>
+        <w:rFonts w:ascii="Wingdings" w:hAnsi="Wingdings" w:hint="default"/>
+        <w:sz w:val="20"/>
+      </w:rPr>
+    </w:lvl>
+    <w:lvl w:ilvl="5" w:tentative="1">
+      <w:start w:val="1"/>
+      <w:numFmt w:val="bullet"/>
+      <w:lvlText w:val=""/>
+      <w:lvlJc w:val="left"/>
+      <w:pPr>
+        <w:tabs>
+          <w:tab w:val="num" w:pos="4320"/>
+        </w:tabs>
+        <w:ind w:left="4320" w:hanging="360"/>
+      </w:pPr>
+      <w:rPr>
+        <w:rFonts w:ascii="Wingdings" w:hAnsi="Wingdings" w:hint="default"/>
+        <w:sz w:val="20"/>
+      </w:rPr>
+    </w:lvl>
+    <w:lvl w:ilvl="6" w:tentative="1">
+      <w:start w:val="1"/>
+      <w:numFmt w:val="bullet"/>
+      <w:lvlText w:val=""/>
+      <w:lvlJc w:val="left"/>
+      <w:pPr>
+        <w:tabs>
+          <w:tab w:val="num" w:pos="5040"/>
+        </w:tabs>
+        <w:ind w:left="5040" w:hanging="360"/>
+      </w:pPr>
+      <w:rPr>
+        <w:rFonts w:ascii="Wingdings" w:hAnsi="Wingdings" w:hint="default"/>
+        <w:sz w:val="20"/>
+      </w:rPr>
+    </w:lvl>
+    <w:lvl w:ilvl="7" w:tentative="1">
+      <w:start w:val="1"/>
+      <w:numFmt w:val="bullet"/>
+      <w:lvlText w:val=""/>
+      <w:lvlJc w:val="left"/>
+      <w:pPr>
+        <w:tabs>
+          <w:tab w:val="num" w:pos="5760"/>
+        </w:tabs>
+        <w:ind w:left="5760" w:hanging="360"/>
+      </w:pPr>
+      <w:rPr>
+        <w:rFonts w:ascii="Wingdings" w:hAnsi="Wingdings" w:hint="default"/>
+        <w:sz w:val="20"/>
+      </w:rPr>
+    </w:lvl>
+    <w:lvl w:ilvl="8" w:tentative="1">
+      <w:start w:val="1"/>
+      <w:numFmt w:val="bullet"/>
+      <w:lvlText w:val=""/>
+      <w:lvlJc w:val="left"/>
+      <w:pPr>
+        <w:tabs>
+          <w:tab w:val="num" w:pos="6480"/>
+        </w:tabs>
+        <w:ind w:left="6480" w:hanging="360"/>
+      </w:pPr>
+      <w:rPr>
+        <w:rFonts w:ascii="Wingdings" w:hAnsi="Wingdings" w:hint="default"/>
+        <w:sz w:val="20"/>
+      </w:rPr>
+    </w:lvl>
+  </w:abstractNum>
+  <w:abstractNum w:abstractNumId="16" w15:restartNumberingAfterBreak="0">
     <w:nsid w:val="30752863"/>
     <w:multiLevelType w:val="multilevel"/>
     <w:tmpl w:val="3600288C"/>
@@ -44919,7 +45978,7 @@
       </w:pPr>
     </w:lvl>
   </w:abstractNum>
-  <w:abstractNum w:abstractNumId="16" w15:restartNumberingAfterBreak="0">
+  <w:abstractNum w:abstractNumId="17" w15:restartNumberingAfterBreak="0">
     <w:nsid w:val="37D771B8"/>
     <w:multiLevelType w:val="multilevel"/>
     <w:tmpl w:val="BEC4058A"/>
@@ -45068,7 +46127,7 @@
       </w:rPr>
     </w:lvl>
   </w:abstractNum>
-  <w:abstractNum w:abstractNumId="17" w15:restartNumberingAfterBreak="0">
+  <w:abstractNum w:abstractNumId="18" w15:restartNumberingAfterBreak="0">
     <w:nsid w:val="3F712458"/>
     <w:multiLevelType w:val="multilevel"/>
     <w:tmpl w:val="119CF06C"/>
@@ -45217,7 +46276,7 @@
       </w:rPr>
     </w:lvl>
   </w:abstractNum>
-  <w:abstractNum w:abstractNumId="18" w15:restartNumberingAfterBreak="0">
+  <w:abstractNum w:abstractNumId="19" w15:restartNumberingAfterBreak="0">
     <w:nsid w:val="3F9B64C9"/>
     <w:multiLevelType w:val="multilevel"/>
     <w:tmpl w:val="7E3AD654"/>
@@ -45366,7 +46425,7 @@
       </w:rPr>
     </w:lvl>
   </w:abstractNum>
-  <w:abstractNum w:abstractNumId="19" w15:restartNumberingAfterBreak="0">
+  <w:abstractNum w:abstractNumId="20" w15:restartNumberingAfterBreak="0">
     <w:nsid w:val="44775DF2"/>
     <w:multiLevelType w:val="multilevel"/>
     <w:tmpl w:val="B19E7EEE"/>
@@ -45515,7 +46574,7 @@
       </w:rPr>
     </w:lvl>
   </w:abstractNum>
-  <w:abstractNum w:abstractNumId="20" w15:restartNumberingAfterBreak="0">
+  <w:abstractNum w:abstractNumId="21" w15:restartNumberingAfterBreak="0">
     <w:nsid w:val="454C2989"/>
     <w:multiLevelType w:val="multilevel"/>
     <w:tmpl w:val="707816C2"/>
@@ -45628,7 +46687,7 @@
       </w:pPr>
     </w:lvl>
   </w:abstractNum>
-  <w:abstractNum w:abstractNumId="21" w15:restartNumberingAfterBreak="0">
+  <w:abstractNum w:abstractNumId="22" w15:restartNumberingAfterBreak="0">
     <w:nsid w:val="475E371E"/>
     <w:multiLevelType w:val="multilevel"/>
     <w:tmpl w:val="8FC4FC0E"/>
@@ -45777,7 +46836,7 @@
       </w:rPr>
     </w:lvl>
   </w:abstractNum>
-  <w:abstractNum w:abstractNumId="22" w15:restartNumberingAfterBreak="0">
+  <w:abstractNum w:abstractNumId="23" w15:restartNumberingAfterBreak="0">
     <w:nsid w:val="485D5154"/>
     <w:multiLevelType w:val="multilevel"/>
     <w:tmpl w:val="7BB8D4CC"/>
@@ -45926,7 +46985,7 @@
       </w:rPr>
     </w:lvl>
   </w:abstractNum>
-  <w:abstractNum w:abstractNumId="23" w15:restartNumberingAfterBreak="0">
+  <w:abstractNum w:abstractNumId="24" w15:restartNumberingAfterBreak="0">
     <w:nsid w:val="488A2A18"/>
     <w:multiLevelType w:val="multilevel"/>
     <w:tmpl w:val="35A09B12"/>
@@ -46075,7 +47134,7 @@
       </w:rPr>
     </w:lvl>
   </w:abstractNum>
-  <w:abstractNum w:abstractNumId="24" w15:restartNumberingAfterBreak="0">
+  <w:abstractNum w:abstractNumId="25" w15:restartNumberingAfterBreak="0">
     <w:nsid w:val="492C6B88"/>
     <w:multiLevelType w:val="multilevel"/>
     <w:tmpl w:val="0D3879CE"/>
@@ -46224,7 +47283,7 @@
       </w:rPr>
     </w:lvl>
   </w:abstractNum>
-  <w:abstractNum w:abstractNumId="25" w15:restartNumberingAfterBreak="0">
+  <w:abstractNum w:abstractNumId="26" w15:restartNumberingAfterBreak="0">
     <w:nsid w:val="4AD35524"/>
     <w:multiLevelType w:val="multilevel"/>
     <w:tmpl w:val="FB3A666C"/>
@@ -46373,7 +47432,7 @@
       </w:rPr>
     </w:lvl>
   </w:abstractNum>
-  <w:abstractNum w:abstractNumId="26" w15:restartNumberingAfterBreak="0">
+  <w:abstractNum w:abstractNumId="27" w15:restartNumberingAfterBreak="0">
     <w:nsid w:val="4B443AB3"/>
     <w:multiLevelType w:val="multilevel"/>
     <w:tmpl w:val="45B83494"/>
@@ -46522,7 +47581,7 @@
       </w:rPr>
     </w:lvl>
   </w:abstractNum>
-  <w:abstractNum w:abstractNumId="27" w15:restartNumberingAfterBreak="0">
+  <w:abstractNum w:abstractNumId="28" w15:restartNumberingAfterBreak="0">
     <w:nsid w:val="4B8A2132"/>
     <w:multiLevelType w:val="multilevel"/>
     <w:tmpl w:val="6090D214"/>
@@ -46671,7 +47730,7 @@
       </w:rPr>
     </w:lvl>
   </w:abstractNum>
-  <w:abstractNum w:abstractNumId="28" w15:restartNumberingAfterBreak="0">
+  <w:abstractNum w:abstractNumId="29" w15:restartNumberingAfterBreak="0">
     <w:nsid w:val="4E042705"/>
     <w:multiLevelType w:val="multilevel"/>
     <w:tmpl w:val="5832F920"/>
@@ -46820,7 +47879,7 @@
       </w:rPr>
     </w:lvl>
   </w:abstractNum>
-  <w:abstractNum w:abstractNumId="29" w15:restartNumberingAfterBreak="0">
+  <w:abstractNum w:abstractNumId="30" w15:restartNumberingAfterBreak="0">
     <w:nsid w:val="56943D38"/>
     <w:multiLevelType w:val="multilevel"/>
     <w:tmpl w:val="7F48705E"/>
@@ -46933,7 +47992,156 @@
       </w:pPr>
     </w:lvl>
   </w:abstractNum>
-  <w:abstractNum w:abstractNumId="30" w15:restartNumberingAfterBreak="0">
+  <w:abstractNum w:abstractNumId="31" w15:restartNumberingAfterBreak="0">
+    <w:nsid w:val="57837D65"/>
+    <w:multiLevelType w:val="multilevel"/>
+    <w:tmpl w:val="DCF070D2"/>
+    <w:lvl w:ilvl="0">
+      <w:start w:val="1"/>
+      <w:numFmt w:val="bullet"/>
+      <w:lvlText w:val=""/>
+      <w:lvlJc w:val="left"/>
+      <w:pPr>
+        <w:tabs>
+          <w:tab w:val="num" w:pos="720"/>
+        </w:tabs>
+        <w:ind w:left="720" w:hanging="360"/>
+      </w:pPr>
+      <w:rPr>
+        <w:rFonts w:ascii="Symbol" w:hAnsi="Symbol" w:hint="default"/>
+        <w:sz w:val="20"/>
+      </w:rPr>
+    </w:lvl>
+    <w:lvl w:ilvl="1">
+      <w:start w:val="1"/>
+      <w:numFmt w:val="bullet"/>
+      <w:lvlText w:val="o"/>
+      <w:lvlJc w:val="left"/>
+      <w:pPr>
+        <w:tabs>
+          <w:tab w:val="num" w:pos="1440"/>
+        </w:tabs>
+        <w:ind w:left="1440" w:hanging="360"/>
+      </w:pPr>
+      <w:rPr>
+        <w:rFonts w:ascii="Courier New" w:hAnsi="Courier New" w:hint="default"/>
+        <w:sz w:val="20"/>
+      </w:rPr>
+    </w:lvl>
+    <w:lvl w:ilvl="2" w:tentative="1">
+      <w:start w:val="1"/>
+      <w:numFmt w:val="bullet"/>
+      <w:lvlText w:val=""/>
+      <w:lvlJc w:val="left"/>
+      <w:pPr>
+        <w:tabs>
+          <w:tab w:val="num" w:pos="2160"/>
+        </w:tabs>
+        <w:ind w:left="2160" w:hanging="360"/>
+      </w:pPr>
+      <w:rPr>
+        <w:rFonts w:ascii="Wingdings" w:hAnsi="Wingdings" w:hint="default"/>
+        <w:sz w:val="20"/>
+      </w:rPr>
+    </w:lvl>
+    <w:lvl w:ilvl="3" w:tentative="1">
+      <w:start w:val="1"/>
+      <w:numFmt w:val="bullet"/>
+      <w:lvlText w:val=""/>
+      <w:lvlJc w:val="left"/>
+      <w:pPr>
+        <w:tabs>
+          <w:tab w:val="num" w:pos="2880"/>
+        </w:tabs>
+        <w:ind w:left="2880" w:hanging="360"/>
+      </w:pPr>
+      <w:rPr>
+        <w:rFonts w:ascii="Wingdings" w:hAnsi="Wingdings" w:hint="default"/>
+        <w:sz w:val="20"/>
+      </w:rPr>
+    </w:lvl>
+    <w:lvl w:ilvl="4" w:tentative="1">
+      <w:start w:val="1"/>
+      <w:numFmt w:val="bullet"/>
+      <w:lvlText w:val=""/>
+      <w:lvlJc w:val="left"/>
+      <w:pPr>
+        <w:tabs>
+          <w:tab w:val="num" w:pos="3600"/>
+        </w:tabs>
+        <w:ind w:left="3600" w:hanging="360"/>
+      </w:pPr>
+      <w:rPr>
+        <w:rFonts w:ascii="Wingdings" w:hAnsi="Wingdings" w:hint="default"/>
+        <w:sz w:val="20"/>
+      </w:rPr>
+    </w:lvl>
+    <w:lvl w:ilvl="5" w:tentative="1">
+      <w:start w:val="1"/>
+      <w:numFmt w:val="bullet"/>
+      <w:lvlText w:val=""/>
+      <w:lvlJc w:val="left"/>
+      <w:pPr>
+        <w:tabs>
+          <w:tab w:val="num" w:pos="4320"/>
+        </w:tabs>
+        <w:ind w:left="4320" w:hanging="360"/>
+      </w:pPr>
+      <w:rPr>
+        <w:rFonts w:ascii="Wingdings" w:hAnsi="Wingdings" w:hint="default"/>
+        <w:sz w:val="20"/>
+      </w:rPr>
+    </w:lvl>
+    <w:lvl w:ilvl="6" w:tentative="1">
+      <w:start w:val="1"/>
+      <w:numFmt w:val="bullet"/>
+      <w:lvlText w:val=""/>
+      <w:lvlJc w:val="left"/>
+      <w:pPr>
+        <w:tabs>
+          <w:tab w:val="num" w:pos="5040"/>
+        </w:tabs>
+        <w:ind w:left="5040" w:hanging="360"/>
+      </w:pPr>
+      <w:rPr>
+        <w:rFonts w:ascii="Wingdings" w:hAnsi="Wingdings" w:hint="default"/>
+        <w:sz w:val="20"/>
+      </w:rPr>
+    </w:lvl>
+    <w:lvl w:ilvl="7" w:tentative="1">
+      <w:start w:val="1"/>
+      <w:numFmt w:val="bullet"/>
+      <w:lvlText w:val=""/>
+      <w:lvlJc w:val="left"/>
+      <w:pPr>
+        <w:tabs>
+          <w:tab w:val="num" w:pos="5760"/>
+        </w:tabs>
+        <w:ind w:left="5760" w:hanging="360"/>
+      </w:pPr>
+      <w:rPr>
+        <w:rFonts w:ascii="Wingdings" w:hAnsi="Wingdings" w:hint="default"/>
+        <w:sz w:val="20"/>
+      </w:rPr>
+    </w:lvl>
+    <w:lvl w:ilvl="8" w:tentative="1">
+      <w:start w:val="1"/>
+      <w:numFmt w:val="bullet"/>
+      <w:lvlText w:val=""/>
+      <w:lvlJc w:val="left"/>
+      <w:pPr>
+        <w:tabs>
+          <w:tab w:val="num" w:pos="6480"/>
+        </w:tabs>
+        <w:ind w:left="6480" w:hanging="360"/>
+      </w:pPr>
+      <w:rPr>
+        <w:rFonts w:ascii="Wingdings" w:hAnsi="Wingdings" w:hint="default"/>
+        <w:sz w:val="20"/>
+      </w:rPr>
+    </w:lvl>
+  </w:abstractNum>
+  <w:abstractNum w:abstractNumId="32" w15:restartNumberingAfterBreak="0">
     <w:nsid w:val="5E9A0932"/>
     <w:multiLevelType w:val="multilevel"/>
     <w:tmpl w:val="EC6465FC"/>
@@ -47082,7 +48290,7 @@
       </w:rPr>
     </w:lvl>
   </w:abstractNum>
-  <w:abstractNum w:abstractNumId="31" w15:restartNumberingAfterBreak="0">
+  <w:abstractNum w:abstractNumId="33" w15:restartNumberingAfterBreak="0">
     <w:nsid w:val="61E02C96"/>
     <w:multiLevelType w:val="multilevel"/>
     <w:tmpl w:val="7A2442DE"/>
@@ -47231,7 +48439,7 @@
       </w:rPr>
     </w:lvl>
   </w:abstractNum>
-  <w:abstractNum w:abstractNumId="32" w15:restartNumberingAfterBreak="0">
+  <w:abstractNum w:abstractNumId="34" w15:restartNumberingAfterBreak="0">
     <w:nsid w:val="61E54955"/>
     <w:multiLevelType w:val="multilevel"/>
     <w:tmpl w:val="20E2E3AA"/>
@@ -47380,7 +48588,7 @@
       </w:rPr>
     </w:lvl>
   </w:abstractNum>
-  <w:abstractNum w:abstractNumId="33" w15:restartNumberingAfterBreak="0">
+  <w:abstractNum w:abstractNumId="35" w15:restartNumberingAfterBreak="0">
     <w:nsid w:val="622855B4"/>
     <w:multiLevelType w:val="multilevel"/>
     <w:tmpl w:val="4EA0A6D4"/>
@@ -47493,7 +48701,7 @@
       </w:pPr>
     </w:lvl>
   </w:abstractNum>
-  <w:abstractNum w:abstractNumId="34" w15:restartNumberingAfterBreak="0">
+  <w:abstractNum w:abstractNumId="36" w15:restartNumberingAfterBreak="0">
     <w:nsid w:val="623F66A7"/>
     <w:multiLevelType w:val="multilevel"/>
     <w:tmpl w:val="C3226CDA"/>
@@ -47642,7 +48850,7 @@
       </w:rPr>
     </w:lvl>
   </w:abstractNum>
-  <w:abstractNum w:abstractNumId="35" w15:restartNumberingAfterBreak="0">
+  <w:abstractNum w:abstractNumId="37" w15:restartNumberingAfterBreak="0">
     <w:nsid w:val="62EA6A97"/>
     <w:multiLevelType w:val="multilevel"/>
     <w:tmpl w:val="07ACD11A"/>
@@ -47791,7 +48999,7 @@
       </w:rPr>
     </w:lvl>
   </w:abstractNum>
-  <w:abstractNum w:abstractNumId="36" w15:restartNumberingAfterBreak="0">
+  <w:abstractNum w:abstractNumId="38" w15:restartNumberingAfterBreak="0">
     <w:nsid w:val="638E1453"/>
     <w:multiLevelType w:val="multilevel"/>
     <w:tmpl w:val="BC605E92"/>
@@ -47940,7 +49148,7 @@
       </w:rPr>
     </w:lvl>
   </w:abstractNum>
-  <w:abstractNum w:abstractNumId="37" w15:restartNumberingAfterBreak="0">
+  <w:abstractNum w:abstractNumId="39" w15:restartNumberingAfterBreak="0">
     <w:nsid w:val="64027CC0"/>
     <w:multiLevelType w:val="multilevel"/>
     <w:tmpl w:val="2B36F9E6"/>
@@ -48085,7 +49293,7 @@
       </w:rPr>
     </w:lvl>
   </w:abstractNum>
-  <w:abstractNum w:abstractNumId="38" w15:restartNumberingAfterBreak="0">
+  <w:abstractNum w:abstractNumId="40" w15:restartNumberingAfterBreak="0">
     <w:nsid w:val="653448CF"/>
     <w:multiLevelType w:val="multilevel"/>
     <w:tmpl w:val="FC40D69A"/>
@@ -48234,7 +49442,7 @@
       </w:rPr>
     </w:lvl>
   </w:abstractNum>
-  <w:abstractNum w:abstractNumId="39" w15:restartNumberingAfterBreak="0">
+  <w:abstractNum w:abstractNumId="41" w15:restartNumberingAfterBreak="0">
     <w:nsid w:val="679B0233"/>
     <w:multiLevelType w:val="multilevel"/>
     <w:tmpl w:val="312020A4"/>
@@ -48383,7 +49591,7 @@
       </w:rPr>
     </w:lvl>
   </w:abstractNum>
-  <w:abstractNum w:abstractNumId="40" w15:restartNumberingAfterBreak="0">
+  <w:abstractNum w:abstractNumId="42" w15:restartNumberingAfterBreak="0">
     <w:nsid w:val="68B23748"/>
     <w:multiLevelType w:val="multilevel"/>
     <w:tmpl w:val="0F00F4EC"/>
@@ -48532,7 +49740,7 @@
       </w:rPr>
     </w:lvl>
   </w:abstractNum>
-  <w:abstractNum w:abstractNumId="41" w15:restartNumberingAfterBreak="0">
+  <w:abstractNum w:abstractNumId="43" w15:restartNumberingAfterBreak="0">
     <w:nsid w:val="6A18728E"/>
     <w:multiLevelType w:val="multilevel"/>
     <w:tmpl w:val="0D5E11C4"/>
@@ -48681,7 +49889,7 @@
       </w:rPr>
     </w:lvl>
   </w:abstractNum>
-  <w:abstractNum w:abstractNumId="42" w15:restartNumberingAfterBreak="0">
+  <w:abstractNum w:abstractNumId="44" w15:restartNumberingAfterBreak="0">
     <w:nsid w:val="6BC93EDD"/>
     <w:multiLevelType w:val="multilevel"/>
     <w:tmpl w:val="F0580D14"/>
@@ -48830,7 +50038,7 @@
       </w:rPr>
     </w:lvl>
   </w:abstractNum>
-  <w:abstractNum w:abstractNumId="43" w15:restartNumberingAfterBreak="0">
+  <w:abstractNum w:abstractNumId="45" w15:restartNumberingAfterBreak="0">
     <w:nsid w:val="77217981"/>
     <w:multiLevelType w:val="multilevel"/>
     <w:tmpl w:val="2012A6E4"/>
@@ -48943,7 +50151,7 @@
       </w:pPr>
     </w:lvl>
   </w:abstractNum>
-  <w:abstractNum w:abstractNumId="44" w15:restartNumberingAfterBreak="0">
+  <w:abstractNum w:abstractNumId="46" w15:restartNumberingAfterBreak="0">
     <w:nsid w:val="77321159"/>
     <w:multiLevelType w:val="multilevel"/>
     <w:tmpl w:val="8DE06702"/>
@@ -49092,7 +50300,7 @@
       </w:rPr>
     </w:lvl>
   </w:abstractNum>
-  <w:abstractNum w:abstractNumId="45" w15:restartNumberingAfterBreak="0">
+  <w:abstractNum w:abstractNumId="47" w15:restartNumberingAfterBreak="0">
     <w:nsid w:val="796A38C5"/>
     <w:multiLevelType w:val="hybridMultilevel"/>
     <w:tmpl w:val="1404469E"/>
@@ -49205,7 +50413,152 @@
       </w:rPr>
     </w:lvl>
   </w:abstractNum>
-  <w:abstractNum w:abstractNumId="46" w15:restartNumberingAfterBreak="0">
+  <w:abstractNum w:abstractNumId="48" w15:restartNumberingAfterBreak="0">
+    <w:nsid w:val="7BDB6516"/>
+    <w:multiLevelType w:val="multilevel"/>
+    <w:tmpl w:val="B186E2EA"/>
+    <w:lvl w:ilvl="0">
+      <w:start w:val="1"/>
+      <w:numFmt w:val="bullet"/>
+      <w:lvlText w:val=""/>
+      <w:lvlJc w:val="left"/>
+      <w:pPr>
+        <w:tabs>
+          <w:tab w:val="num" w:pos="720"/>
+        </w:tabs>
+        <w:ind w:left="720" w:hanging="360"/>
+      </w:pPr>
+      <w:rPr>
+        <w:rFonts w:ascii="Symbol" w:hAnsi="Symbol" w:hint="default"/>
+        <w:sz w:val="20"/>
+      </w:rPr>
+    </w:lvl>
+    <w:lvl w:ilvl="1">
+      <w:start w:val="1"/>
+      <w:numFmt w:val="decimal"/>
+      <w:lvlText w:val="%2."/>
+      <w:lvlJc w:val="left"/>
+      <w:pPr>
+        <w:tabs>
+          <w:tab w:val="num" w:pos="1440"/>
+        </w:tabs>
+        <w:ind w:left="1440" w:hanging="360"/>
+      </w:pPr>
+    </w:lvl>
+    <w:lvl w:ilvl="2" w:tentative="1">
+      <w:start w:val="1"/>
+      <w:numFmt w:val="bullet"/>
+      <w:lvlText w:val=""/>
+      <w:lvlJc w:val="left"/>
+      <w:pPr>
+        <w:tabs>
+          <w:tab w:val="num" w:pos="2160"/>
+        </w:tabs>
+        <w:ind w:left="2160" w:hanging="360"/>
+      </w:pPr>
+      <w:rPr>
+        <w:rFonts w:ascii="Wingdings" w:hAnsi="Wingdings" w:hint="default"/>
+        <w:sz w:val="20"/>
+      </w:rPr>
+    </w:lvl>
+    <w:lvl w:ilvl="3" w:tentative="1">
+      <w:start w:val="1"/>
+      <w:numFmt w:val="bullet"/>
+      <w:lvlText w:val=""/>
+      <w:lvlJc w:val="left"/>
+      <w:pPr>
+        <w:tabs>
+          <w:tab w:val="num" w:pos="2880"/>
+        </w:tabs>
+        <w:ind w:left="2880" w:hanging="360"/>
+      </w:pPr>
+      <w:rPr>
+        <w:rFonts w:ascii="Wingdings" w:hAnsi="Wingdings" w:hint="default"/>
+        <w:sz w:val="20"/>
+      </w:rPr>
+    </w:lvl>
+    <w:lvl w:ilvl="4" w:tentative="1">
+      <w:start w:val="1"/>
+      <w:numFmt w:val="bullet"/>
+      <w:lvlText w:val=""/>
+      <w:lvlJc w:val="left"/>
+      <w:pPr>
+        <w:tabs>
+          <w:tab w:val="num" w:pos="3600"/>
+        </w:tabs>
+        <w:ind w:left="3600" w:hanging="360"/>
+      </w:pPr>
+      <w:rPr>
+        <w:rFonts w:ascii="Wingdings" w:hAnsi="Wingdings" w:hint="default"/>
+        <w:sz w:val="20"/>
+      </w:rPr>
+    </w:lvl>
+    <w:lvl w:ilvl="5" w:tentative="1">
+      <w:start w:val="1"/>
+      <w:numFmt w:val="bullet"/>
+      <w:lvlText w:val=""/>
+      <w:lvlJc w:val="left"/>
+      <w:pPr>
+        <w:tabs>
+          <w:tab w:val="num" w:pos="4320"/>
+        </w:tabs>
+        <w:ind w:left="4320" w:hanging="360"/>
+      </w:pPr>
+      <w:rPr>
+        <w:rFonts w:ascii="Wingdings" w:hAnsi="Wingdings" w:hint="default"/>
+        <w:sz w:val="20"/>
+      </w:rPr>
+    </w:lvl>
+    <w:lvl w:ilvl="6" w:tentative="1">
+      <w:start w:val="1"/>
+      <w:numFmt w:val="bullet"/>
+      <w:lvlText w:val=""/>
+      <w:lvlJc w:val="left"/>
+      <w:pPr>
+        <w:tabs>
+          <w:tab w:val="num" w:pos="5040"/>
+        </w:tabs>
+        <w:ind w:left="5040" w:hanging="360"/>
+      </w:pPr>
+      <w:rPr>
+        <w:rFonts w:ascii="Wingdings" w:hAnsi="Wingdings" w:hint="default"/>
+        <w:sz w:val="20"/>
+      </w:rPr>
+    </w:lvl>
+    <w:lvl w:ilvl="7" w:tentative="1">
+      <w:start w:val="1"/>
+      <w:numFmt w:val="bullet"/>
+      <w:lvlText w:val=""/>
+      <w:lvlJc w:val="left"/>
+      <w:pPr>
+        <w:tabs>
+          <w:tab w:val="num" w:pos="5760"/>
+        </w:tabs>
+        <w:ind w:left="5760" w:hanging="360"/>
+      </w:pPr>
+      <w:rPr>
+        <w:rFonts w:ascii="Wingdings" w:hAnsi="Wingdings" w:hint="default"/>
+        <w:sz w:val="20"/>
+      </w:rPr>
+    </w:lvl>
+    <w:lvl w:ilvl="8" w:tentative="1">
+      <w:start w:val="1"/>
+      <w:numFmt w:val="bullet"/>
+      <w:lvlText w:val=""/>
+      <w:lvlJc w:val="left"/>
+      <w:pPr>
+        <w:tabs>
+          <w:tab w:val="num" w:pos="6480"/>
+        </w:tabs>
+        <w:ind w:left="6480" w:hanging="360"/>
+      </w:pPr>
+      <w:rPr>
+        <w:rFonts w:ascii="Wingdings" w:hAnsi="Wingdings" w:hint="default"/>
+        <w:sz w:val="20"/>
+      </w:rPr>
+    </w:lvl>
+  </w:abstractNum>
+  <w:abstractNum w:abstractNumId="49" w15:restartNumberingAfterBreak="0">
     <w:nsid w:val="7CA942BD"/>
     <w:multiLevelType w:val="multilevel"/>
     <w:tmpl w:val="0B16B2FA"/>
@@ -49354,7 +50707,7 @@
       </w:rPr>
     </w:lvl>
   </w:abstractNum>
-  <w:abstractNum w:abstractNumId="47" w15:restartNumberingAfterBreak="0">
+  <w:abstractNum w:abstractNumId="50" w15:restartNumberingAfterBreak="0">
     <w:nsid w:val="7D921E58"/>
     <w:multiLevelType w:val="multilevel"/>
     <w:tmpl w:val="93EA13F8"/>
@@ -49503,7 +50856,7 @@
       </w:rPr>
     </w:lvl>
   </w:abstractNum>
-  <w:abstractNum w:abstractNumId="48" w15:restartNumberingAfterBreak="0">
+  <w:abstractNum w:abstractNumId="51" w15:restartNumberingAfterBreak="0">
     <w:nsid w:val="7F0A6A47"/>
     <w:multiLevelType w:val="multilevel"/>
     <w:tmpl w:val="EEAA81D8"/>
@@ -49652,7 +51005,7 @@
       </w:rPr>
     </w:lvl>
   </w:abstractNum>
-  <w:abstractNum w:abstractNumId="49" w15:restartNumberingAfterBreak="0">
+  <w:abstractNum w:abstractNumId="52" w15:restartNumberingAfterBreak="0">
     <w:nsid w:val="7F55327D"/>
     <w:multiLevelType w:val="multilevel"/>
     <w:tmpl w:val="3CE0C7E0"/>
@@ -49802,22 +51155,22 @@
     </w:lvl>
   </w:abstractNum>
   <w:num w:numId="1" w16cid:durableId="184102653">
-    <w:abstractNumId w:val="44"/>
+    <w:abstractNumId w:val="46"/>
   </w:num>
   <w:num w:numId="2" w16cid:durableId="1003583758">
-    <w:abstractNumId w:val="24"/>
+    <w:abstractNumId w:val="25"/>
   </w:num>
   <w:num w:numId="3" w16cid:durableId="1651444461">
-    <w:abstractNumId w:val="31"/>
+    <w:abstractNumId w:val="33"/>
   </w:num>
   <w:num w:numId="4" w16cid:durableId="136608272">
-    <w:abstractNumId w:val="19"/>
+    <w:abstractNumId w:val="20"/>
   </w:num>
   <w:num w:numId="5" w16cid:durableId="1090353503">
     <w:abstractNumId w:val="8"/>
   </w:num>
   <w:num w:numId="6" w16cid:durableId="1683043692">
-    <w:abstractNumId w:val="48"/>
+    <w:abstractNumId w:val="51"/>
   </w:num>
   <w:num w:numId="7" w16cid:durableId="1824854707">
     <w:abstractNumId w:val="12"/>
@@ -49829,16 +51182,16 @@
     <w:abstractNumId w:val="13"/>
   </w:num>
   <w:num w:numId="10" w16cid:durableId="1191454127">
-    <w:abstractNumId w:val="32"/>
+    <w:abstractNumId w:val="34"/>
   </w:num>
   <w:num w:numId="11" w16cid:durableId="32510889">
-    <w:abstractNumId w:val="30"/>
+    <w:abstractNumId w:val="32"/>
   </w:num>
   <w:num w:numId="12" w16cid:durableId="359167799">
     <w:abstractNumId w:val="0"/>
   </w:num>
   <w:num w:numId="13" w16cid:durableId="1755591443">
-    <w:abstractNumId w:val="25"/>
+    <w:abstractNumId w:val="26"/>
   </w:num>
   <w:num w:numId="14" w16cid:durableId="44530987">
     <w:abstractNumId w:val="9"/>
@@ -49850,97 +51203,97 @@
     <w:abstractNumId w:val="5"/>
   </w:num>
   <w:num w:numId="17" w16cid:durableId="1650018006">
-    <w:abstractNumId w:val="27"/>
+    <w:abstractNumId w:val="28"/>
   </w:num>
   <w:num w:numId="18" w16cid:durableId="158424202">
-    <w:abstractNumId w:val="17"/>
+    <w:abstractNumId w:val="18"/>
   </w:num>
   <w:num w:numId="19" w16cid:durableId="1158572409">
-    <w:abstractNumId w:val="33"/>
+    <w:abstractNumId w:val="35"/>
   </w:num>
   <w:num w:numId="20" w16cid:durableId="370038589">
-    <w:abstractNumId w:val="45"/>
+    <w:abstractNumId w:val="47"/>
   </w:num>
   <w:num w:numId="21" w16cid:durableId="1172986391">
     <w:abstractNumId w:val="2"/>
   </w:num>
   <w:num w:numId="22" w16cid:durableId="1735857931">
-    <w:abstractNumId w:val="46"/>
+    <w:abstractNumId w:val="49"/>
   </w:num>
   <w:num w:numId="23" w16cid:durableId="986668761">
-    <w:abstractNumId w:val="23"/>
+    <w:abstractNumId w:val="24"/>
   </w:num>
   <w:num w:numId="24" w16cid:durableId="1300762213">
-    <w:abstractNumId w:val="37"/>
+    <w:abstractNumId w:val="39"/>
   </w:num>
   <w:num w:numId="25" w16cid:durableId="2004772222">
-    <w:abstractNumId w:val="28"/>
+    <w:abstractNumId w:val="29"/>
   </w:num>
   <w:num w:numId="26" w16cid:durableId="599291654">
-    <w:abstractNumId w:val="29"/>
+    <w:abstractNumId w:val="30"/>
   </w:num>
   <w:num w:numId="27" w16cid:durableId="706416369">
-    <w:abstractNumId w:val="38"/>
+    <w:abstractNumId w:val="40"/>
   </w:num>
   <w:num w:numId="28" w16cid:durableId="1430656554">
-    <w:abstractNumId w:val="40"/>
+    <w:abstractNumId w:val="42"/>
   </w:num>
   <w:num w:numId="29" w16cid:durableId="1123226736">
-    <w:abstractNumId w:val="47"/>
+    <w:abstractNumId w:val="50"/>
   </w:num>
   <w:num w:numId="30" w16cid:durableId="499472526">
-    <w:abstractNumId w:val="21"/>
+    <w:abstractNumId w:val="22"/>
   </w:num>
   <w:num w:numId="31" w16cid:durableId="1115904584">
     <w:abstractNumId w:val="1"/>
   </w:num>
   <w:num w:numId="32" w16cid:durableId="740371177">
-    <w:abstractNumId w:val="22"/>
+    <w:abstractNumId w:val="23"/>
   </w:num>
   <w:num w:numId="33" w16cid:durableId="1978146567">
-    <w:abstractNumId w:val="41"/>
+    <w:abstractNumId w:val="43"/>
   </w:num>
   <w:num w:numId="34" w16cid:durableId="1205606027">
-    <w:abstractNumId w:val="26"/>
+    <w:abstractNumId w:val="27"/>
   </w:num>
   <w:num w:numId="35" w16cid:durableId="731587083">
-    <w:abstractNumId w:val="49"/>
+    <w:abstractNumId w:val="52"/>
   </w:num>
   <w:num w:numId="36" w16cid:durableId="1971402414">
-    <w:abstractNumId w:val="16"/>
+    <w:abstractNumId w:val="17"/>
   </w:num>
   <w:num w:numId="37" w16cid:durableId="780152051">
-    <w:abstractNumId w:val="34"/>
+    <w:abstractNumId w:val="36"/>
   </w:num>
   <w:num w:numId="38" w16cid:durableId="161968327">
     <w:abstractNumId w:val="11"/>
   </w:num>
   <w:num w:numId="39" w16cid:durableId="1079718605">
-    <w:abstractNumId w:val="39"/>
+    <w:abstractNumId w:val="41"/>
   </w:num>
   <w:num w:numId="40" w16cid:durableId="568618614">
     <w:abstractNumId w:val="4"/>
   </w:num>
   <w:num w:numId="41" w16cid:durableId="1240284075">
-    <w:abstractNumId w:val="35"/>
+    <w:abstractNumId w:val="37"/>
   </w:num>
   <w:num w:numId="42" w16cid:durableId="790367031">
-    <w:abstractNumId w:val="20"/>
+    <w:abstractNumId w:val="21"/>
   </w:num>
   <w:num w:numId="43" w16cid:durableId="1932355">
-    <w:abstractNumId w:val="15"/>
+    <w:abstractNumId w:val="16"/>
   </w:num>
   <w:num w:numId="44" w16cid:durableId="73090763">
-    <w:abstractNumId w:val="43"/>
+    <w:abstractNumId w:val="45"/>
   </w:num>
   <w:num w:numId="45" w16cid:durableId="305016245">
-    <w:abstractNumId w:val="42"/>
+    <w:abstractNumId w:val="44"/>
   </w:num>
   <w:num w:numId="46" w16cid:durableId="183830930">
-    <w:abstractNumId w:val="18"/>
+    <w:abstractNumId w:val="19"/>
   </w:num>
   <w:num w:numId="47" w16cid:durableId="888999399">
-    <w:abstractNumId w:val="36"/>
+    <w:abstractNumId w:val="38"/>
   </w:num>
   <w:num w:numId="48" w16cid:durableId="1622033446">
     <w:abstractNumId w:val="6"/>
@@ -49950,6 +51303,15 @@
   </w:num>
   <w:num w:numId="50" w16cid:durableId="1858151243">
     <w:abstractNumId w:val="3"/>
+  </w:num>
+  <w:num w:numId="51" w16cid:durableId="1580753766">
+    <w:abstractNumId w:val="15"/>
+  </w:num>
+  <w:num w:numId="52" w16cid:durableId="1704095363">
+    <w:abstractNumId w:val="48"/>
+  </w:num>
+  <w:num w:numId="53" w16cid:durableId="1463226681">
+    <w:abstractNumId w:val="31"/>
   </w:num>
 </w:numbering>
 </file>

</xml_diff>